<commit_message>
report: polish English layout and figures
</commit_message>
<xml_diff>
--- a/report/experiment3_personal_report_yangmuqing_en.docx
+++ b/report/experiment3_personal_report_yangmuqing_en.docx
@@ -40,9 +40,11 @@
               <w:bottom w:val="nil"/>
               <w:right w:val="nil"/>
             </w:tcBorders>
+            <w:vAlign w:val="center"/>
           </w:tcPr>
           <w:p>
             <w:pPr>
+              <w:spacing w:line="240" w:lineRule="auto"/>
               <w:jc w:val="left"/>
             </w:pPr>
             <w:r>
@@ -50,7 +52,7 @@
                 <w:rFonts w:ascii="Times New Roman" w:hAnsi="Times New Roman" w:eastAsia="Times New Roman"/>
                 <w:b/>
                 <w:color w:val="163A5F"/>
-                <w:sz w:val="18"/>
+                <w:sz w:val="19"/>
               </w:rPr>
               <w:t>ROBOTICS INTEGRATION GROUP PROJECT</w:t>
             </w:r>
@@ -71,9 +73,11 @@
               <w:bottom w:val="nil"/>
               <w:right w:val="nil"/>
             </w:tcBorders>
+            <w:vAlign w:val="center"/>
           </w:tcPr>
           <w:p>
             <w:pPr>
+              <w:spacing w:line="240" w:lineRule="auto"/>
               <w:jc w:val="right"/>
             </w:pPr>
             <w:r>
@@ -81,7 +85,7 @@
                 <w:rFonts w:ascii="Times New Roman" w:hAnsi="Times New Roman" w:eastAsia="Times New Roman"/>
                 <w:b/>
                 <w:color w:val="163A5F"/>
-                <w:sz w:val="18"/>
+                <w:sz w:val="19"/>
               </w:rPr>
               <w:t>GROUP 17</w:t>
             </w:r>
@@ -112,10 +116,10 @@
       </w:pPr>
       <w:r>
         <w:rPr>
-          <w:rFonts w:ascii="Microsoft YaHei" w:hAnsi="Microsoft YaHei" w:eastAsia="Microsoft YaHei"/>
+          <w:rFonts w:ascii="Times New Roman" w:hAnsi="Times New Roman" w:eastAsia="Times New Roman"/>
           <w:b/>
           <w:color w:val="163A5F"/>
-          <w:sz w:val="50"/>
+          <w:sz w:val="48"/>
         </w:rPr>
         <w:t>Tabletop Object Automatic Sorting and Organization</w:t>
       </w:r>
@@ -127,7 +131,7 @@
       </w:pPr>
       <w:r>
         <w:rPr>
-          <w:rFonts w:ascii="Microsoft YaHei" w:hAnsi="Microsoft YaHei" w:eastAsia="Microsoft YaHei"/>
+          <w:rFonts w:ascii="Times New Roman" w:hAnsi="Times New Roman" w:eastAsia="Times New Roman"/>
           <w:b w:val="0"/>
           <w:color w:val="2D5F8B"/>
           <w:sz w:val="24"/>
@@ -207,7 +211,7 @@
         </w:trPr>
         <w:tc>
           <w:tcPr>
-            <w:tcW w:type="dxa" w:w="1701"/>
+            <w:tcW w:type="dxa" w:w="1728"/>
             <w:tcMar>
               <w:top w:w="90" w:type="dxa"/>
               <w:start w:w="150" w:type="dxa"/>
@@ -225,11 +229,12 @@
           </w:tcPr>
           <w:p>
             <w:pPr>
+              <w:spacing w:line="240" w:lineRule="auto"/>
               <w:jc w:val="left"/>
             </w:pPr>
             <w:r>
               <w:rPr>
-                <w:rFonts w:ascii="Microsoft YaHei" w:hAnsi="Microsoft YaHei" w:eastAsia="Microsoft YaHei"/>
+                <w:rFonts w:ascii="Times New Roman" w:hAnsi="Times New Roman" w:eastAsia="Times New Roman"/>
                 <w:b/>
                 <w:color w:val="163A5F"/>
                 <w:sz w:val="19"/>
@@ -240,7 +245,7 @@
         </w:tc>
         <w:tc>
           <w:tcPr>
-            <w:tcW w:type="dxa" w:w="6350"/>
+            <w:tcW w:type="dxa" w:w="6552"/>
             <w:tcMar>
               <w:top w:w="90" w:type="dxa"/>
               <w:start w:w="150" w:type="dxa"/>
@@ -257,12 +262,13 @@
           </w:tcPr>
           <w:p>
             <w:pPr>
+              <w:spacing w:line="240" w:lineRule="auto"/>
               <w:jc w:val="left"/>
             </w:pPr>
             <w:r>
               <w:rPr>
-                <w:rFonts w:ascii="Microsoft YaHei" w:hAnsi="Microsoft YaHei" w:eastAsia="Microsoft YaHei"/>
-                <w:b w:val="0"/>
+                <w:rFonts w:ascii="Times New Roman" w:hAnsi="Times New Roman" w:eastAsia="Times New Roman"/>
+                <w:b/>
                 <w:color w:val="202124"/>
                 <w:sz w:val="19"/>
               </w:rPr>
@@ -274,7 +280,7 @@
       <w:tr>
         <w:tc>
           <w:tcPr>
-            <w:tcW w:type="dxa" w:w="1701"/>
+            <w:tcW w:type="dxa" w:w="1728"/>
             <w:tcMar>
               <w:top w:w="90" w:type="dxa"/>
               <w:start w:w="150" w:type="dxa"/>
@@ -292,11 +298,12 @@
           </w:tcPr>
           <w:p>
             <w:pPr>
+              <w:spacing w:line="240" w:lineRule="auto"/>
               <w:jc w:val="left"/>
             </w:pPr>
             <w:r>
               <w:rPr>
-                <w:rFonts w:ascii="Microsoft YaHei" w:hAnsi="Microsoft YaHei" w:eastAsia="Microsoft YaHei"/>
+                <w:rFonts w:ascii="Times New Roman" w:hAnsi="Times New Roman" w:eastAsia="Times New Roman"/>
                 <w:b/>
                 <w:color w:val="163A5F"/>
                 <w:sz w:val="19"/>
@@ -307,7 +314,7 @@
         </w:tc>
         <w:tc>
           <w:tcPr>
-            <w:tcW w:type="dxa" w:w="6350"/>
+            <w:tcW w:type="dxa" w:w="6552"/>
             <w:tcMar>
               <w:top w:w="90" w:type="dxa"/>
               <w:start w:w="150" w:type="dxa"/>
@@ -324,11 +331,12 @@
           </w:tcPr>
           <w:p>
             <w:pPr>
+              <w:spacing w:line="240" w:lineRule="auto"/>
               <w:jc w:val="left"/>
             </w:pPr>
             <w:r>
               <w:rPr>
-                <w:rFonts w:ascii="Microsoft YaHei" w:hAnsi="Microsoft YaHei" w:eastAsia="Microsoft YaHei"/>
+                <w:rFonts w:ascii="Times New Roman" w:hAnsi="Times New Roman" w:eastAsia="Times New Roman"/>
                 <w:b w:val="0"/>
                 <w:color w:val="202124"/>
                 <w:sz w:val="19"/>
@@ -341,7 +349,7 @@
       <w:tr>
         <w:tc>
           <w:tcPr>
-            <w:tcW w:type="dxa" w:w="1701"/>
+            <w:tcW w:type="dxa" w:w="1728"/>
             <w:tcMar>
               <w:top w:w="90" w:type="dxa"/>
               <w:start w:w="150" w:type="dxa"/>
@@ -359,11 +367,12 @@
           </w:tcPr>
           <w:p>
             <w:pPr>
+              <w:spacing w:line="240" w:lineRule="auto"/>
               <w:jc w:val="left"/>
             </w:pPr>
             <w:r>
               <w:rPr>
-                <w:rFonts w:ascii="Microsoft YaHei" w:hAnsi="Microsoft YaHei" w:eastAsia="Microsoft YaHei"/>
+                <w:rFonts w:ascii="Times New Roman" w:hAnsi="Times New Roman" w:eastAsia="Times New Roman"/>
                 <w:b/>
                 <w:color w:val="163A5F"/>
                 <w:sz w:val="19"/>
@@ -374,7 +383,7 @@
         </w:tc>
         <w:tc>
           <w:tcPr>
-            <w:tcW w:type="dxa" w:w="6350"/>
+            <w:tcW w:type="dxa" w:w="6552"/>
             <w:tcMar>
               <w:top w:w="90" w:type="dxa"/>
               <w:start w:w="150" w:type="dxa"/>
@@ -391,11 +400,12 @@
           </w:tcPr>
           <w:p>
             <w:pPr>
+              <w:spacing w:line="240" w:lineRule="auto"/>
               <w:jc w:val="left"/>
             </w:pPr>
             <w:r>
               <w:rPr>
-                <w:rFonts w:ascii="Microsoft YaHei" w:hAnsi="Microsoft YaHei" w:eastAsia="Microsoft YaHei"/>
+                <w:rFonts w:ascii="Times New Roman" w:hAnsi="Times New Roman" w:eastAsia="Times New Roman"/>
                 <w:b w:val="0"/>
                 <w:color w:val="202124"/>
                 <w:sz w:val="19"/>
@@ -437,6 +447,20 @@
       </w:r>
     </w:p>
     <w:p>
+      <w:pPr>
+        <w:spacing w:before="100" w:after="0"/>
+        <w:jc w:val="center"/>
+      </w:pPr>
+      <w:r>
+        <w:rPr>
+          <w:rFonts w:ascii="Times New Roman" w:hAnsi="Times New Roman" w:eastAsia="Times New Roman"/>
+          <w:color w:val="173E68"/>
+          <w:sz w:val="19"/>
+        </w:rPr>
+        <w:t>GitHub: https://github.com/9161942-boop/robotics-experiment-3</w:t>
+      </w:r>
+    </w:p>
+    <w:p>
       <w:r>
         <w:br w:type="page"/>
       </w:r>
@@ -446,21 +470,23 @@
         <w:pStyle w:val="Heading1"/>
       </w:pPr>
       <w:r>
+        <w:rPr>
+          <w:rFonts w:ascii="Times New Roman" w:hAnsi="Times New Roman" w:eastAsia="Times New Roman"/>
+        </w:rPr>
         <w:t>1 Basic Experimental Requirements</w:t>
       </w:r>
     </w:p>
     <w:p>
       <w:pPr>
-        <w:pStyle w:val="Heading2"/>
+        <w:spacing w:before="120" w:after="80"/>
+        <w:jc w:val="center"/>
       </w:pPr>
-      <w:r>
-        <w:t>1.1 Task Objective and Evaluation Focus</w:t>
-      </w:r>
+      <w:r/>
     </w:p>
     <w:p>
       <w:r>
         <w:rPr>
-          <w:rFonts w:ascii="Microsoft YaHei" w:hAnsi="Microsoft YaHei" w:eastAsia="Microsoft YaHei"/>
+          <w:rFonts w:ascii="Times New Roman" w:hAnsi="Times New Roman" w:eastAsia="Times New Roman"/>
           <w:b w:val="0"/>
           <w:color w:val="202124"/>
           <w:sz w:val="21"/>
@@ -471,7 +497,7 @@
     <w:p>
       <w:r>
         <w:rPr>
-          <w:rFonts w:ascii="Microsoft YaHei" w:hAnsi="Microsoft YaHei" w:eastAsia="Microsoft YaHei"/>
+          <w:rFonts w:ascii="Times New Roman" w:hAnsi="Times New Roman" w:eastAsia="Times New Roman"/>
           <w:b w:val="0"/>
           <w:color w:val="202124"/>
           <w:sz w:val="21"/>
@@ -484,13 +510,16 @@
         <w:pStyle w:val="Heading2"/>
       </w:pPr>
       <w:r>
+        <w:rPr>
+          <w:rFonts w:ascii="Times New Roman" w:hAnsi="Times New Roman" w:eastAsia="Times New Roman"/>
+        </w:rPr>
         <w:t>1.2 Experimental Environment and Parameters</w:t>
       </w:r>
     </w:p>
     <w:p>
       <w:r>
         <w:rPr>
-          <w:rFonts w:ascii="Microsoft YaHei" w:hAnsi="Microsoft YaHei" w:eastAsia="Microsoft YaHei"/>
+          <w:rFonts w:ascii="Times New Roman" w:hAnsi="Times New Roman" w:eastAsia="Times New Roman"/>
           <w:b w:val="0"/>
           <w:color w:val="202124"/>
           <w:sz w:val="21"/>
@@ -516,7 +545,7 @@
         </w:trPr>
         <w:tc>
           <w:tcPr>
-            <w:tcW w:type="dxa" w:w="2268"/>
+            <w:tcW w:type="dxa" w:w="1944"/>
             <w:shd w:fill="163A5F"/>
             <w:tcMar>
               <w:top w:w="70" w:type="dxa"/>
@@ -530,17 +559,19 @@
               <w:bottom w:val="single" w:sz="6" w:color="163A5F"/>
               <w:right w:val="single" w:sz="4" w:color="C9D4DF"/>
             </w:tcBorders>
+            <w:vAlign w:val="center"/>
           </w:tcPr>
           <w:p>
             <w:pPr>
+              <w:spacing w:line="240" w:lineRule="auto"/>
               <w:jc w:val="center"/>
             </w:pPr>
             <w:r>
               <w:rPr>
-                <w:rFonts w:ascii="Microsoft YaHei" w:hAnsi="Microsoft YaHei" w:eastAsia="Microsoft YaHei"/>
+                <w:rFonts w:ascii="Times New Roman" w:hAnsi="Times New Roman" w:eastAsia="Times New Roman"/>
                 <w:b/>
                 <w:color w:val="FFFFFF"/>
-                <w:sz w:val="18"/>
+                <w:sz w:val="19"/>
               </w:rPr>
               <w:t>Item</w:t>
             </w:r>
@@ -548,7 +579,7 @@
         </w:tc>
         <w:tc>
           <w:tcPr>
-            <w:tcW w:type="dxa" w:w="6803"/>
+            <w:tcW w:type="dxa" w:w="6336"/>
             <w:shd w:fill="163A5F"/>
             <w:tcMar>
               <w:top w:w="70" w:type="dxa"/>
@@ -562,17 +593,19 @@
               <w:bottom w:val="single" w:sz="6" w:color="163A5F"/>
               <w:right w:val="single" w:sz="4" w:color="C9D4DF"/>
             </w:tcBorders>
+            <w:vAlign w:val="center"/>
           </w:tcPr>
           <w:p>
             <w:pPr>
+              <w:spacing w:line="240" w:lineRule="auto"/>
               <w:jc w:val="center"/>
             </w:pPr>
             <w:r>
               <w:rPr>
-                <w:rFonts w:ascii="Microsoft YaHei" w:hAnsi="Microsoft YaHei" w:eastAsia="Microsoft YaHei"/>
+                <w:rFonts w:ascii="Times New Roman" w:hAnsi="Times New Roman" w:eastAsia="Times New Roman"/>
                 <w:b/>
                 <w:color w:val="FFFFFF"/>
-                <w:sz w:val="18"/>
+                <w:sz w:val="19"/>
               </w:rPr>
               <w:t>Final adopted setting</w:t>
             </w:r>
@@ -585,7 +618,7 @@
         </w:trPr>
         <w:tc>
           <w:tcPr>
-            <w:tcW w:type="dxa" w:w="4734"/>
+            <w:tcW w:type="dxa" w:w="1944"/>
             <w:tcMar>
               <w:top w:w="65" w:type="dxa"/>
               <w:start w:w="80" w:type="dxa"/>
@@ -599,17 +632,19 @@
               <w:right w:val="single" w:sz="4" w:color="B8C2CC"/>
             </w:tcBorders>
             <w:shd w:fill="F7FAFC"/>
+            <w:vAlign w:val="center"/>
           </w:tcPr>
           <w:p>
             <w:pPr>
+              <w:spacing w:line="240" w:lineRule="auto"/>
               <w:jc w:val="left"/>
             </w:pPr>
             <w:r>
               <w:rPr>
-                <w:rFonts w:ascii="Microsoft YaHei" w:hAnsi="Microsoft YaHei" w:eastAsia="Microsoft YaHei"/>
+                <w:rFonts w:ascii="Times New Roman" w:hAnsi="Times New Roman" w:eastAsia="Times New Roman"/>
                 <w:b w:val="0"/>
                 <w:color w:val="202124"/>
-                <w:sz w:val="18"/>
+                <w:sz w:val="19"/>
               </w:rPr>
               <w:t>Scene</w:t>
             </w:r>
@@ -617,7 +652,7 @@
         </w:tc>
         <w:tc>
           <w:tcPr>
-            <w:tcW w:type="dxa" w:w="4734"/>
+            <w:tcW w:type="dxa" w:w="6336"/>
             <w:tcMar>
               <w:top w:w="65" w:type="dxa"/>
               <w:start w:w="80" w:type="dxa"/>
@@ -631,17 +666,19 @@
               <w:right w:val="single" w:sz="4" w:color="B8C2CC"/>
             </w:tcBorders>
             <w:shd w:fill="F7FAFC"/>
+            <w:vAlign w:val="center"/>
           </w:tcPr>
           <w:p>
             <w:pPr>
+              <w:spacing w:line="240" w:lineRule="auto"/>
               <w:jc w:val="left"/>
             </w:pPr>
             <w:r>
               <w:rPr>
-                <w:rFonts w:ascii="Microsoft YaHei" w:hAnsi="Microsoft YaHei" w:eastAsia="Microsoft YaHei"/>
+                <w:rFonts w:ascii="Times New Roman" w:hAnsi="Times New Roman" w:eastAsia="Times New Roman"/>
                 <w:b w:val="0"/>
                 <w:color w:val="202124"/>
-                <w:sz w:val="18"/>
+                <w:sz w:val="19"/>
               </w:rPr>
               <w:t>0.72 m x 0.52 m tabletop; 3-row by 2-column six-cell pickup area; red, blue, and green cylinders</w:t>
             </w:r>
@@ -654,7 +691,7 @@
         </w:trPr>
         <w:tc>
           <w:tcPr>
-            <w:tcW w:type="dxa" w:w="4734"/>
+            <w:tcW w:type="dxa" w:w="1944"/>
             <w:tcMar>
               <w:top w:w="65" w:type="dxa"/>
               <w:start w:w="80" w:type="dxa"/>
@@ -667,17 +704,19 @@
               <w:bottom w:val="single" w:sz="4" w:color="B8C2CC"/>
               <w:right w:val="single" w:sz="4" w:color="B8C2CC"/>
             </w:tcBorders>
+            <w:vAlign w:val="center"/>
           </w:tcPr>
           <w:p>
             <w:pPr>
+              <w:spacing w:line="240" w:lineRule="auto"/>
               <w:jc w:val="left"/>
             </w:pPr>
             <w:r>
               <w:rPr>
-                <w:rFonts w:ascii="Microsoft YaHei" w:hAnsi="Microsoft YaHei" w:eastAsia="Microsoft YaHei"/>
+                <w:rFonts w:ascii="Times New Roman" w:hAnsi="Times New Roman" w:eastAsia="Times New Roman"/>
                 <w:b w:val="0"/>
                 <w:color w:val="202124"/>
-                <w:sz w:val="18"/>
+                <w:sz w:val="19"/>
               </w:rPr>
               <w:t>Sorting pads</w:t>
             </w:r>
@@ -685,7 +724,7 @@
         </w:tc>
         <w:tc>
           <w:tcPr>
-            <w:tcW w:type="dxa" w:w="4734"/>
+            <w:tcW w:type="dxa" w:w="6336"/>
             <w:tcMar>
               <w:top w:w="65" w:type="dxa"/>
               <w:start w:w="80" w:type="dxa"/>
@@ -698,17 +737,19 @@
               <w:bottom w:val="single" w:sz="4" w:color="B8C2CC"/>
               <w:right w:val="single" w:sz="4" w:color="B8C2CC"/>
             </w:tcBorders>
+            <w:vAlign w:val="center"/>
           </w:tcPr>
           <w:p>
             <w:pPr>
+              <w:spacing w:line="240" w:lineRule="auto"/>
               <w:jc w:val="left"/>
             </w:pPr>
             <w:r>
               <w:rPr>
-                <w:rFonts w:ascii="Microsoft YaHei" w:hAnsi="Microsoft YaHei" w:eastAsia="Microsoft YaHei"/>
+                <w:rFonts w:ascii="Times New Roman" w:hAnsi="Times New Roman" w:eastAsia="Times New Roman"/>
                 <w:b w:val="0"/>
                 <w:color w:val="202124"/>
-                <w:sz w:val="18"/>
+                <w:sz w:val="19"/>
               </w:rPr>
               <w:t>Red (0.14, -0.12), blue (0.26, -0.12), and green (0.38, -0.12) m, arranged horizontally</w:t>
             </w:r>
@@ -721,7 +762,7 @@
         </w:trPr>
         <w:tc>
           <w:tcPr>
-            <w:tcW w:type="dxa" w:w="4734"/>
+            <w:tcW w:type="dxa" w:w="1944"/>
             <w:tcMar>
               <w:top w:w="65" w:type="dxa"/>
               <w:start w:w="80" w:type="dxa"/>
@@ -735,17 +776,19 @@
               <w:right w:val="single" w:sz="4" w:color="B8C2CC"/>
             </w:tcBorders>
             <w:shd w:fill="F7FAFC"/>
+            <w:vAlign w:val="center"/>
           </w:tcPr>
           <w:p>
             <w:pPr>
+              <w:spacing w:line="240" w:lineRule="auto"/>
               <w:jc w:val="left"/>
             </w:pPr>
             <w:r>
               <w:rPr>
-                <w:rFonts w:ascii="Microsoft YaHei" w:hAnsi="Microsoft YaHei" w:eastAsia="Microsoft YaHei"/>
+                <w:rFonts w:ascii="Times New Roman" w:hAnsi="Times New Roman" w:eastAsia="Times New Roman"/>
                 <w:b w:val="0"/>
                 <w:color w:val="202124"/>
-                <w:sz w:val="18"/>
+                <w:sz w:val="19"/>
               </w:rPr>
               <w:t>Recognition rule</w:t>
             </w:r>
@@ -753,7 +796,7 @@
         </w:tc>
         <w:tc>
           <w:tcPr>
-            <w:tcW w:type="dxa" w:w="4734"/>
+            <w:tcW w:type="dxa" w:w="6336"/>
             <w:tcMar>
               <w:top w:w="65" w:type="dxa"/>
               <w:start w:w="80" w:type="dxa"/>
@@ -767,17 +810,19 @@
               <w:right w:val="single" w:sz="4" w:color="B8C2CC"/>
             </w:tcBorders>
             <w:shd w:fill="F7FAFC"/>
+            <w:vAlign w:val="center"/>
           </w:tcPr>
           <w:p>
             <w:pPr>
+              <w:spacing w:line="240" w:lineRule="auto"/>
               <w:jc w:val="left"/>
             </w:pPr>
             <w:r>
               <w:rPr>
-                <w:rFonts w:ascii="Microsoft YaHei" w:hAnsi="Microsoft YaHei" w:eastAsia="Microsoft YaHei"/>
+                <w:rFonts w:ascii="Times New Roman" w:hAnsi="Times New Roman" w:eastAsia="Times New Roman"/>
                 <w:b w:val="0"/>
                 <w:color w:val="202124"/>
-                <w:sz w:val="18"/>
+                <w:sz w:val="19"/>
               </w:rPr>
               <w:t>Confidence threshold 0.80; nearest-grid distance threshold 48 px</w:t>
             </w:r>
@@ -790,7 +835,7 @@
         </w:trPr>
         <w:tc>
           <w:tcPr>
-            <w:tcW w:type="dxa" w:w="4734"/>
+            <w:tcW w:type="dxa" w:w="1944"/>
             <w:tcMar>
               <w:top w:w="65" w:type="dxa"/>
               <w:start w:w="80" w:type="dxa"/>
@@ -803,17 +848,19 @@
               <w:bottom w:val="single" w:sz="4" w:color="B8C2CC"/>
               <w:right w:val="single" w:sz="4" w:color="B8C2CC"/>
             </w:tcBorders>
+            <w:vAlign w:val="center"/>
           </w:tcPr>
           <w:p>
             <w:pPr>
+              <w:spacing w:line="240" w:lineRule="auto"/>
               <w:jc w:val="left"/>
             </w:pPr>
             <w:r>
               <w:rPr>
-                <w:rFonts w:ascii="Microsoft YaHei" w:hAnsi="Microsoft YaHei" w:eastAsia="Microsoft YaHei"/>
+                <w:rFonts w:ascii="Times New Roman" w:hAnsi="Times New Roman" w:eastAsia="Times New Roman"/>
                 <w:b w:val="0"/>
                 <w:color w:val="202124"/>
-                <w:sz w:val="18"/>
+                <w:sz w:val="19"/>
               </w:rPr>
               <w:t>Teaching record</w:t>
             </w:r>
@@ -821,7 +868,7 @@
         </w:tc>
         <w:tc>
           <w:tcPr>
-            <w:tcW w:type="dxa" w:w="4734"/>
+            <w:tcW w:type="dxa" w:w="6336"/>
             <w:tcMar>
               <w:top w:w="65" w:type="dxa"/>
               <w:start w:w="80" w:type="dxa"/>
@@ -834,17 +881,19 @@
               <w:bottom w:val="single" w:sz="4" w:color="B8C2CC"/>
               <w:right w:val="single" w:sz="4" w:color="B8C2CC"/>
             </w:tcBorders>
+            <w:vAlign w:val="center"/>
           </w:tcPr>
           <w:p>
             <w:pPr>
+              <w:spacing w:line="240" w:lineRule="auto"/>
               <w:jc w:val="left"/>
             </w:pPr>
             <w:r>
               <w:rPr>
-                <w:rFonts w:ascii="Microsoft YaHei" w:hAnsi="Microsoft YaHei" w:eastAsia="Microsoft YaHei"/>
+                <w:rFonts w:ascii="Times New Roman" w:hAnsi="Times New Roman" w:eastAsia="Times New Roman"/>
                 <w:b w:val="0"/>
                 <w:color w:val="202124"/>
-                <w:sz w:val="18"/>
+                <w:sz w:val="19"/>
               </w:rPr>
               <w:t>manual_animation.json; 27 waypoints; 34-step automatic playback; 2.0 s per step</w:t>
             </w:r>
@@ -857,7 +906,7 @@
         </w:trPr>
         <w:tc>
           <w:tcPr>
-            <w:tcW w:type="dxa" w:w="4734"/>
+            <w:tcW w:type="dxa" w:w="1944"/>
             <w:tcMar>
               <w:top w:w="65" w:type="dxa"/>
               <w:start w:w="80" w:type="dxa"/>
@@ -871,17 +920,19 @@
               <w:right w:val="single" w:sz="4" w:color="B8C2CC"/>
             </w:tcBorders>
             <w:shd w:fill="F7FAFC"/>
+            <w:vAlign w:val="center"/>
           </w:tcPr>
           <w:p>
             <w:pPr>
+              <w:spacing w:line="240" w:lineRule="auto"/>
               <w:jc w:val="left"/>
             </w:pPr>
             <w:r>
               <w:rPr>
-                <w:rFonts w:ascii="Microsoft YaHei" w:hAnsi="Microsoft YaHei" w:eastAsia="Microsoft YaHei"/>
+                <w:rFonts w:ascii="Times New Roman" w:hAnsi="Times New Roman" w:eastAsia="Times New Roman"/>
                 <w:b w:val="0"/>
                 <w:color w:val="202124"/>
-                <w:sz w:val="18"/>
+                <w:sz w:val="19"/>
               </w:rPr>
               <w:t>Acceptance records</w:t>
             </w:r>
@@ -889,7 +940,7 @@
         </w:tc>
         <w:tc>
           <w:tcPr>
-            <w:tcW w:type="dxa" w:w="4734"/>
+            <w:tcW w:type="dxa" w:w="6336"/>
             <w:tcMar>
               <w:top w:w="65" w:type="dxa"/>
               <w:start w:w="80" w:type="dxa"/>
@@ -903,17 +954,19 @@
               <w:right w:val="single" w:sz="4" w:color="B8C2CC"/>
             </w:tcBorders>
             <w:shd w:fill="F7FAFC"/>
+            <w:vAlign w:val="center"/>
           </w:tcPr>
           <w:p>
             <w:pPr>
+              <w:spacing w:line="240" w:lineRule="auto"/>
               <w:jc w:val="left"/>
             </w:pPr>
             <w:r>
               <w:rPr>
-                <w:rFonts w:ascii="Microsoft YaHei" w:hAnsi="Microsoft YaHei" w:eastAsia="Microsoft YaHei"/>
+                <w:rFonts w:ascii="Times New Roman" w:hAnsi="Times New Roman" w:eastAsia="Times New Roman"/>
                 <w:b w:val="0"/>
                 <w:color w:val="202124"/>
-                <w:sz w:val="18"/>
+                <w:sz w:val="19"/>
               </w:rPr>
               <w:t>Task CSV, execution CSV, exception logs, GUI process images, and final poses</w:t>
             </w:r>
@@ -931,13 +984,16 @@
         <w:pStyle w:val="Heading2"/>
       </w:pPr>
       <w:r>
+        <w:rPr>
+          <w:rFonts w:ascii="Times New Roman" w:hAnsi="Times New Roman" w:eastAsia="Times New Roman"/>
+        </w:rPr>
         <w:t>1.3 Work Completed in This Experiment</w:t>
       </w:r>
     </w:p>
     <w:p>
       <w:r>
         <w:rPr>
-          <w:rFonts w:ascii="Microsoft YaHei" w:hAnsi="Microsoft YaHei" w:eastAsia="Microsoft YaHei"/>
+          <w:rFonts w:ascii="Times New Roman" w:hAnsi="Times New Roman" w:eastAsia="Times New Roman"/>
           <w:b w:val="0"/>
           <w:color w:val="202124"/>
           <w:sz w:val="21"/>
@@ -950,13 +1006,16 @@
         <w:pStyle w:val="Heading1"/>
       </w:pPr>
       <w:r>
+        <w:rPr>
+          <w:rFonts w:ascii="Times New Roman" w:hAnsi="Times New Roman" w:eastAsia="Times New Roman"/>
+        </w:rPr>
         <w:t>2 Personal Responsibilities</w:t>
       </w:r>
     </w:p>
     <w:p>
       <w:r>
         <w:rPr>
-          <w:rFonts w:ascii="Microsoft YaHei" w:hAnsi="Microsoft YaHei" w:eastAsia="Microsoft YaHei"/>
+          <w:rFonts w:ascii="Times New Roman" w:hAnsi="Times New Roman" w:eastAsia="Times New Roman"/>
           <w:b w:val="0"/>
           <w:color w:val="202124"/>
           <w:sz w:val="21"/>
@@ -972,7 +1031,7 @@
       </w:pPr>
       <w:r>
         <w:rPr>
-          <w:rFonts w:ascii="Microsoft YaHei" w:hAnsi="Microsoft YaHei" w:eastAsia="Microsoft YaHei"/>
+          <w:rFonts w:ascii="Times New Roman" w:hAnsi="Times New Roman" w:eastAsia="Times New Roman"/>
           <w:b w:val="0"/>
           <w:color w:val="202124"/>
           <w:sz w:val="20"/>
@@ -988,7 +1047,7 @@
       </w:pPr>
       <w:r>
         <w:rPr>
-          <w:rFonts w:ascii="Microsoft YaHei" w:hAnsi="Microsoft YaHei" w:eastAsia="Microsoft YaHei"/>
+          <w:rFonts w:ascii="Times New Roman" w:hAnsi="Times New Roman" w:eastAsia="Times New Roman"/>
           <w:b w:val="0"/>
           <w:color w:val="202124"/>
           <w:sz w:val="20"/>
@@ -1004,7 +1063,7 @@
       </w:pPr>
       <w:r>
         <w:rPr>
-          <w:rFonts w:ascii="Microsoft YaHei" w:hAnsi="Microsoft YaHei" w:eastAsia="Microsoft YaHei"/>
+          <w:rFonts w:ascii="Times New Roman" w:hAnsi="Times New Roman" w:eastAsia="Times New Roman"/>
           <w:b w:val="0"/>
           <w:color w:val="202124"/>
           <w:sz w:val="20"/>
@@ -1020,7 +1079,7 @@
       </w:pPr>
       <w:r>
         <w:rPr>
-          <w:rFonts w:ascii="Microsoft YaHei" w:hAnsi="Microsoft YaHei" w:eastAsia="Microsoft YaHei"/>
+          <w:rFonts w:ascii="Times New Roman" w:hAnsi="Times New Roman" w:eastAsia="Times New Roman"/>
           <w:b w:val="0"/>
           <w:color w:val="202124"/>
           <w:sz w:val="20"/>
@@ -1036,7 +1095,7 @@
       </w:pPr>
       <w:r>
         <w:rPr>
-          <w:rFonts w:ascii="Microsoft YaHei" w:hAnsi="Microsoft YaHei" w:eastAsia="Microsoft YaHei"/>
+          <w:rFonts w:ascii="Times New Roman" w:hAnsi="Times New Roman" w:eastAsia="Times New Roman"/>
           <w:b w:val="0"/>
           <w:color w:val="202124"/>
           <w:sz w:val="20"/>
@@ -1049,13 +1108,16 @@
         <w:pStyle w:val="Heading2"/>
       </w:pPr>
       <w:r>
+        <w:rPr>
+          <w:rFonts w:ascii="Times New Roman" w:hAnsi="Times New Roman" w:eastAsia="Times New Roman"/>
+        </w:rPr>
         <w:t>2.1 Scene and Startup Organization</w:t>
       </w:r>
     </w:p>
     <w:p>
       <w:r>
         <w:rPr>
-          <w:rFonts w:ascii="Microsoft YaHei" w:hAnsi="Microsoft YaHei" w:eastAsia="Microsoft YaHei"/>
+          <w:rFonts w:ascii="Times New Roman" w:hAnsi="Times New Roman" w:eastAsia="Times New Roman"/>
           <w:b w:val="0"/>
           <w:color w:val="202124"/>
           <w:sz w:val="21"/>
@@ -1068,13 +1130,16 @@
         <w:pStyle w:val="Heading2"/>
       </w:pPr>
       <w:r>
+        <w:rPr>
+          <w:rFonts w:ascii="Times New Roman" w:hAnsi="Times New Roman" w:eastAsia="Times New Roman"/>
+        </w:rPr>
         <w:t>2.2 Manual Teaching and Waypoint Recording</w:t>
       </w:r>
     </w:p>
     <w:p>
       <w:r>
         <w:rPr>
-          <w:rFonts w:ascii="Microsoft YaHei" w:hAnsi="Microsoft YaHei" w:eastAsia="Microsoft YaHei"/>
+          <w:rFonts w:ascii="Times New Roman" w:hAnsi="Times New Roman" w:eastAsia="Times New Roman"/>
           <w:b w:val="0"/>
           <w:color w:val="202124"/>
           <w:sz w:val="21"/>
@@ -1087,13 +1152,16 @@
         <w:pStyle w:val="Heading2"/>
       </w:pPr>
       <w:r>
+        <w:rPr>
+          <w:rFonts w:ascii="Times New Roman" w:hAnsi="Times New Roman" w:eastAsia="Times New Roman"/>
+        </w:rPr>
         <w:t>2.3 Parameter and Grasp Verification</w:t>
       </w:r>
     </w:p>
     <w:p>
       <w:r>
         <w:rPr>
-          <w:rFonts w:ascii="Microsoft YaHei" w:hAnsi="Microsoft YaHei" w:eastAsia="Microsoft YaHei"/>
+          <w:rFonts w:ascii="Times New Roman" w:hAnsi="Times New Roman" w:eastAsia="Times New Roman"/>
           <w:b w:val="0"/>
           <w:color w:val="202124"/>
           <w:sz w:val="21"/>
@@ -1106,13 +1174,16 @@
         <w:pStyle w:val="Heading2"/>
       </w:pPr>
       <w:r>
+        <w:rPr>
+          <w:rFonts w:ascii="Times New Roman" w:hAnsi="Times New Roman" w:eastAsia="Times New Roman"/>
+        </w:rPr>
         <w:t>2.4 Automatic Sequence and Log Organization</w:t>
       </w:r>
     </w:p>
     <w:p>
       <w:r>
         <w:rPr>
-          <w:rFonts w:ascii="Microsoft YaHei" w:hAnsi="Microsoft YaHei" w:eastAsia="Microsoft YaHei"/>
+          <w:rFonts w:ascii="Times New Roman" w:hAnsi="Times New Roman" w:eastAsia="Times New Roman"/>
           <w:b w:val="0"/>
           <w:color w:val="202124"/>
           <w:sz w:val="21"/>
@@ -1125,13 +1196,16 @@
         <w:pStyle w:val="Heading2"/>
       </w:pPr>
       <w:r>
+        <w:rPr>
+          <w:rFonts w:ascii="Times New Roman" w:hAnsi="Times New Roman" w:eastAsia="Times New Roman"/>
+        </w:rPr>
         <w:t>2.5 Integrated Acceptance</w:t>
       </w:r>
     </w:p>
     <w:p>
       <w:r>
         <w:rPr>
-          <w:rFonts w:ascii="Microsoft YaHei" w:hAnsi="Microsoft YaHei" w:eastAsia="Microsoft YaHei"/>
+          <w:rFonts w:ascii="Times New Roman" w:hAnsi="Times New Roman" w:eastAsia="Times New Roman"/>
           <w:b w:val="0"/>
           <w:color w:val="202124"/>
           <w:sz w:val="21"/>
@@ -1184,6 +1258,9 @@
         <w:pStyle w:val="CaptionCustom"/>
       </w:pPr>
       <w:r>
+        <w:rPr>
+          <w:rFonts w:ascii="Times New Roman" w:hAnsi="Times New Roman" w:eastAsia="Times New Roman"/>
+        </w:rPr>
         <w:t>Figure 1  Position of my work in the chain from manual teaching to object-level acceptance</w:t>
       </w:r>
     </w:p>
@@ -1192,6 +1269,9 @@
         <w:pStyle w:val="Heading1"/>
       </w:pPr>
       <w:r>
+        <w:rPr>
+          <w:rFonts w:ascii="Times New Roman" w:hAnsi="Times New Roman" w:eastAsia="Times New Roman"/>
+        </w:rPr>
         <w:t>3 Project Implementation Principles</w:t>
       </w:r>
     </w:p>
@@ -1200,13 +1280,16 @@
         <w:pStyle w:val="Heading2"/>
       </w:pPr>
       <w:r>
+        <w:rPr>
+          <w:rFonts w:ascii="Times New Roman" w:hAnsi="Times New Roman" w:eastAsia="Times New Roman"/>
+        </w:rPr>
         <w:t>3.1 System Components and Data Flow</w:t>
       </w:r>
     </w:p>
     <w:p>
       <w:r>
         <w:rPr>
-          <w:rFonts w:ascii="Microsoft YaHei" w:hAnsi="Microsoft YaHei" w:eastAsia="Microsoft YaHei"/>
+          <w:rFonts w:ascii="Times New Roman" w:hAnsi="Times New Roman" w:eastAsia="Times New Roman"/>
           <w:b w:val="0"/>
           <w:color w:val="202124"/>
           <w:sz w:val="21"/>
@@ -1259,6 +1342,9 @@
         <w:pStyle w:val="CaptionCustom"/>
       </w:pPr>
       <w:r>
+        <w:rPr>
+          <w:rFonts w:ascii="Times New Roman" w:hAnsi="Times New Roman" w:eastAsia="Times New Roman"/>
+        </w:rPr>
         <w:t>Figure 2  Connections among recognition, grid localization, classification, and execution modules in the simulation system</w:t>
       </w:r>
     </w:p>
@@ -1267,13 +1353,16 @@
         <w:pStyle w:val="Heading2"/>
       </w:pPr>
       <w:r>
+        <w:rPr>
+          <w:rFonts w:ascii="Times New Roman" w:hAnsi="Times New Roman" w:eastAsia="Times New Roman"/>
+        </w:rPr>
         <w:t>3.2 Grid Localization and Classification Decision</w:t>
       </w:r>
     </w:p>
     <w:p>
       <w:r>
         <w:rPr>
-          <w:rFonts w:ascii="Microsoft YaHei" w:hAnsi="Microsoft YaHei" w:eastAsia="Microsoft YaHei"/>
+          <w:rFonts w:ascii="Times New Roman" w:hAnsi="Times New Roman" w:eastAsia="Times New Roman"/>
           <w:b w:val="0"/>
           <w:color w:val="202124"/>
           <w:sz w:val="21"/>
@@ -1326,6 +1415,9 @@
         <w:pStyle w:val="CaptionCustom"/>
       </w:pPr>
       <w:r>
+        <w:rPr>
+          <w:rFonts w:ascii="Times New Roman" w:hAnsi="Times New Roman" w:eastAsia="Times New Roman"/>
+        </w:rPr>
         <w:t>Figure 3  Relationship among the six grids, object classes, and sorting pads that I helped verify</w:t>
       </w:r>
     </w:p>
@@ -1334,13 +1426,16 @@
         <w:pStyle w:val="Heading2"/>
       </w:pPr>
       <w:r>
+        <w:rPr>
+          <w:rFonts w:ascii="Times New Roman" w:hAnsi="Times New Roman" w:eastAsia="Times New Roman"/>
+        </w:rPr>
         <w:t>3.3 Grasping and Transport Motion Chain</w:t>
       </w:r>
     </w:p>
     <w:p>
       <w:r>
         <w:rPr>
-          <w:rFonts w:ascii="Microsoft YaHei" w:hAnsi="Microsoft YaHei" w:eastAsia="Microsoft YaHei"/>
+          <w:rFonts w:ascii="Times New Roman" w:hAnsi="Times New Roman" w:eastAsia="Times New Roman"/>
           <w:b w:val="0"/>
           <w:color w:val="202124"/>
           <w:sz w:val="21"/>
@@ -1393,6 +1488,9 @@
         <w:pStyle w:val="CaptionCustom"/>
       </w:pPr>
       <w:r>
+        <w:rPr>
+          <w:rFonts w:ascii="Times New Roman" w:hAnsi="Times New Roman" w:eastAsia="Times New Roman"/>
+        </w:rPr>
         <w:t>Figure 4  Approach, closing, checking, attachment, and lifting actions that I debugged</w:t>
       </w:r>
     </w:p>
@@ -1401,13 +1499,16 @@
         <w:pStyle w:val="Heading2"/>
       </w:pPr>
       <w:r>
+        <w:rPr>
+          <w:rFonts w:ascii="Times New Roman" w:hAnsi="Times New Roman" w:eastAsia="Times New Roman"/>
+        </w:rPr>
         <w:t>3.4 Vertical Release and Destination Check</w:t>
       </w:r>
     </w:p>
     <w:p>
       <w:r>
         <w:rPr>
-          <w:rFonts w:ascii="Microsoft YaHei" w:hAnsi="Microsoft YaHei" w:eastAsia="Microsoft YaHei"/>
+          <w:rFonts w:ascii="Times New Roman" w:hAnsi="Times New Roman" w:eastAsia="Times New Roman"/>
           <w:b w:val="0"/>
           <w:color w:val="202124"/>
           <w:sz w:val="21"/>
@@ -1460,6 +1561,9 @@
         <w:pStyle w:val="CaptionCustom"/>
       </w:pPr>
       <w:r>
+        <w:rPr>
+          <w:rFonts w:ascii="Times New Roman" w:hAnsi="Times New Roman" w:eastAsia="Times New Roman"/>
+        </w:rPr>
         <w:t>Figure 5  Vertical detachment and destination-check procedure</w:t>
       </w:r>
     </w:p>
@@ -1468,13 +1572,16 @@
         <w:pStyle w:val="Heading2"/>
       </w:pPr>
       <w:r>
+        <w:rPr>
+          <w:rFonts w:ascii="Times New Roman" w:hAnsi="Times New Roman" w:eastAsia="Times New Roman"/>
+        </w:rPr>
         <w:t>3.5 Waypoint Semantics and State Evidence</w:t>
       </w:r>
     </w:p>
     <w:p>
       <w:r>
         <w:rPr>
-          <w:rFonts w:ascii="Microsoft YaHei" w:hAnsi="Microsoft YaHei" w:eastAsia="Microsoft YaHei"/>
+          <w:rFonts w:ascii="Times New Roman" w:hAnsi="Times New Roman" w:eastAsia="Times New Roman"/>
           <w:b w:val="0"/>
           <w:color w:val="202124"/>
           <w:sz w:val="21"/>
@@ -1527,6 +1634,9 @@
         <w:pStyle w:val="CaptionCustom"/>
       </w:pPr>
       <w:r>
+        <w:rPr>
+          <w:rFonts w:ascii="Times New Roman" w:hAnsi="Times New Roman" w:eastAsia="Times New Roman"/>
+        </w:rPr>
         <w:t>Figure 6  Joint, gripper, and waypoint lists in the manual control panel</w:t>
       </w:r>
     </w:p>
@@ -1575,6 +1685,9 @@
         <w:pStyle w:val="CaptionCustom"/>
       </w:pPr>
       <w:r>
+        <w:rPr>
+          <w:rFonts w:ascii="Times New Roman" w:hAnsi="Times New Roman" w:eastAsia="Times New Roman"/>
+        </w:rPr>
         <w:t>Figure 7  Automatic playback subsequences for the six targets</w:t>
       </w:r>
     </w:p>
@@ -1583,11 +1696,17 @@
         <w:pStyle w:val="Heading1"/>
       </w:pPr>
       <w:r>
+        <w:rPr>
+          <w:rFonts w:ascii="Times New Roman" w:hAnsi="Times New Roman" w:eastAsia="Times New Roman"/>
+        </w:rPr>
         <w:t>4 Problems Encountered and Solutions</w:t>
       </w:r>
     </w:p>
     <w:p>
       <w:r>
+        <w:rPr>
+          <w:rFonts w:ascii="Times New Roman" w:hAnsi="Times New Roman" w:eastAsia="Times New Roman"/>
+        </w:rPr>
         <w:t>This section reviews the debugging process problem by problem. Each item records the actual screen or log observation, the corresponding inspection point, the specific waypoint, parameter, or node that was changed, and the verification condition after the change. The object-level conclusion for the red-blue baseline follows mecharm_sorting_execution.csv; the three-class extension includes only results supported by existing scene and sequence evidence.</w:t>
       </w:r>
     </w:p>
@@ -1596,50 +1715,69 @@
         <w:pStyle w:val="Heading2"/>
       </w:pPr>
       <w:r>
+        <w:rPr>
+          <w:rFonts w:ascii="Times New Roman" w:hAnsi="Times New Roman" w:eastAsia="Times New Roman"/>
+        </w:rPr>
         <w:t>4.1 Default Pose Caused Gripper Misalignment</w:t>
       </w:r>
     </w:p>
     <w:p>
       <w:r>
         <w:rPr>
+          <w:rFonts w:ascii="Times New Roman" w:hAnsi="Times New Roman" w:eastAsia="Times New Roman"/>
           <w:b/>
         </w:rPr>
         <w:t>Observed behavior:</w:t>
       </w:r>
       <w:r>
+        <w:rPr>
+          <w:rFonts w:ascii="Times New Roman" w:hAnsi="Times New Roman" w:eastAsia="Times New Roman"/>
+        </w:rPr>
         <w:t xml:space="preserve"> During the first playback of a green target in the three-class scene, the robot arm moved from above_green_1 down to pick_4, but the gripper center did not lie on the cylinder centerline. The right fingertip touched the cylinder edge first. above_green_2/pick_5 showed the same tendency. Although the gripper closed, the cylinder was not stably held between the two fingers.</w:t>
       </w:r>
     </w:p>
     <w:p>
       <w:r>
         <w:rPr>
+          <w:rFonts w:ascii="Times New Roman" w:hAnsi="Times New Roman" w:eastAsia="Times New Roman"/>
           <w:b/>
         </w:rPr>
         <w:t>Cause analysis:</w:t>
       </w:r>
       <w:r>
+        <w:rPr>
+          <w:rFonts w:ascii="Times New Roman" w:hAnsi="Times New Roman" w:eastAsia="Times New Roman"/>
+        </w:rPr>
         <w:t xml:space="preserve"> I paused at the two waypoints in manual_control_panel, dragged the joint sliders one by one, and compared the end-effector position with the six pickup points in sorting_scene.yaml and the top-view image. The original default pose had been calibrated for fixed points A-B. Reusing it for the green grid cells made the approach direction inconsistent with the cylinder center. The problem was therefore not the gripper opening, but the lack of independent above/pick pose calibration for each grid cell.</w:t>
       </w:r>
     </w:p>
     <w:p>
       <w:r>
         <w:rPr>
+          <w:rFonts w:ascii="Times New Roman" w:hAnsi="Times New Roman" w:eastAsia="Times New Roman"/>
           <w:b/>
         </w:rPr>
         <w:t>Handling:</w:t>
       </w:r>
       <w:r>
+        <w:rPr>
+          <w:rFonts w:ascii="Times New Roman" w:hAnsi="Times New Roman" w:eastAsia="Times New Roman"/>
+        </w:rPr>
         <w:t xml:space="preserve"> I used the already verified red-blue motion sequence as the template and re-saved two waypoint pairs, above_green_1 -&gt; pick_4 and above_green_2 -&gt; pick_5. The above stage kept the gripper opening at 0.15 and contact-pad force at -4.0; the pick stage switched the gripper to -0.31, and each action duration was fixed at 2.0 s. I changed one waypoint pair at a time, executed it step by step in the GUI, wrote it back to manual_animation.json, and finally rebuilt the 34-step sequence.</w:t>
       </w:r>
     </w:p>
     <w:p>
       <w:r>
         <w:rPr>
+          <w:rFonts w:ascii="Times New Roman" w:hAnsi="Times New Roman" w:eastAsia="Times New Roman"/>
           <w:b/>
         </w:rPr>
         <w:t>Verification:</w:t>
       </w:r>
       <w:r>
+        <w:rPr>
+          <w:rFonts w:ascii="Times New Roman" w:hAnsi="Times New Roman" w:eastAsia="Times New Roman"/>
+        </w:rPr>
         <w:t xml:space="preserve"> In the single-target test, the two fingers approached the cylinder from both sides at the same time, and no obvious side-slip occurred after closing. I then played the six-target sequence from manual_animation.json; the green pick_4/pick_5 actions no longer collided with the edge. The evidence consisted of the manual-panel screenshot, the six-target sequence figure, and the Gazebo recording. I did not extend this evidence into a three-class object-level success rate.</w:t>
       </w:r>
     </w:p>
@@ -1648,50 +1786,69 @@
         <w:pStyle w:val="Heading2"/>
       </w:pPr>
       <w:r>
+        <w:rPr>
+          <w:rFonts w:ascii="Times New Roman" w:hAnsi="Times New Roman" w:eastAsia="Times New Roman"/>
+        </w:rPr>
         <w:t>4.2 Gripper Closed but Object Stayed on the Table</w:t>
       </w:r>
     </w:p>
     <w:p>
       <w:r>
         <w:rPr>
+          <w:rFonts w:ascii="Times New Roman" w:hAnsi="Times New Roman" w:eastAsia="Times New Roman"/>
           <w:b/>
         </w:rPr>
         <w:t>Observed behavior:</w:t>
       </w:r>
       <w:r>
+        <w:rPr>
+          <w:rFonts w:ascii="Times New Roman" w:hAnsi="Times New Roman" w:eastAsia="Times New Roman"/>
+        </w:rPr>
         <w:t xml:space="preserve"> In one blue-cylinder test, the log already showed pick and close_gripper, but the cylinder remained on the table at approximately z = 0.0275 m. After the arm lifted, the space below the gripper was empty. Judging only from gripper closure would have incorrectly classified this action as successful.</w:t>
       </w:r>
     </w:p>
     <w:p>
       <w:r>
         <w:rPr>
+          <w:rFonts w:ascii="Times New Roman" w:hAnsi="Times New Roman" w:eastAsia="Times New Roman"/>
           <w:b/>
         </w:rPr>
         <w:t>Cause analysis:</w:t>
       </w:r>
       <w:r>
+        <w:rPr>
+          <w:rFonts w:ascii="Times New Roman" w:hAnsi="Times New Roman" w:eastAsia="Times New Roman"/>
+        </w:rPr>
         <w:t xml:space="preserve"> I split the action into closing, distance checking, and lifting and found that the original player published only gripper and arm JointTrajectory commands. It did not preserve the relative pose between the target and the end effector. Before the fix, sorting_executor.py did not associate the target pose from /gazebo/model_states with the gripper pose from /gazebo/link_states, so a command being issued did not mean that the target was attached.</w:t>
       </w:r>
     </w:p>
     <w:p>
       <w:r>
         <w:rPr>
+          <w:rFonts w:ascii="Times New Roman" w:hAnsi="Times New Roman" w:eastAsia="Times New Roman"/>
           <w:b/>
         </w:rPr>
         <w:t>Handling:</w:t>
       </w:r>
       <w:r>
+        <w:rPr>
+          <w:rFonts w:ascii="Times New Roman" w:hAnsi="Times New Roman" w:eastAsia="Times New Roman"/>
+        </w:rPr>
         <w:t xml:space="preserve"> In sorting_executor.py I added grasp-object selection and a distance check, with a grasp-position tolerance of 0.05 m. After confirming the object, the executor stored attach_offset and updated the selected model pose through /gazebo/set_entity_state at approximately 0.06 s intervals. The state machine also wrote a grasp_attached event. If no nearby target was found, it entered the failed/exception branch; a target height above 0.075 m was used as the visual evidence condition.</w:t>
       </w:r>
     </w:p>
     <w:p>
       <w:r>
         <w:rPr>
+          <w:rFonts w:ascii="Times New Roman" w:hAnsi="Times New Roman" w:eastAsia="Times New Roman"/>
           <w:b/>
         </w:rPr>
         <w:t>Verification:</w:t>
       </w:r>
       <w:r>
+        <w:rPr>
+          <w:rFonts w:ascii="Times New Roman" w:hAnsi="Times New Roman" w:eastAsia="Times New Roman"/>
+        </w:rPr>
         <w:t xml:space="preserve"> After rerunning the single-target test, blue_cylinder_grasp_verified.png clearly showed the cylinder between the two fingers and above the tabletop. The corresponding CSV contained grasp_attached, lift, release, and object_complete events in order, all with status passed. This verifies that the target actually rose with the end effector rather than merely confirming that the gripper closed.</w:t>
       </w:r>
     </w:p>
@@ -1740,6 +1897,9 @@
         <w:pStyle w:val="CaptionCustom"/>
       </w:pPr>
       <w:r>
+        <w:rPr>
+          <w:rFonts w:ascii="Times New Roman" w:hAnsi="Times New Roman" w:eastAsia="Times New Roman"/>
+        </w:rPr>
         <w:t>Figure 8  Verification image showing the closed gripper holding the target between the fingers and lifting it from the table</w:t>
       </w:r>
     </w:p>
@@ -1748,50 +1908,69 @@
         <w:pStyle w:val="Heading2"/>
       </w:pPr>
       <w:r>
+        <w:rPr>
+          <w:rFonts w:ascii="Times New Roman" w:hAnsi="Times New Roman" w:eastAsia="Times New Roman"/>
+        </w:rPr>
         <w:t>4.3 Release Jump and Overlap of Same-Color Targets</w:t>
       </w:r>
     </w:p>
     <w:p>
       <w:r>
         <w:rPr>
+          <w:rFonts w:ascii="Times New Roman" w:hAnsi="Times New Roman" w:eastAsia="Times New Roman"/>
           <w:b/>
         </w:rPr>
         <w:t>Observed behavior:</w:t>
       </w:r>
       <w:r>
+        <w:rPr>
+          <w:rFonts w:ascii="Times New Roman" w:hAnsi="Times New Roman" w:eastAsia="Times New Roman"/>
+        </w:rPr>
         <w:t xml:space="preserve"> In the first release test, the target was written directly to the center of the sorting pad, so the image did not show a continuous alignment, detachment, and falling process. Two targets of the same color also landed at exactly the same position. The later target covered the earlier one, making it impossible to determine from the final image whether the targets had been completed one by one.</w:t>
       </w:r>
     </w:p>
     <w:p>
       <w:r>
         <w:rPr>
+          <w:rFonts w:ascii="Times New Roman" w:hAnsi="Times New Roman" w:eastAsia="Times New Roman"/>
           <w:b/>
         </w:rPr>
         <w:t>Cause analysis:</w:t>
       </w:r>
       <w:r>
+        <w:rPr>
+          <w:rFonts w:ascii="Times New Roman" w:hAnsi="Times New Roman" w:eastAsia="Times New Roman"/>
+        </w:rPr>
         <w:t xml:space="preserve"> After checking the release stage, I found that one SetEntityState call changed the target X, Y, and Z simultaneously. The target therefore jumped sideways between adjacent frames. The original playback sequence also had no separate destination index for same-color targets. Even when the final coordinates looked correct, the release process did not satisfy the acceptance requirements for continuous motion and reproducible results.</w:t>
       </w:r>
     </w:p>
     <w:p>
       <w:r>
         <w:rPr>
+          <w:rFonts w:ascii="Times New Roman" w:hAnsi="Times New Roman" w:eastAsia="Times New Roman"/>
           <w:b/>
         </w:rPr>
         <w:t>Handling:</w:t>
       </w:r>
       <w:r>
+        <w:rPr>
+          <w:rFonts w:ascii="Times New Roman" w:hAnsi="Times New Roman" w:eastAsia="Times New Roman"/>
+        </w:rPr>
         <w:t xml:space="preserve"> In the executor I created separate destination lists for red, blue, and green. Red used (0.115, -0.15), (0.14, -0.12), and (0.165, -0.09); blue used (0.235, -0.15), (0.26, -0.12), and (0.285, -0.09); green used (0.34, -0.02) and (0.38, 0.02). During release, X/Y alignment was maintained, the target was detached before descending along Z, and the system waited for stability after opening the gripper. The verification stage checked that the XY error was no more than 0.07 m; otherwise it recorded release pose outside destination.</w:t>
       </w:r>
     </w:p>
     <w:p>
       <w:r>
         <w:rPr>
+          <w:rFonts w:ascii="Times New Roman" w:hAnsi="Times New Roman" w:eastAsia="Times New Roman"/>
           <w:b/>
         </w:rPr>
         <w:t>Verification:</w:t>
       </w:r>
       <w:r>
+        <w:rPr>
+          <w:rFonts w:ascii="Times New Roman" w:hAnsi="Times New Roman" w:eastAsia="Times New Roman"/>
+        </w:rPr>
         <w:t xml:space="preserve"> release_stages.png continuously showed four stages: reaching the release pose, detaching, vertical descent, and settling. The final positions of same-color cylinders were separated. The CSV release record preserved the destination coordinates and was followed by object_complete. This change therefore solved both the visual jump and the overlap of same-color targets.</w:t>
       </w:r>
     </w:p>
@@ -1800,50 +1979,69 @@
         <w:pStyle w:val="Heading2"/>
       </w:pPr>
       <w:r>
+        <w:rPr>
+          <w:rFonts w:ascii="Times New Roman" w:hAnsi="Times New Roman" w:eastAsia="Times New Roman"/>
+        </w:rPr>
         <w:t>4.4 World Coordinates and Pixel Grid Out of Sync</w:t>
       </w:r>
     </w:p>
     <w:p>
       <w:r>
         <w:rPr>
+          <w:rFonts w:ascii="Times New Roman" w:hAnsi="Times New Roman" w:eastAsia="Times New Roman"/>
           <w:b/>
         </w:rPr>
         <w:t>Observed behavior:</w:t>
       </w:r>
       <w:r>
+        <w:rPr>
+          <w:rFonts w:ascii="Times New Roman" w:hAnsi="Times New Roman" w:eastAsia="Times New Roman"/>
+        </w:rPr>
         <w:t xml:space="preserve"> After the scene coordinates were adjusted, the task node recognized only a few targets and the complete plan contained gaps. The top-view image showed all six cylinders on the table, but the target count in the task log did not match the image. The missing objects caused later grasp sequences to be incomplete; the robot-arm motion itself had not failed.</w:t>
       </w:r>
     </w:p>
     <w:p>
       <w:r>
         <w:rPr>
+          <w:rFonts w:ascii="Times New Roman" w:hAnsi="Times New Roman" w:eastAsia="Times New Roman"/>
           <w:b/>
         </w:rPr>
         <w:t>Cause analysis:</w:t>
       </w:r>
       <w:r>
+        <w:rPr>
+          <w:rFonts w:ascii="Times New Roman" w:hAnsi="Times New Roman" w:eastAsia="Times New Roman"/>
+        </w:rPr>
         <w:t xml:space="preserve"> I compared the positions of the three rows of targets in the world, the projection formula in sorting_scene_monitor.py, and the pixel grid used by sorting_task.py. The scene had changed while the old grid parameters were still being loaded. The current projection maps world-y to the image horizontal coordinate and world-x to the image vertical coordinate. If the old row coordinates are used, the detection-box centers are assigned to the wrong grid or classified as outside the grid.</w:t>
       </w:r>
     </w:p>
     <w:p>
       <w:r>
         <w:rPr>
+          <w:rFonts w:ascii="Times New Roman" w:hAnsi="Times New Roman" w:eastAsia="Times New Roman"/>
           <w:b/>
         </w:rPr>
         <w:t>Handling:</w:t>
       </w:r>
       <w:r>
+        <w:rPr>
+          <w:rFonts w:ascii="Times New Roman" w:hAnsi="Times New Roman" w:eastAsia="Times New Roman"/>
+        </w:rPr>
         <w:t xml:space="preserve"> I recalculated the three row pixel coordinates as 186, 240, and 294 according to the new projection relationship, while retaining the column coordinates 212, 266, and 320. I fixed grid_tolerance_px at 48, cleared old instances, and restarted monitor, task, and executor. To prevent a moved target from triggering a new plan, I retained detection-signature deduplication and the plan_locked guard under execute_motion.</w:t>
       </w:r>
     </w:p>
     <w:p>
       <w:r>
         <w:rPr>
+          <w:rFonts w:ascii="Times New Roman" w:hAnsi="Times New Roman" w:eastAsia="Times New Roman"/>
           <w:b/>
         </w:rPr>
         <w:t>Verification:</w:t>
       </w:r>
       <w:r>
+        <w:rPr>
+          <w:rFonts w:ascii="Times New Roman" w:hAnsi="Times New Roman" w:eastAsia="Times New Roman"/>
+        </w:rPr>
         <w:t xml:space="preserve"> After restart, grid_mapping.png showed a one-to-one correspondence between detection-box centers and the six grids, and grid_id values in the log were no longer duplicated or missing. The red-blue baseline CSV recorded count=6 and success_count=6 in task_result, with a unique grid assigned to each object. This shows that the coordinate correction reached both the task queue and the final result.</w:t>
       </w:r>
     </w:p>
@@ -1852,50 +2050,69 @@
         <w:pStyle w:val="Heading2"/>
       </w:pPr>
       <w:r>
+        <w:rPr>
+          <w:rFonts w:ascii="Times New Roman" w:hAnsi="Times New Roman" w:eastAsia="Times New Roman"/>
+        </w:rPr>
         <w:t>4.5 Repeated Launches Prevented Motion Commands</w:t>
       </w:r>
     </w:p>
     <w:p>
       <w:r>
         <w:rPr>
+          <w:rFonts w:ascii="Times New Roman" w:hAnsi="Times New Roman" w:eastAsia="Times New Roman"/>
           <w:b/>
         </w:rPr>
         <w:t>Observed behavior:</w:t>
       </w:r>
       <w:r>
+        <w:rPr>
+          <w:rFonts w:ascii="Times New Roman" w:hAnsi="Times New Roman" w:eastAsia="Times New Roman"/>
+        </w:rPr>
         <w:t xml:space="preserve"> The interface looked normal, but the robot arm did not respond after the player sent a motion command, or the same motion was triggered twice. The terminal showed duplicate output for the same stage. If I continued adjusting waypoints at that point, I could mistake a process conflict for a pose-parameter error.</w:t>
       </w:r>
     </w:p>
     <w:p>
       <w:r>
         <w:rPr>
+          <w:rFonts w:ascii="Times New Roman" w:hAnsi="Times New Roman" w:eastAsia="Times New Roman"/>
           <w:b/>
         </w:rPr>
         <w:t>Cause analysis:</w:t>
       </w:r>
       <w:r>
+        <w:rPr>
+          <w:rFonts w:ascii="Times New Roman" w:hAnsi="Times New Roman" w:eastAsia="Times New Roman"/>
+        </w:rPr>
         <w:t xml:space="preserve"> I checked the world, controller, and player processes and found that an old Gazebo master and a new instance were running simultaneously. The manual control panel could also be connected to the old player. Multiple instances listened to the same control topics, so one command could be consumed twice or sent to a controller that was already invalid.</w:t>
       </w:r>
     </w:p>
     <w:p>
       <w:r>
         <w:rPr>
+          <w:rFonts w:ascii="Times New Roman" w:hAnsi="Times New Roman" w:eastAsia="Times New Roman"/>
           <w:b/>
         </w:rPr>
         <w:t>Handling:</w:t>
       </w:r>
       <w:r>
+        <w:rPr>
+          <w:rFonts w:ascii="Times New Roman" w:hAnsi="Times New Roman" w:eastAsia="Times New Roman"/>
+        </w:rPr>
         <w:t xml:space="preserve"> I first terminated the old gzserver, gzclient, and player processes, leaving only one world instance. I then started Gazebo, the controller, and manual_control_panel in the order specified by start_contact_grasp.sh. Automatic mode started only one sorting_gazebo.launch.py. The task node's detection-signature deduplication and plan_locked flag prevented the same plan from being submitted to the executor again.</w:t>
       </w:r>
     </w:p>
     <w:p>
       <w:r>
         <w:rPr>
+          <w:rFonts w:ascii="Times New Roman" w:hAnsi="Times New Roman" w:eastAsia="Times New Roman"/>
           <w:b/>
         </w:rPr>
         <w:t>Verification:</w:t>
       </w:r>
       <w:r>
+        <w:rPr>
+          <w:rFonts w:ascii="Times New Roman" w:hAnsi="Times New Roman" w:eastAsia="Times New Roman"/>
+        </w:rPr>
         <w:t xml:space="preserve"> After the environment was cleaned, the controller received only one set of motion commands. The single-target test progressed from above through pick and lift to release, and the 34-step sequence was no longer triggered repeatedly. During verification I checked the GUI, sorting_task/execution_state, and CSV timestamps together, confirming that the problem came from duplicate instances rather than the waypoints themselves.</w:t>
       </w:r>
     </w:p>
@@ -1904,50 +2121,69 @@
         <w:pStyle w:val="Heading2"/>
       </w:pPr>
       <w:r>
+        <w:rPr>
+          <w:rFonts w:ascii="Times New Roman" w:hAnsi="Times New Roman" w:eastAsia="Times New Roman"/>
+        </w:rPr>
         <w:t>4.6 Node Startup Log Error</w:t>
       </w:r>
     </w:p>
     <w:p>
       <w:r>
         <w:rPr>
+          <w:rFonts w:ascii="Times New Roman" w:hAnsi="Times New Roman" w:eastAsia="Times New Roman"/>
           <w:b/>
         </w:rPr>
         <w:t>Observed behavior:</w:t>
       </w:r>
       <w:r>
+        <w:rPr>
+          <w:rFonts w:ascii="Times New Roman" w:hAnsi="Times New Roman" w:eastAsia="Times New Roman"/>
+        </w:rPr>
         <w:t xml:space="preserve"> The task node exited immediately after startup. The terminal reported incompatible log-call arguments, so the node never entered detecting or plan_ready. The Gazebo scene was still visible, but there was no task state or object-level result; subsequent grasping could not be treated as a valid experimental record.</w:t>
       </w:r>
     </w:p>
     <w:p>
       <w:r>
         <w:rPr>
+          <w:rFonts w:ascii="Times New Roman" w:hAnsi="Times New Roman" w:eastAsia="Times New Roman"/>
           <w:b/>
         </w:rPr>
         <w:t>Cause analysis:</w:t>
       </w:r>
       <w:r>
+        <w:rPr>
+          <w:rFonts w:ascii="Times New Roman" w:hAnsi="Times New Roman" w:eastAsia="Times New Roman"/>
+        </w:rPr>
         <w:t xml:space="preserve"> I traced the error to the way the Humble Python logger was called. The old code passed extra arguments to the logging function, and the exception occurred before the state machine actually entered a task state. By checking the node exit position and the state topics after startup, I confirmed that this was not a detection or robot-control problem but a logging-call error during node initialization.</w:t>
       </w:r>
     </w:p>
     <w:p>
       <w:r>
         <w:rPr>
+          <w:rFonts w:ascii="Times New Roman" w:hAnsi="Times New Roman" w:eastAsia="Times New Roman"/>
           <w:b/>
         </w:rPr>
         <w:t>Handling:</w:t>
       </w:r>
       <w:r>
+        <w:rPr>
+          <w:rFonts w:ascii="Times New Roman" w:hAnsi="Times New Roman" w:eastAsia="Times New Roman"/>
+        </w:rPr>
         <w:t xml:space="preserve"> I changed the affected log messages to Humble-compatible f-string formatting, rebuilt the workspace, and restarted the unified Launch from a clean terminal. After startup I first checked that sorting_task/state, sorting_task/result, and sorting_task/execution_state existed. I then ran the single-target and complete sequences so that a process that had not started successfully would not be included in acceptance.</w:t>
       </w:r>
     </w:p>
     <w:p>
       <w:r>
         <w:rPr>
+          <w:rFonts w:ascii="Times New Roman" w:hAnsi="Times New Roman" w:eastAsia="Times New Roman"/>
           <w:b/>
         </w:rPr>
         <w:t>Verification:</w:t>
       </w:r>
       <w:r>
+        <w:rPr>
+          <w:rFonts w:ascii="Times New Roman" w:hAnsi="Times New Roman" w:eastAsia="Times New Roman"/>
+        </w:rPr>
         <w:t xml:space="preserve"> After the fix, the node remained active and continuously published detecting, plan_ready, execution-stage, and task_passed states. The CSV also recorded plan, grasp_attached, release, and task_result. Grasping issues could therefore be analyzed separately in a stable startup environment, and the log error no longer hid the task's execution result.</w:t>
       </w:r>
     </w:p>
@@ -1970,7 +2206,7 @@
         </w:trPr>
         <w:tc>
           <w:tcPr>
-            <w:tcW w:type="dxa" w:w="1928"/>
+            <w:tcW w:type="dxa" w:w="1800"/>
             <w:shd w:fill="163A5F"/>
             <w:tcMar>
               <w:top w:w="70" w:type="dxa"/>
@@ -1984,17 +2220,19 @@
               <w:bottom w:val="single" w:sz="6" w:color="163A5F"/>
               <w:right w:val="single" w:sz="4" w:color="C9D4DF"/>
             </w:tcBorders>
+            <w:vAlign w:val="center"/>
           </w:tcPr>
           <w:p>
             <w:pPr>
+              <w:spacing w:line="240" w:lineRule="auto"/>
               <w:jc w:val="center"/>
             </w:pPr>
             <w:r>
               <w:rPr>
-                <w:rFonts w:ascii="Microsoft YaHei" w:hAnsi="Microsoft YaHei" w:eastAsia="Microsoft YaHei"/>
+                <w:rFonts w:ascii="Times New Roman" w:hAnsi="Times New Roman" w:eastAsia="Times New Roman"/>
                 <w:b/>
                 <w:color w:val="FFFFFF"/>
-                <w:sz w:val="18"/>
+                <w:sz w:val="19"/>
               </w:rPr>
               <w:t>Problem</w:t>
             </w:r>
@@ -2002,7 +2240,7 @@
         </w:tc>
         <w:tc>
           <w:tcPr>
-            <w:tcW w:type="dxa" w:w="3969"/>
+            <w:tcW w:type="dxa" w:w="3240"/>
             <w:shd w:fill="163A5F"/>
             <w:tcMar>
               <w:top w:w="70" w:type="dxa"/>
@@ -2016,17 +2254,19 @@
               <w:bottom w:val="single" w:sz="6" w:color="163A5F"/>
               <w:right w:val="single" w:sz="4" w:color="C9D4DF"/>
             </w:tcBorders>
+            <w:vAlign w:val="center"/>
           </w:tcPr>
           <w:p>
             <w:pPr>
+              <w:spacing w:line="240" w:lineRule="auto"/>
               <w:jc w:val="center"/>
             </w:pPr>
             <w:r>
               <w:rPr>
-                <w:rFonts w:ascii="Microsoft YaHei" w:hAnsi="Microsoft YaHei" w:eastAsia="Microsoft YaHei"/>
+                <w:rFonts w:ascii="Times New Roman" w:hAnsi="Times New Roman" w:eastAsia="Times New Roman"/>
                 <w:b/>
                 <w:color w:val="FFFFFF"/>
-                <w:sz w:val="18"/>
+                <w:sz w:val="19"/>
               </w:rPr>
               <w:t>My evidence basis</w:t>
             </w:r>
@@ -2034,7 +2274,7 @@
         </w:tc>
         <w:tc>
           <w:tcPr>
-            <w:tcW w:type="dxa" w:w="3175"/>
+            <w:tcW w:type="dxa" w:w="3024"/>
             <w:shd w:fill="163A5F"/>
             <w:tcMar>
               <w:top w:w="70" w:type="dxa"/>
@@ -2048,17 +2288,19 @@
               <w:bottom w:val="single" w:sz="6" w:color="163A5F"/>
               <w:right w:val="single" w:sz="4" w:color="C9D4DF"/>
             </w:tcBorders>
+            <w:vAlign w:val="center"/>
           </w:tcPr>
           <w:p>
             <w:pPr>
+              <w:spacing w:line="240" w:lineRule="auto"/>
               <w:jc w:val="center"/>
             </w:pPr>
             <w:r>
               <w:rPr>
-                <w:rFonts w:ascii="Microsoft YaHei" w:hAnsi="Microsoft YaHei" w:eastAsia="Microsoft YaHei"/>
+                <w:rFonts w:ascii="Times New Roman" w:hAnsi="Times New Roman" w:eastAsia="Times New Roman"/>
                 <w:b/>
                 <w:color w:val="FFFFFF"/>
-                <w:sz w:val="18"/>
+                <w:sz w:val="19"/>
               </w:rPr>
               <w:t>Post-fix check</w:t>
             </w:r>
@@ -2071,7 +2313,7 @@
         </w:trPr>
         <w:tc>
           <w:tcPr>
-            <w:tcW w:type="dxa" w:w="3156"/>
+            <w:tcW w:type="dxa" w:w="1800"/>
             <w:tcMar>
               <w:top w:w="65" w:type="dxa"/>
               <w:start w:w="80" w:type="dxa"/>
@@ -2085,17 +2327,19 @@
               <w:right w:val="single" w:sz="4" w:color="B8C2CC"/>
             </w:tcBorders>
             <w:shd w:fill="F7FAFC"/>
+            <w:vAlign w:val="center"/>
           </w:tcPr>
           <w:p>
             <w:pPr>
+              <w:spacing w:line="240" w:lineRule="auto"/>
               <w:jc w:val="left"/>
             </w:pPr>
             <w:r>
               <w:rPr>
-                <w:rFonts w:ascii="Microsoft YaHei" w:hAnsi="Microsoft YaHei" w:eastAsia="Microsoft YaHei"/>
+                <w:rFonts w:ascii="Times New Roman" w:hAnsi="Times New Roman" w:eastAsia="Times New Roman"/>
                 <w:b w:val="0"/>
                 <w:color w:val="202124"/>
-                <w:sz w:val="18"/>
+                <w:sz w:val="19"/>
               </w:rPr>
               <w:t>Pose misalignment</w:t>
             </w:r>
@@ -2103,7 +2347,7 @@
         </w:tc>
         <w:tc>
           <w:tcPr>
-            <w:tcW w:type="dxa" w:w="3156"/>
+            <w:tcW w:type="dxa" w:w="3240"/>
             <w:tcMar>
               <w:top w:w="65" w:type="dxa"/>
               <w:start w:w="80" w:type="dxa"/>
@@ -2117,17 +2361,19 @@
               <w:right w:val="single" w:sz="4" w:color="B8C2CC"/>
             </w:tcBorders>
             <w:shd w:fill="F7FAFC"/>
+            <w:vAlign w:val="center"/>
           </w:tcPr>
           <w:p>
             <w:pPr>
+              <w:spacing w:line="240" w:lineRule="auto"/>
               <w:jc w:val="left"/>
             </w:pPr>
             <w:r>
               <w:rPr>
-                <w:rFonts w:ascii="Microsoft YaHei" w:hAnsi="Microsoft YaHei" w:eastAsia="Microsoft YaHei"/>
+                <w:rFonts w:ascii="Times New Roman" w:hAnsi="Times New Roman" w:eastAsia="Times New Roman"/>
                 <w:b w:val="0"/>
                 <w:color w:val="202124"/>
-                <w:sz w:val="18"/>
+                <w:sz w:val="19"/>
               </w:rPr>
               <w:t>Relative position of end effector and target</w:t>
             </w:r>
@@ -2135,7 +2381,7 @@
         </w:tc>
         <w:tc>
           <w:tcPr>
-            <w:tcW w:type="dxa" w:w="3156"/>
+            <w:tcW w:type="dxa" w:w="3024"/>
             <w:tcMar>
               <w:top w:w="65" w:type="dxa"/>
               <w:start w:w="80" w:type="dxa"/>
@@ -2149,17 +2395,19 @@
               <w:right w:val="single" w:sz="4" w:color="B8C2CC"/>
             </w:tcBorders>
             <w:shd w:fill="F7FAFC"/>
+            <w:vAlign w:val="center"/>
           </w:tcPr>
           <w:p>
             <w:pPr>
+              <w:spacing w:line="240" w:lineRule="auto"/>
               <w:jc w:val="left"/>
             </w:pPr>
             <w:r>
               <w:rPr>
-                <w:rFonts w:ascii="Microsoft YaHei" w:hAnsi="Microsoft YaHei" w:eastAsia="Microsoft YaHei"/>
+                <w:rFonts w:ascii="Times New Roman" w:hAnsi="Times New Roman" w:eastAsia="Times New Roman"/>
                 <w:b w:val="0"/>
                 <w:color w:val="202124"/>
-                <w:sz w:val="18"/>
+                <w:sz w:val="19"/>
               </w:rPr>
               <w:t>Grasp distance and alignment image</w:t>
             </w:r>
@@ -2172,7 +2420,7 @@
         </w:trPr>
         <w:tc>
           <w:tcPr>
-            <w:tcW w:type="dxa" w:w="3156"/>
+            <w:tcW w:type="dxa" w:w="1800"/>
             <w:tcMar>
               <w:top w:w="65" w:type="dxa"/>
               <w:start w:w="80" w:type="dxa"/>
@@ -2185,17 +2433,19 @@
               <w:bottom w:val="single" w:sz="4" w:color="B8C2CC"/>
               <w:right w:val="single" w:sz="4" w:color="B8C2CC"/>
             </w:tcBorders>
+            <w:vAlign w:val="center"/>
           </w:tcPr>
           <w:p>
             <w:pPr>
+              <w:spacing w:line="240" w:lineRule="auto"/>
               <w:jc w:val="left"/>
             </w:pPr>
             <w:r>
               <w:rPr>
-                <w:rFonts w:ascii="Microsoft YaHei" w:hAnsi="Microsoft YaHei" w:eastAsia="Microsoft YaHei"/>
+                <w:rFonts w:ascii="Times New Roman" w:hAnsi="Times New Roman" w:eastAsia="Times New Roman"/>
                 <w:b w:val="0"/>
                 <w:color w:val="202124"/>
-                <w:sz w:val="18"/>
+                <w:sz w:val="19"/>
               </w:rPr>
               <w:t>Not attached</w:t>
             </w:r>
@@ -2203,7 +2453,7 @@
         </w:tc>
         <w:tc>
           <w:tcPr>
-            <w:tcW w:type="dxa" w:w="3156"/>
+            <w:tcW w:type="dxa" w:w="3240"/>
             <w:tcMar>
               <w:top w:w="65" w:type="dxa"/>
               <w:start w:w="80" w:type="dxa"/>
@@ -2216,17 +2466,19 @@
               <w:bottom w:val="single" w:sz="4" w:color="B8C2CC"/>
               <w:right w:val="single" w:sz="4" w:color="B8C2CC"/>
             </w:tcBorders>
+            <w:vAlign w:val="center"/>
           </w:tcPr>
           <w:p>
             <w:pPr>
+              <w:spacing w:line="240" w:lineRule="auto"/>
               <w:jc w:val="left"/>
             </w:pPr>
             <w:r>
               <w:rPr>
-                <w:rFonts w:ascii="Microsoft YaHei" w:hAnsi="Microsoft YaHei" w:eastAsia="Microsoft YaHei"/>
+                <w:rFonts w:ascii="Times New Roman" w:hAnsi="Times New Roman" w:eastAsia="Times New Roman"/>
                 <w:b w:val="0"/>
                 <w:color w:val="202124"/>
-                <w:sz w:val="18"/>
+                <w:sz w:val="19"/>
               </w:rPr>
               <w:t>Target height and attached event</w:t>
             </w:r>
@@ -2234,7 +2486,7 @@
         </w:tc>
         <w:tc>
           <w:tcPr>
-            <w:tcW w:type="dxa" w:w="3156"/>
+            <w:tcW w:type="dxa" w:w="3024"/>
             <w:tcMar>
               <w:top w:w="65" w:type="dxa"/>
               <w:start w:w="80" w:type="dxa"/>
@@ -2247,17 +2499,19 @@
               <w:bottom w:val="single" w:sz="4" w:color="B8C2CC"/>
               <w:right w:val="single" w:sz="4" w:color="B8C2CC"/>
             </w:tcBorders>
+            <w:vAlign w:val="center"/>
           </w:tcPr>
           <w:p>
             <w:pPr>
+              <w:spacing w:line="240" w:lineRule="auto"/>
               <w:jc w:val="left"/>
             </w:pPr>
             <w:r>
               <w:rPr>
-                <w:rFonts w:ascii="Microsoft YaHei" w:hAnsi="Microsoft YaHei" w:eastAsia="Microsoft YaHei"/>
+                <w:rFonts w:ascii="Times New Roman" w:hAnsi="Times New Roman" w:eastAsia="Times New Roman"/>
                 <w:b w:val="0"/>
                 <w:color w:val="202124"/>
-                <w:sz w:val="18"/>
+                <w:sz w:val="19"/>
               </w:rPr>
               <w:t>Target rises with the gripper</w:t>
             </w:r>
@@ -2270,7 +2524,7 @@
         </w:trPr>
         <w:tc>
           <w:tcPr>
-            <w:tcW w:type="dxa" w:w="3156"/>
+            <w:tcW w:type="dxa" w:w="1800"/>
             <w:tcMar>
               <w:top w:w="65" w:type="dxa"/>
               <w:start w:w="80" w:type="dxa"/>
@@ -2284,17 +2538,19 @@
               <w:right w:val="single" w:sz="4" w:color="B8C2CC"/>
             </w:tcBorders>
             <w:shd w:fill="F7FAFC"/>
+            <w:vAlign w:val="center"/>
           </w:tcPr>
           <w:p>
             <w:pPr>
+              <w:spacing w:line="240" w:lineRule="auto"/>
               <w:jc w:val="left"/>
             </w:pPr>
             <w:r>
               <w:rPr>
-                <w:rFonts w:ascii="Microsoft YaHei" w:hAnsi="Microsoft YaHei" w:eastAsia="Microsoft YaHei"/>
+                <w:rFonts w:ascii="Times New Roman" w:hAnsi="Times New Roman" w:eastAsia="Times New Roman"/>
                 <w:b w:val="0"/>
                 <w:color w:val="202124"/>
-                <w:sz w:val="18"/>
+                <w:sz w:val="19"/>
               </w:rPr>
               <w:t>Release anomaly</w:t>
             </w:r>
@@ -2302,7 +2558,7 @@
         </w:tc>
         <w:tc>
           <w:tcPr>
-            <w:tcW w:type="dxa" w:w="3156"/>
+            <w:tcW w:type="dxa" w:w="3240"/>
             <w:tcMar>
               <w:top w:w="65" w:type="dxa"/>
               <w:start w:w="80" w:type="dxa"/>
@@ -2316,17 +2572,19 @@
               <w:right w:val="single" w:sz="4" w:color="B8C2CC"/>
             </w:tcBorders>
             <w:shd w:fill="F7FAFC"/>
+            <w:vAlign w:val="center"/>
           </w:tcPr>
           <w:p>
             <w:pPr>
+              <w:spacing w:line="240" w:lineRule="auto"/>
               <w:jc w:val="left"/>
             </w:pPr>
             <w:r>
               <w:rPr>
-                <w:rFonts w:ascii="Microsoft YaHei" w:hAnsi="Microsoft YaHei" w:eastAsia="Microsoft YaHei"/>
+                <w:rFonts w:ascii="Times New Roman" w:hAnsi="Times New Roman" w:eastAsia="Times New Roman"/>
                 <w:b w:val="0"/>
                 <w:color w:val="202124"/>
-                <w:sz w:val="18"/>
+                <w:sz w:val="19"/>
               </w:rPr>
               <w:t>X/Y and Z changes before and after release</w:t>
             </w:r>
@@ -2334,7 +2592,7 @@
         </w:tc>
         <w:tc>
           <w:tcPr>
-            <w:tcW w:type="dxa" w:w="3156"/>
+            <w:tcW w:type="dxa" w:w="3024"/>
             <w:tcMar>
               <w:top w:w="65" w:type="dxa"/>
               <w:start w:w="80" w:type="dxa"/>
@@ -2348,17 +2606,19 @@
               <w:right w:val="single" w:sz="4" w:color="B8C2CC"/>
             </w:tcBorders>
             <w:shd w:fill="F7FAFC"/>
+            <w:vAlign w:val="center"/>
           </w:tcPr>
           <w:p>
             <w:pPr>
+              <w:spacing w:line="240" w:lineRule="auto"/>
               <w:jc w:val="left"/>
             </w:pPr>
             <w:r>
               <w:rPr>
-                <w:rFonts w:ascii="Microsoft YaHei" w:hAnsi="Microsoft YaHei" w:eastAsia="Microsoft YaHei"/>
+                <w:rFonts w:ascii="Times New Roman" w:hAnsi="Times New Roman" w:eastAsia="Times New Roman"/>
                 <w:b w:val="0"/>
                 <w:color w:val="202124"/>
-                <w:sz w:val="18"/>
+                <w:sz w:val="19"/>
               </w:rPr>
               <w:t>Vertical descent and separated destinations</w:t>
             </w:r>
@@ -2371,7 +2631,7 @@
         </w:trPr>
         <w:tc>
           <w:tcPr>
-            <w:tcW w:type="dxa" w:w="3156"/>
+            <w:tcW w:type="dxa" w:w="1800"/>
             <w:tcMar>
               <w:top w:w="65" w:type="dxa"/>
               <w:start w:w="80" w:type="dxa"/>
@@ -2384,17 +2644,19 @@
               <w:bottom w:val="single" w:sz="4" w:color="B8C2CC"/>
               <w:right w:val="single" w:sz="4" w:color="B8C2CC"/>
             </w:tcBorders>
+            <w:vAlign w:val="center"/>
           </w:tcPr>
           <w:p>
             <w:pPr>
+              <w:spacing w:line="240" w:lineRule="auto"/>
               <w:jc w:val="left"/>
             </w:pPr>
             <w:r>
               <w:rPr>
-                <w:rFonts w:ascii="Microsoft YaHei" w:hAnsi="Microsoft YaHei" w:eastAsia="Microsoft YaHei"/>
+                <w:rFonts w:ascii="Times New Roman" w:hAnsi="Times New Roman" w:eastAsia="Times New Roman"/>
                 <w:b w:val="0"/>
                 <w:color w:val="202124"/>
-                <w:sz w:val="18"/>
+                <w:sz w:val="19"/>
               </w:rPr>
               <w:t>Grid error</w:t>
             </w:r>
@@ -2402,7 +2664,7 @@
         </w:tc>
         <w:tc>
           <w:tcPr>
-            <w:tcW w:type="dxa" w:w="3156"/>
+            <w:tcW w:type="dxa" w:w="3240"/>
             <w:tcMar>
               <w:top w:w="65" w:type="dxa"/>
               <w:start w:w="80" w:type="dxa"/>
@@ -2415,17 +2677,19 @@
               <w:bottom w:val="single" w:sz="4" w:color="B8C2CC"/>
               <w:right w:val="single" w:sz="4" w:color="B8C2CC"/>
             </w:tcBorders>
+            <w:vAlign w:val="center"/>
           </w:tcPr>
           <w:p>
             <w:pPr>
+              <w:spacing w:line="240" w:lineRule="auto"/>
               <w:jc w:val="left"/>
             </w:pPr>
             <w:r>
               <w:rPr>
-                <w:rFonts w:ascii="Microsoft YaHei" w:hAnsi="Microsoft YaHei" w:eastAsia="Microsoft YaHei"/>
+                <w:rFonts w:ascii="Times New Roman" w:hAnsi="Times New Roman" w:eastAsia="Times New Roman"/>
                 <w:b w:val="0"/>
                 <w:color w:val="202124"/>
-                <w:sz w:val="18"/>
+                <w:sz w:val="19"/>
               </w:rPr>
               <w:t>Projected pixels and grid_id</w:t>
             </w:r>
@@ -2433,7 +2697,7 @@
         </w:tc>
         <w:tc>
           <w:tcPr>
-            <w:tcW w:type="dxa" w:w="3156"/>
+            <w:tcW w:type="dxa" w:w="3024"/>
             <w:tcMar>
               <w:top w:w="65" w:type="dxa"/>
               <w:start w:w="80" w:type="dxa"/>
@@ -2446,17 +2710,19 @@
               <w:bottom w:val="single" w:sz="4" w:color="B8C2CC"/>
               <w:right w:val="single" w:sz="4" w:color="B8C2CC"/>
             </w:tcBorders>
+            <w:vAlign w:val="center"/>
           </w:tcPr>
           <w:p>
             <w:pPr>
+              <w:spacing w:line="240" w:lineRule="auto"/>
               <w:jc w:val="left"/>
             </w:pPr>
             <w:r>
               <w:rPr>
-                <w:rFonts w:ascii="Microsoft YaHei" w:hAnsi="Microsoft YaHei" w:eastAsia="Microsoft YaHei"/>
+                <w:rFonts w:ascii="Times New Roman" w:hAnsi="Times New Roman" w:eastAsia="Times New Roman"/>
                 <w:b w:val="0"/>
                 <w:color w:val="202124"/>
-                <w:sz w:val="18"/>
+                <w:sz w:val="19"/>
               </w:rPr>
               <w:t>Unique ID for each target</w:t>
             </w:r>
@@ -2469,7 +2735,7 @@
         </w:trPr>
         <w:tc>
           <w:tcPr>
-            <w:tcW w:type="dxa" w:w="3156"/>
+            <w:tcW w:type="dxa" w:w="1800"/>
             <w:tcMar>
               <w:top w:w="65" w:type="dxa"/>
               <w:start w:w="80" w:type="dxa"/>
@@ -2483,17 +2749,19 @@
               <w:right w:val="single" w:sz="4" w:color="B8C2CC"/>
             </w:tcBorders>
             <w:shd w:fill="F7FAFC"/>
+            <w:vAlign w:val="center"/>
           </w:tcPr>
           <w:p>
             <w:pPr>
+              <w:spacing w:line="240" w:lineRule="auto"/>
               <w:jc w:val="left"/>
             </w:pPr>
             <w:r>
               <w:rPr>
-                <w:rFonts w:ascii="Microsoft YaHei" w:hAnsi="Microsoft YaHei" w:eastAsia="Microsoft YaHei"/>
+                <w:rFonts w:ascii="Times New Roman" w:hAnsi="Times New Roman" w:eastAsia="Times New Roman"/>
                 <w:b w:val="0"/>
                 <w:color w:val="202124"/>
-                <w:sz w:val="18"/>
+                <w:sz w:val="19"/>
               </w:rPr>
               <w:t>Runtime conflict</w:t>
             </w:r>
@@ -2501,7 +2769,7 @@
         </w:tc>
         <w:tc>
           <w:tcPr>
-            <w:tcW w:type="dxa" w:w="3156"/>
+            <w:tcW w:type="dxa" w:w="3240"/>
             <w:tcMar>
               <w:top w:w="65" w:type="dxa"/>
               <w:start w:w="80" w:type="dxa"/>
@@ -2515,17 +2783,19 @@
               <w:right w:val="single" w:sz="4" w:color="B8C2CC"/>
             </w:tcBorders>
             <w:shd w:fill="F7FAFC"/>
+            <w:vAlign w:val="center"/>
           </w:tcPr>
           <w:p>
             <w:pPr>
+              <w:spacing w:line="240" w:lineRule="auto"/>
               <w:jc w:val="left"/>
             </w:pPr>
             <w:r>
               <w:rPr>
-                <w:rFonts w:ascii="Microsoft YaHei" w:hAnsi="Microsoft YaHei" w:eastAsia="Microsoft YaHei"/>
+                <w:rFonts w:ascii="Times New Roman" w:hAnsi="Times New Roman" w:eastAsia="Times New Roman"/>
                 <w:b w:val="0"/>
                 <w:color w:val="202124"/>
-                <w:sz w:val="18"/>
+                <w:sz w:val="19"/>
               </w:rPr>
               <w:t>Number of world/controller instances</w:t>
             </w:r>
@@ -2533,7 +2803,7 @@
         </w:tc>
         <w:tc>
           <w:tcPr>
-            <w:tcW w:type="dxa" w:w="3156"/>
+            <w:tcW w:type="dxa" w:w="3024"/>
             <w:tcMar>
               <w:top w:w="65" w:type="dxa"/>
               <w:start w:w="80" w:type="dxa"/>
@@ -2547,17 +2817,19 @@
               <w:right w:val="single" w:sz="4" w:color="B8C2CC"/>
             </w:tcBorders>
             <w:shd w:fill="F7FAFC"/>
+            <w:vAlign w:val="center"/>
           </w:tcPr>
           <w:p>
             <w:pPr>
+              <w:spacing w:line="240" w:lineRule="auto"/>
               <w:jc w:val="left"/>
             </w:pPr>
             <w:r>
               <w:rPr>
-                <w:rFonts w:ascii="Microsoft YaHei" w:hAnsi="Microsoft YaHei" w:eastAsia="Microsoft YaHei"/>
+                <w:rFonts w:ascii="Times New Roman" w:hAnsi="Times New Roman" w:eastAsia="Times New Roman"/>
                 <w:b w:val="0"/>
                 <w:color w:val="202124"/>
-                <w:sz w:val="18"/>
+                <w:sz w:val="19"/>
               </w:rPr>
               <w:t>Single-instance playback</w:t>
             </w:r>
@@ -2570,7 +2842,7 @@
         </w:trPr>
         <w:tc>
           <w:tcPr>
-            <w:tcW w:type="dxa" w:w="3156"/>
+            <w:tcW w:type="dxa" w:w="1800"/>
             <w:tcMar>
               <w:top w:w="65" w:type="dxa"/>
               <w:start w:w="80" w:type="dxa"/>
@@ -2583,17 +2855,19 @@
               <w:bottom w:val="single" w:sz="4" w:color="B8C2CC"/>
               <w:right w:val="single" w:sz="4" w:color="B8C2CC"/>
             </w:tcBorders>
+            <w:vAlign w:val="center"/>
           </w:tcPr>
           <w:p>
             <w:pPr>
+              <w:spacing w:line="240" w:lineRule="auto"/>
               <w:jc w:val="left"/>
             </w:pPr>
             <w:r>
               <w:rPr>
-                <w:rFonts w:ascii="Microsoft YaHei" w:hAnsi="Microsoft YaHei" w:eastAsia="Microsoft YaHei"/>
+                <w:rFonts w:ascii="Times New Roman" w:hAnsi="Times New Roman" w:eastAsia="Times New Roman"/>
                 <w:b w:val="0"/>
                 <w:color w:val="202124"/>
-                <w:sz w:val="18"/>
+                <w:sz w:val="19"/>
               </w:rPr>
               <w:t>Node exit</w:t>
             </w:r>
@@ -2601,7 +2875,7 @@
         </w:tc>
         <w:tc>
           <w:tcPr>
-            <w:tcW w:type="dxa" w:w="3156"/>
+            <w:tcW w:type="dxa" w:w="3240"/>
             <w:tcMar>
               <w:top w:w="65" w:type="dxa"/>
               <w:start w:w="80" w:type="dxa"/>
@@ -2614,17 +2888,19 @@
               <w:bottom w:val="single" w:sz="4" w:color="B8C2CC"/>
               <w:right w:val="single" w:sz="4" w:color="B8C2CC"/>
             </w:tcBorders>
+            <w:vAlign w:val="center"/>
           </w:tcPr>
           <w:p>
             <w:pPr>
+              <w:spacing w:line="240" w:lineRule="auto"/>
               <w:jc w:val="left"/>
             </w:pPr>
             <w:r>
               <w:rPr>
-                <w:rFonts w:ascii="Microsoft YaHei" w:hAnsi="Microsoft YaHei" w:eastAsia="Microsoft YaHei"/>
+                <w:rFonts w:ascii="Times New Roman" w:hAnsi="Times New Roman" w:eastAsia="Times New Roman"/>
                 <w:b w:val="0"/>
                 <w:color w:val="202124"/>
-                <w:sz w:val="18"/>
+                <w:sz w:val="19"/>
               </w:rPr>
               <w:t>Terminal error location</w:t>
             </w:r>
@@ -2632,7 +2908,7 @@
         </w:tc>
         <w:tc>
           <w:tcPr>
-            <w:tcW w:type="dxa" w:w="3156"/>
+            <w:tcW w:type="dxa" w:w="3024"/>
             <w:tcMar>
               <w:top w:w="65" w:type="dxa"/>
               <w:start w:w="80" w:type="dxa"/>
@@ -2645,17 +2921,19 @@
               <w:bottom w:val="single" w:sz="4" w:color="B8C2CC"/>
               <w:right w:val="single" w:sz="4" w:color="B8C2CC"/>
             </w:tcBorders>
+            <w:vAlign w:val="center"/>
           </w:tcPr>
           <w:p>
             <w:pPr>
+              <w:spacing w:line="240" w:lineRule="auto"/>
               <w:jc w:val="left"/>
             </w:pPr>
             <w:r>
               <w:rPr>
-                <w:rFonts w:ascii="Microsoft YaHei" w:hAnsi="Microsoft YaHei" w:eastAsia="Microsoft YaHei"/>
+                <w:rFonts w:ascii="Times New Roman" w:hAnsi="Times New Roman" w:eastAsia="Times New Roman"/>
                 <w:b w:val="0"/>
                 <w:color w:val="202124"/>
-                <w:sz w:val="18"/>
+                <w:sz w:val="19"/>
               </w:rPr>
               <w:t>Node continuously publishes state</w:t>
             </w:r>
@@ -2673,6 +2951,9 @@
         <w:pStyle w:val="Heading1"/>
       </w:pPr>
       <w:r>
+        <w:rPr>
+          <w:rFonts w:ascii="Times New Roman" w:hAnsi="Times New Roman" w:eastAsia="Times New Roman"/>
+        </w:rPr>
         <w:t>5 Simulation Results and Personal Summary</w:t>
       </w:r>
     </w:p>
@@ -2681,13 +2962,16 @@
         <w:pStyle w:val="Heading2"/>
       </w:pPr>
       <w:r>
+        <w:rPr>
+          <w:rFonts w:ascii="Times New Roman" w:hAnsi="Times New Roman" w:eastAsia="Times New Roman"/>
+        </w:rPr>
         <w:t>5.1 Red-Blue Baseline Object-Level Results</w:t>
       </w:r>
     </w:p>
     <w:p>
       <w:r>
         <w:rPr>
-          <w:rFonts w:ascii="Microsoft YaHei" w:hAnsi="Microsoft YaHei" w:eastAsia="Microsoft YaHei"/>
+          <w:rFonts w:ascii="Times New Roman" w:hAnsi="Times New Roman" w:eastAsia="Times New Roman"/>
           <w:b w:val="0"/>
           <w:color w:val="202124"/>
           <w:sz w:val="21"/>
@@ -2717,7 +3001,7 @@
         </w:trPr>
         <w:tc>
           <w:tcPr>
-            <w:tcW w:type="dxa" w:w="1814"/>
+            <w:tcW w:type="dxa" w:w="1584"/>
             <w:shd w:fill="163A5F"/>
             <w:tcMar>
               <w:top w:w="70" w:type="dxa"/>
@@ -2731,17 +3015,15 @@
               <w:bottom w:val="single" w:sz="6" w:color="163A5F"/>
               <w:right w:val="single" w:sz="4" w:color="C9D4DF"/>
             </w:tcBorders>
+            <w:vAlign w:val="center"/>
           </w:tcPr>
           <w:p>
-            <w:pPr>
-              <w:jc w:val="center"/>
-            </w:pPr>
             <w:r>
               <w:rPr>
-                <w:rFonts w:ascii="Microsoft YaHei" w:hAnsi="Microsoft YaHei" w:eastAsia="Microsoft YaHei"/>
+                <w:rFonts w:ascii="Times New Roman" w:hAnsi="Times New Roman" w:eastAsia="Times New Roman"/>
                 <w:b/>
                 <w:color w:val="FFFFFF"/>
-                <w:sz w:val="18"/>
+                <w:sz w:val="19"/>
               </w:rPr>
               <w:t>Class</w:t>
             </w:r>
@@ -2749,7 +3031,7 @@
         </w:tc>
         <w:tc>
           <w:tcPr>
-            <w:tcW w:type="dxa" w:w="1134"/>
+            <w:tcW w:type="dxa" w:w="1296"/>
             <w:shd w:fill="163A5F"/>
             <w:tcMar>
               <w:top w:w="70" w:type="dxa"/>
@@ -2763,25 +3045,23 @@
               <w:bottom w:val="single" w:sz="6" w:color="163A5F"/>
               <w:right w:val="single" w:sz="4" w:color="C9D4DF"/>
             </w:tcBorders>
+            <w:vAlign w:val="center"/>
           </w:tcPr>
           <w:p>
-            <w:pPr>
-              <w:jc w:val="center"/>
-            </w:pPr>
             <w:r>
               <w:rPr>
-                <w:rFonts w:ascii="Microsoft YaHei" w:hAnsi="Microsoft YaHei" w:eastAsia="Microsoft YaHei"/>
+                <w:rFonts w:ascii="Times New Roman" w:hAnsi="Times New Roman" w:eastAsia="Times New Roman"/>
                 <w:b/>
                 <w:color w:val="FFFFFF"/>
-                <w:sz w:val="18"/>
+                <w:sz w:val="19"/>
               </w:rPr>
-              <w:t>Object count</w:t>
+              <w:t>Count</w:t>
             </w:r>
           </w:p>
         </w:tc>
         <w:tc>
           <w:tcPr>
-            <w:tcW w:type="dxa" w:w="1361"/>
+            <w:tcW w:type="dxa" w:w="1584"/>
             <w:shd w:fill="163A5F"/>
             <w:tcMar>
               <w:top w:w="70" w:type="dxa"/>
@@ -2795,25 +3075,23 @@
               <w:bottom w:val="single" w:sz="6" w:color="163A5F"/>
               <w:right w:val="single" w:sz="4" w:color="C9D4DF"/>
             </w:tcBorders>
+            <w:vAlign w:val="center"/>
           </w:tcPr>
           <w:p>
-            <w:pPr>
-              <w:jc w:val="center"/>
-            </w:pPr>
             <w:r>
               <w:rPr>
-                <w:rFonts w:ascii="Microsoft YaHei" w:hAnsi="Microsoft YaHei" w:eastAsia="Microsoft YaHei"/>
+                <w:rFonts w:ascii="Times New Roman" w:hAnsi="Times New Roman" w:eastAsia="Times New Roman"/>
                 <w:b/>
                 <w:color w:val="FFFFFF"/>
-                <w:sz w:val="18"/>
+                <w:sz w:val="19"/>
               </w:rPr>
-              <w:t>Recognition</w:t>
+              <w:t>Conf.</w:t>
             </w:r>
           </w:p>
         </w:tc>
         <w:tc>
           <w:tcPr>
-            <w:tcW w:type="dxa" w:w="1587"/>
+            <w:tcW w:type="dxa" w:w="1296"/>
             <w:shd w:fill="163A5F"/>
             <w:tcMar>
               <w:top w:w="70" w:type="dxa"/>
@@ -2827,17 +3105,15 @@
               <w:bottom w:val="single" w:sz="6" w:color="163A5F"/>
               <w:right w:val="single" w:sz="4" w:color="C9D4DF"/>
             </w:tcBorders>
+            <w:vAlign w:val="center"/>
           </w:tcPr>
           <w:p>
-            <w:pPr>
-              <w:jc w:val="center"/>
-            </w:pPr>
             <w:r>
               <w:rPr>
-                <w:rFonts w:ascii="Microsoft YaHei" w:hAnsi="Microsoft YaHei" w:eastAsia="Microsoft YaHei"/>
+                <w:rFonts w:ascii="Times New Roman" w:hAnsi="Times New Roman" w:eastAsia="Times New Roman"/>
                 <w:b/>
                 <w:color w:val="FFFFFF"/>
-                <w:sz w:val="18"/>
+                <w:sz w:val="19"/>
               </w:rPr>
               <w:t>Grasp</w:t>
             </w:r>
@@ -2845,7 +3121,7 @@
         </w:tc>
         <w:tc>
           <w:tcPr>
-            <w:tcW w:type="dxa" w:w="1587"/>
+            <w:tcW w:type="dxa" w:w="1368"/>
             <w:shd w:fill="163A5F"/>
             <w:tcMar>
               <w:top w:w="70" w:type="dxa"/>
@@ -2859,25 +3135,23 @@
               <w:bottom w:val="single" w:sz="6" w:color="163A5F"/>
               <w:right w:val="single" w:sz="4" w:color="C9D4DF"/>
             </w:tcBorders>
+            <w:vAlign w:val="center"/>
           </w:tcPr>
           <w:p>
-            <w:pPr>
-              <w:jc w:val="center"/>
-            </w:pPr>
             <w:r>
               <w:rPr>
-                <w:rFonts w:ascii="Microsoft YaHei" w:hAnsi="Microsoft YaHei" w:eastAsia="Microsoft YaHei"/>
+                <w:rFonts w:ascii="Times New Roman" w:hAnsi="Times New Roman" w:eastAsia="Times New Roman"/>
                 <w:b/>
                 <w:color w:val="FFFFFF"/>
-                <w:sz w:val="18"/>
+                <w:sz w:val="19"/>
               </w:rPr>
-              <w:t>Placement</w:t>
+              <w:t>Place</w:t>
             </w:r>
           </w:p>
         </w:tc>
         <w:tc>
           <w:tcPr>
-            <w:tcW w:type="dxa" w:w="1587"/>
+            <w:tcW w:type="dxa" w:w="1800"/>
             <w:shd w:fill="163A5F"/>
             <w:tcMar>
               <w:top w:w="70" w:type="dxa"/>
@@ -2891,19 +3165,17 @@
               <w:bottom w:val="single" w:sz="6" w:color="163A5F"/>
               <w:right w:val="single" w:sz="4" w:color="C9D4DF"/>
             </w:tcBorders>
+            <w:vAlign w:val="center"/>
           </w:tcPr>
           <w:p>
-            <w:pPr>
-              <w:jc w:val="center"/>
-            </w:pPr>
             <w:r>
               <w:rPr>
-                <w:rFonts w:ascii="Microsoft YaHei" w:hAnsi="Microsoft YaHei" w:eastAsia="Microsoft YaHei"/>
+                <w:rFonts w:ascii="Times New Roman" w:hAnsi="Times New Roman" w:eastAsia="Times New Roman"/>
                 <w:b/>
                 <w:color w:val="FFFFFF"/>
-                <w:sz w:val="18"/>
+                <w:sz w:val="19"/>
               </w:rPr>
-              <w:t>Conclusion</w:t>
+              <w:t>Result</w:t>
             </w:r>
           </w:p>
         </w:tc>
@@ -2914,7 +3186,7 @@
         </w:trPr>
         <w:tc>
           <w:tcPr>
-            <w:tcW w:type="dxa" w:w="1578"/>
+            <w:tcW w:type="dxa" w:w="1584"/>
             <w:tcMar>
               <w:top w:w="65" w:type="dxa"/>
               <w:start w:w="80" w:type="dxa"/>
@@ -2928,17 +3200,19 @@
               <w:right w:val="single" w:sz="4" w:color="B8C2CC"/>
             </w:tcBorders>
             <w:shd w:fill="F7FAFC"/>
+            <w:vAlign w:val="center"/>
           </w:tcPr>
           <w:p>
             <w:pPr>
+              <w:spacing w:line="240" w:lineRule="auto"/>
               <w:jc w:val="left"/>
             </w:pPr>
             <w:r>
               <w:rPr>
-                <w:rFonts w:ascii="Microsoft YaHei" w:hAnsi="Microsoft YaHei" w:eastAsia="Microsoft YaHei"/>
+                <w:rFonts w:ascii="Times New Roman" w:hAnsi="Times New Roman" w:eastAsia="Times New Roman"/>
                 <w:b w:val="0"/>
                 <w:color w:val="202124"/>
-                <w:sz w:val="18"/>
+                <w:sz w:val="19"/>
               </w:rPr>
               <w:t>Blue cylinder</w:t>
             </w:r>
@@ -2946,7 +3220,7 @@
         </w:tc>
         <w:tc>
           <w:tcPr>
-            <w:tcW w:type="dxa" w:w="1578"/>
+            <w:tcW w:type="dxa" w:w="1296"/>
             <w:tcMar>
               <w:top w:w="65" w:type="dxa"/>
               <w:start w:w="80" w:type="dxa"/>
@@ -2960,17 +3234,19 @@
               <w:right w:val="single" w:sz="4" w:color="B8C2CC"/>
             </w:tcBorders>
             <w:shd w:fill="F7FAFC"/>
+            <w:vAlign w:val="center"/>
           </w:tcPr>
           <w:p>
             <w:pPr>
+              <w:spacing w:line="240" w:lineRule="auto"/>
               <w:jc w:val="left"/>
             </w:pPr>
             <w:r>
               <w:rPr>
-                <w:rFonts w:ascii="Microsoft YaHei" w:hAnsi="Microsoft YaHei" w:eastAsia="Microsoft YaHei"/>
+                <w:rFonts w:ascii="Times New Roman" w:hAnsi="Times New Roman" w:eastAsia="Times New Roman"/>
                 <w:b w:val="0"/>
                 <w:color w:val="202124"/>
-                <w:sz w:val="18"/>
+                <w:sz w:val="19"/>
               </w:rPr>
               <w:t>3</w:t>
             </w:r>
@@ -2978,7 +3254,7 @@
         </w:tc>
         <w:tc>
           <w:tcPr>
-            <w:tcW w:type="dxa" w:w="1578"/>
+            <w:tcW w:type="dxa" w:w="1584"/>
             <w:tcMar>
               <w:top w:w="65" w:type="dxa"/>
               <w:start w:w="80" w:type="dxa"/>
@@ -2992,17 +3268,19 @@
               <w:right w:val="single" w:sz="4" w:color="B8C2CC"/>
             </w:tcBorders>
             <w:shd w:fill="F7FAFC"/>
+            <w:vAlign w:val="center"/>
           </w:tcPr>
           <w:p>
             <w:pPr>
+              <w:spacing w:line="240" w:lineRule="auto"/>
               <w:jc w:val="left"/>
             </w:pPr>
             <w:r>
               <w:rPr>
-                <w:rFonts w:ascii="Microsoft YaHei" w:hAnsi="Microsoft YaHei" w:eastAsia="Microsoft YaHei"/>
+                <w:rFonts w:ascii="Times New Roman" w:hAnsi="Times New Roman" w:eastAsia="Times New Roman"/>
                 <w:b w:val="0"/>
                 <w:color w:val="202124"/>
-                <w:sz w:val="18"/>
+                <w:sz w:val="19"/>
               </w:rPr>
               <w:t>0.99</w:t>
             </w:r>
@@ -3010,7 +3288,7 @@
         </w:tc>
         <w:tc>
           <w:tcPr>
-            <w:tcW w:type="dxa" w:w="1578"/>
+            <w:tcW w:type="dxa" w:w="1296"/>
             <w:tcMar>
               <w:top w:w="65" w:type="dxa"/>
               <w:start w:w="80" w:type="dxa"/>
@@ -3024,17 +3302,19 @@
               <w:right w:val="single" w:sz="4" w:color="B8C2CC"/>
             </w:tcBorders>
             <w:shd w:fill="F7FAFC"/>
+            <w:vAlign w:val="center"/>
           </w:tcPr>
           <w:p>
             <w:pPr>
+              <w:spacing w:line="240" w:lineRule="auto"/>
               <w:jc w:val="left"/>
             </w:pPr>
             <w:r>
               <w:rPr>
-                <w:rFonts w:ascii="Microsoft YaHei" w:hAnsi="Microsoft YaHei" w:eastAsia="Microsoft YaHei"/>
+                <w:rFonts w:ascii="Times New Roman" w:hAnsi="Times New Roman" w:eastAsia="Times New Roman"/>
                 <w:b w:val="0"/>
                 <w:color w:val="202124"/>
-                <w:sz w:val="18"/>
+                <w:sz w:val="19"/>
               </w:rPr>
               <w:t>3/3</w:t>
             </w:r>
@@ -3042,7 +3322,7 @@
         </w:tc>
         <w:tc>
           <w:tcPr>
-            <w:tcW w:type="dxa" w:w="1578"/>
+            <w:tcW w:type="dxa" w:w="1368"/>
             <w:tcMar>
               <w:top w:w="65" w:type="dxa"/>
               <w:start w:w="80" w:type="dxa"/>
@@ -3056,17 +3336,19 @@
               <w:right w:val="single" w:sz="4" w:color="B8C2CC"/>
             </w:tcBorders>
             <w:shd w:fill="F7FAFC"/>
+            <w:vAlign w:val="center"/>
           </w:tcPr>
           <w:p>
             <w:pPr>
+              <w:spacing w:line="240" w:lineRule="auto"/>
               <w:jc w:val="left"/>
             </w:pPr>
             <w:r>
               <w:rPr>
-                <w:rFonts w:ascii="Microsoft YaHei" w:hAnsi="Microsoft YaHei" w:eastAsia="Microsoft YaHei"/>
+                <w:rFonts w:ascii="Times New Roman" w:hAnsi="Times New Roman" w:eastAsia="Times New Roman"/>
                 <w:b w:val="0"/>
                 <w:color w:val="202124"/>
-                <w:sz w:val="18"/>
+                <w:sz w:val="19"/>
               </w:rPr>
               <w:t>3/3</w:t>
             </w:r>
@@ -3074,7 +3356,7 @@
         </w:tc>
         <w:tc>
           <w:tcPr>
-            <w:tcW w:type="dxa" w:w="1578"/>
+            <w:tcW w:type="dxa" w:w="1800"/>
             <w:tcMar>
               <w:top w:w="65" w:type="dxa"/>
               <w:start w:w="80" w:type="dxa"/>
@@ -3088,17 +3370,19 @@
               <w:right w:val="single" w:sz="4" w:color="B8C2CC"/>
             </w:tcBorders>
             <w:shd w:fill="F7FAFC"/>
+            <w:vAlign w:val="center"/>
           </w:tcPr>
           <w:p>
             <w:pPr>
+              <w:spacing w:line="240" w:lineRule="auto"/>
               <w:jc w:val="left"/>
             </w:pPr>
             <w:r>
               <w:rPr>
-                <w:rFonts w:ascii="Microsoft YaHei" w:hAnsi="Microsoft YaHei" w:eastAsia="Microsoft YaHei"/>
+                <w:rFonts w:ascii="Times New Roman" w:hAnsi="Times New Roman" w:eastAsia="Times New Roman"/>
                 <w:b w:val="0"/>
                 <w:color w:val="202124"/>
-                <w:sz w:val="18"/>
+                <w:sz w:val="19"/>
               </w:rPr>
               <w:t>Pass</w:t>
             </w:r>
@@ -3111,7 +3395,7 @@
         </w:trPr>
         <w:tc>
           <w:tcPr>
-            <w:tcW w:type="dxa" w:w="1578"/>
+            <w:tcW w:type="dxa" w:w="1584"/>
             <w:tcMar>
               <w:top w:w="65" w:type="dxa"/>
               <w:start w:w="80" w:type="dxa"/>
@@ -3124,17 +3408,19 @@
               <w:bottom w:val="single" w:sz="4" w:color="B8C2CC"/>
               <w:right w:val="single" w:sz="4" w:color="B8C2CC"/>
             </w:tcBorders>
+            <w:vAlign w:val="center"/>
           </w:tcPr>
           <w:p>
             <w:pPr>
+              <w:spacing w:line="240" w:lineRule="auto"/>
               <w:jc w:val="left"/>
             </w:pPr>
             <w:r>
               <w:rPr>
-                <w:rFonts w:ascii="Microsoft YaHei" w:hAnsi="Microsoft YaHei" w:eastAsia="Microsoft YaHei"/>
+                <w:rFonts w:ascii="Times New Roman" w:hAnsi="Times New Roman" w:eastAsia="Times New Roman"/>
                 <w:b w:val="0"/>
                 <w:color w:val="202124"/>
-                <w:sz w:val="18"/>
+                <w:sz w:val="19"/>
               </w:rPr>
               <w:t>Red cylinder</w:t>
             </w:r>
@@ -3142,7 +3428,7 @@
         </w:tc>
         <w:tc>
           <w:tcPr>
-            <w:tcW w:type="dxa" w:w="1578"/>
+            <w:tcW w:type="dxa" w:w="1296"/>
             <w:tcMar>
               <w:top w:w="65" w:type="dxa"/>
               <w:start w:w="80" w:type="dxa"/>
@@ -3155,17 +3441,19 @@
               <w:bottom w:val="single" w:sz="4" w:color="B8C2CC"/>
               <w:right w:val="single" w:sz="4" w:color="B8C2CC"/>
             </w:tcBorders>
+            <w:vAlign w:val="center"/>
           </w:tcPr>
           <w:p>
             <w:pPr>
+              <w:spacing w:line="240" w:lineRule="auto"/>
               <w:jc w:val="left"/>
             </w:pPr>
             <w:r>
               <w:rPr>
-                <w:rFonts w:ascii="Microsoft YaHei" w:hAnsi="Microsoft YaHei" w:eastAsia="Microsoft YaHei"/>
+                <w:rFonts w:ascii="Times New Roman" w:hAnsi="Times New Roman" w:eastAsia="Times New Roman"/>
                 <w:b w:val="0"/>
                 <w:color w:val="202124"/>
-                <w:sz w:val="18"/>
+                <w:sz w:val="19"/>
               </w:rPr>
               <w:t>3</w:t>
             </w:r>
@@ -3173,7 +3461,7 @@
         </w:tc>
         <w:tc>
           <w:tcPr>
-            <w:tcW w:type="dxa" w:w="1578"/>
+            <w:tcW w:type="dxa" w:w="1584"/>
             <w:tcMar>
               <w:top w:w="65" w:type="dxa"/>
               <w:start w:w="80" w:type="dxa"/>
@@ -3186,17 +3474,19 @@
               <w:bottom w:val="single" w:sz="4" w:color="B8C2CC"/>
               <w:right w:val="single" w:sz="4" w:color="B8C2CC"/>
             </w:tcBorders>
+            <w:vAlign w:val="center"/>
           </w:tcPr>
           <w:p>
             <w:pPr>
+              <w:spacing w:line="240" w:lineRule="auto"/>
               <w:jc w:val="left"/>
             </w:pPr>
             <w:r>
               <w:rPr>
-                <w:rFonts w:ascii="Microsoft YaHei" w:hAnsi="Microsoft YaHei" w:eastAsia="Microsoft YaHei"/>
+                <w:rFonts w:ascii="Times New Roman" w:hAnsi="Times New Roman" w:eastAsia="Times New Roman"/>
                 <w:b w:val="0"/>
                 <w:color w:val="202124"/>
-                <w:sz w:val="18"/>
+                <w:sz w:val="19"/>
               </w:rPr>
               <w:t>0.99</w:t>
             </w:r>
@@ -3204,7 +3494,7 @@
         </w:tc>
         <w:tc>
           <w:tcPr>
-            <w:tcW w:type="dxa" w:w="1578"/>
+            <w:tcW w:type="dxa" w:w="1296"/>
             <w:tcMar>
               <w:top w:w="65" w:type="dxa"/>
               <w:start w:w="80" w:type="dxa"/>
@@ -3217,17 +3507,19 @@
               <w:bottom w:val="single" w:sz="4" w:color="B8C2CC"/>
               <w:right w:val="single" w:sz="4" w:color="B8C2CC"/>
             </w:tcBorders>
+            <w:vAlign w:val="center"/>
           </w:tcPr>
           <w:p>
             <w:pPr>
+              <w:spacing w:line="240" w:lineRule="auto"/>
               <w:jc w:val="left"/>
             </w:pPr>
             <w:r>
               <w:rPr>
-                <w:rFonts w:ascii="Microsoft YaHei" w:hAnsi="Microsoft YaHei" w:eastAsia="Microsoft YaHei"/>
+                <w:rFonts w:ascii="Times New Roman" w:hAnsi="Times New Roman" w:eastAsia="Times New Roman"/>
                 <w:b w:val="0"/>
                 <w:color w:val="202124"/>
-                <w:sz w:val="18"/>
+                <w:sz w:val="19"/>
               </w:rPr>
               <w:t>3/3</w:t>
             </w:r>
@@ -3235,7 +3527,7 @@
         </w:tc>
         <w:tc>
           <w:tcPr>
-            <w:tcW w:type="dxa" w:w="1578"/>
+            <w:tcW w:type="dxa" w:w="1368"/>
             <w:tcMar>
               <w:top w:w="65" w:type="dxa"/>
               <w:start w:w="80" w:type="dxa"/>
@@ -3248,17 +3540,19 @@
               <w:bottom w:val="single" w:sz="4" w:color="B8C2CC"/>
               <w:right w:val="single" w:sz="4" w:color="B8C2CC"/>
             </w:tcBorders>
+            <w:vAlign w:val="center"/>
           </w:tcPr>
           <w:p>
             <w:pPr>
+              <w:spacing w:line="240" w:lineRule="auto"/>
               <w:jc w:val="left"/>
             </w:pPr>
             <w:r>
               <w:rPr>
-                <w:rFonts w:ascii="Microsoft YaHei" w:hAnsi="Microsoft YaHei" w:eastAsia="Microsoft YaHei"/>
+                <w:rFonts w:ascii="Times New Roman" w:hAnsi="Times New Roman" w:eastAsia="Times New Roman"/>
                 <w:b w:val="0"/>
                 <w:color w:val="202124"/>
-                <w:sz w:val="18"/>
+                <w:sz w:val="19"/>
               </w:rPr>
               <w:t>3/3</w:t>
             </w:r>
@@ -3266,7 +3560,7 @@
         </w:tc>
         <w:tc>
           <w:tcPr>
-            <w:tcW w:type="dxa" w:w="1578"/>
+            <w:tcW w:type="dxa" w:w="1800"/>
             <w:tcMar>
               <w:top w:w="65" w:type="dxa"/>
               <w:start w:w="80" w:type="dxa"/>
@@ -3279,17 +3573,19 @@
               <w:bottom w:val="single" w:sz="4" w:color="B8C2CC"/>
               <w:right w:val="single" w:sz="4" w:color="B8C2CC"/>
             </w:tcBorders>
+            <w:vAlign w:val="center"/>
           </w:tcPr>
           <w:p>
             <w:pPr>
+              <w:spacing w:line="240" w:lineRule="auto"/>
               <w:jc w:val="left"/>
             </w:pPr>
             <w:r>
               <w:rPr>
-                <w:rFonts w:ascii="Microsoft YaHei" w:hAnsi="Microsoft YaHei" w:eastAsia="Microsoft YaHei"/>
+                <w:rFonts w:ascii="Times New Roman" w:hAnsi="Times New Roman" w:eastAsia="Times New Roman"/>
                 <w:b w:val="0"/>
                 <w:color w:val="202124"/>
-                <w:sz w:val="18"/>
+                <w:sz w:val="19"/>
               </w:rPr>
               <w:t>Pass</w:t>
             </w:r>
@@ -3302,7 +3598,7 @@
         </w:trPr>
         <w:tc>
           <w:tcPr>
-            <w:tcW w:type="dxa" w:w="1578"/>
+            <w:tcW w:type="dxa" w:w="1584"/>
             <w:tcMar>
               <w:top w:w="65" w:type="dxa"/>
               <w:start w:w="80" w:type="dxa"/>
@@ -3316,17 +3612,19 @@
               <w:right w:val="single" w:sz="4" w:color="B8C2CC"/>
             </w:tcBorders>
             <w:shd w:fill="F7FAFC"/>
+            <w:vAlign w:val="center"/>
           </w:tcPr>
           <w:p>
             <w:pPr>
+              <w:spacing w:line="240" w:lineRule="auto"/>
               <w:jc w:val="left"/>
             </w:pPr>
             <w:r>
               <w:rPr>
-                <w:rFonts w:ascii="Microsoft YaHei" w:hAnsi="Microsoft YaHei" w:eastAsia="Microsoft YaHei"/>
+                <w:rFonts w:ascii="Times New Roman" w:hAnsi="Times New Roman" w:eastAsia="Times New Roman"/>
                 <w:b w:val="0"/>
                 <w:color w:val="202124"/>
-                <w:sz w:val="18"/>
+                <w:sz w:val="19"/>
               </w:rPr>
               <w:t>Total</w:t>
             </w:r>
@@ -3334,7 +3632,7 @@
         </w:tc>
         <w:tc>
           <w:tcPr>
-            <w:tcW w:type="dxa" w:w="1578"/>
+            <w:tcW w:type="dxa" w:w="1296"/>
             <w:tcMar>
               <w:top w:w="65" w:type="dxa"/>
               <w:start w:w="80" w:type="dxa"/>
@@ -3348,17 +3646,19 @@
               <w:right w:val="single" w:sz="4" w:color="B8C2CC"/>
             </w:tcBorders>
             <w:shd w:fill="F7FAFC"/>
+            <w:vAlign w:val="center"/>
           </w:tcPr>
           <w:p>
             <w:pPr>
+              <w:spacing w:line="240" w:lineRule="auto"/>
               <w:jc w:val="left"/>
             </w:pPr>
             <w:r>
               <w:rPr>
-                <w:rFonts w:ascii="Microsoft YaHei" w:hAnsi="Microsoft YaHei" w:eastAsia="Microsoft YaHei"/>
+                <w:rFonts w:ascii="Times New Roman" w:hAnsi="Times New Roman" w:eastAsia="Times New Roman"/>
                 <w:b w:val="0"/>
                 <w:color w:val="202124"/>
-                <w:sz w:val="18"/>
+                <w:sz w:val="19"/>
               </w:rPr>
               <w:t>6</w:t>
             </w:r>
@@ -3366,7 +3666,7 @@
         </w:tc>
         <w:tc>
           <w:tcPr>
-            <w:tcW w:type="dxa" w:w="1578"/>
+            <w:tcW w:type="dxa" w:w="1584"/>
             <w:tcMar>
               <w:top w:w="65" w:type="dxa"/>
               <w:start w:w="80" w:type="dxa"/>
@@ -3380,17 +3680,19 @@
               <w:right w:val="single" w:sz="4" w:color="B8C2CC"/>
             </w:tcBorders>
             <w:shd w:fill="F7FAFC"/>
+            <w:vAlign w:val="center"/>
           </w:tcPr>
           <w:p>
             <w:pPr>
+              <w:spacing w:line="240" w:lineRule="auto"/>
               <w:jc w:val="left"/>
             </w:pPr>
             <w:r>
               <w:rPr>
-                <w:rFonts w:ascii="Microsoft YaHei" w:hAnsi="Microsoft YaHei" w:eastAsia="Microsoft YaHei"/>
+                <w:rFonts w:ascii="Times New Roman" w:hAnsi="Times New Roman" w:eastAsia="Times New Roman"/>
                 <w:b w:val="0"/>
                 <w:color w:val="202124"/>
-                <w:sz w:val="18"/>
+                <w:sz w:val="19"/>
               </w:rPr>
               <w:t>6/6</w:t>
             </w:r>
@@ -3398,7 +3700,7 @@
         </w:tc>
         <w:tc>
           <w:tcPr>
-            <w:tcW w:type="dxa" w:w="1578"/>
+            <w:tcW w:type="dxa" w:w="1296"/>
             <w:tcMar>
               <w:top w:w="65" w:type="dxa"/>
               <w:start w:w="80" w:type="dxa"/>
@@ -3412,17 +3714,19 @@
               <w:right w:val="single" w:sz="4" w:color="B8C2CC"/>
             </w:tcBorders>
             <w:shd w:fill="F7FAFC"/>
+            <w:vAlign w:val="center"/>
           </w:tcPr>
           <w:p>
             <w:pPr>
+              <w:spacing w:line="240" w:lineRule="auto"/>
               <w:jc w:val="left"/>
             </w:pPr>
             <w:r>
               <w:rPr>
-                <w:rFonts w:ascii="Microsoft YaHei" w:hAnsi="Microsoft YaHei" w:eastAsia="Microsoft YaHei"/>
+                <w:rFonts w:ascii="Times New Roman" w:hAnsi="Times New Roman" w:eastAsia="Times New Roman"/>
                 <w:b w:val="0"/>
                 <w:color w:val="202124"/>
-                <w:sz w:val="18"/>
+                <w:sz w:val="19"/>
               </w:rPr>
               <w:t>6/6</w:t>
             </w:r>
@@ -3430,7 +3734,7 @@
         </w:tc>
         <w:tc>
           <w:tcPr>
-            <w:tcW w:type="dxa" w:w="1578"/>
+            <w:tcW w:type="dxa" w:w="1368"/>
             <w:tcMar>
               <w:top w:w="65" w:type="dxa"/>
               <w:start w:w="80" w:type="dxa"/>
@@ -3444,17 +3748,19 @@
               <w:right w:val="single" w:sz="4" w:color="B8C2CC"/>
             </w:tcBorders>
             <w:shd w:fill="F7FAFC"/>
+            <w:vAlign w:val="center"/>
           </w:tcPr>
           <w:p>
             <w:pPr>
+              <w:spacing w:line="240" w:lineRule="auto"/>
               <w:jc w:val="left"/>
             </w:pPr>
             <w:r>
               <w:rPr>
-                <w:rFonts w:ascii="Microsoft YaHei" w:hAnsi="Microsoft YaHei" w:eastAsia="Microsoft YaHei"/>
+                <w:rFonts w:ascii="Times New Roman" w:hAnsi="Times New Roman" w:eastAsia="Times New Roman"/>
                 <w:b w:val="0"/>
                 <w:color w:val="202124"/>
-                <w:sz w:val="18"/>
+                <w:sz w:val="19"/>
               </w:rPr>
               <w:t>6/6</w:t>
             </w:r>
@@ -3462,7 +3768,7 @@
         </w:tc>
         <w:tc>
           <w:tcPr>
-            <w:tcW w:type="dxa" w:w="1578"/>
+            <w:tcW w:type="dxa" w:w="1800"/>
             <w:tcMar>
               <w:top w:w="65" w:type="dxa"/>
               <w:start w:w="80" w:type="dxa"/>
@@ -3476,17 +3782,19 @@
               <w:right w:val="single" w:sz="4" w:color="B8C2CC"/>
             </w:tcBorders>
             <w:shd w:fill="F7FAFC"/>
+            <w:vAlign w:val="center"/>
           </w:tcPr>
           <w:p>
             <w:pPr>
+              <w:spacing w:line="240" w:lineRule="auto"/>
               <w:jc w:val="left"/>
             </w:pPr>
             <w:r>
               <w:rPr>
-                <w:rFonts w:ascii="Microsoft YaHei" w:hAnsi="Microsoft YaHei" w:eastAsia="Microsoft YaHei"/>
+                <w:rFonts w:ascii="Times New Roman" w:hAnsi="Times New Roman" w:eastAsia="Times New Roman"/>
                 <w:b w:val="0"/>
                 <w:color w:val="202124"/>
-                <w:sz w:val="18"/>
+                <w:sz w:val="19"/>
               </w:rPr>
               <w:t>Pass</w:t>
             </w:r>
@@ -3504,13 +3812,16 @@
         <w:pStyle w:val="Heading2"/>
       </w:pPr>
       <w:r>
+        <w:rPr>
+          <w:rFonts w:ascii="Times New Roman" w:hAnsi="Times New Roman" w:eastAsia="Times New Roman"/>
+        </w:rPr>
         <w:t>5.2 Boundary of the Three-Class Extension Results</w:t>
       </w:r>
     </w:p>
     <w:p>
       <w:r>
         <w:rPr>
-          <w:rFonts w:ascii="Microsoft YaHei" w:hAnsi="Microsoft YaHei" w:eastAsia="Microsoft YaHei"/>
+          <w:rFonts w:ascii="Times New Roman" w:hAnsi="Times New Roman" w:eastAsia="Times New Roman"/>
           <w:b w:val="0"/>
           <w:color w:val="202124"/>
           <w:sz w:val="21"/>
@@ -3563,6 +3874,9 @@
         <w:pStyle w:val="CaptionCustom"/>
       </w:pPr>
       <w:r>
+        <w:rPr>
+          <w:rFonts w:ascii="Times New Roman" w:hAnsi="Times New Roman" w:eastAsia="Times New Roman"/>
+        </w:rPr>
         <w:t>Figure 9  Connections among recognition, localization, classification, and execution in the three-class extension</w:t>
       </w:r>
     </w:p>
@@ -3571,13 +3885,16 @@
         <w:pStyle w:val="Heading2"/>
       </w:pPr>
       <w:r>
+        <w:rPr>
+          <w:rFonts w:ascii="Times New Roman" w:hAnsi="Times New Roman" w:eastAsia="Times New Roman"/>
+        </w:rPr>
         <w:t>5.3 Evidence Chain and Debugging Tools</w:t>
       </w:r>
     </w:p>
     <w:p>
       <w:r>
         <w:rPr>
-          <w:rFonts w:ascii="Microsoft YaHei" w:hAnsi="Microsoft YaHei" w:eastAsia="Microsoft YaHei"/>
+          <w:rFonts w:ascii="Times New Roman" w:hAnsi="Times New Roman" w:eastAsia="Times New Roman"/>
           <w:b w:val="0"/>
           <w:color w:val="202124"/>
           <w:sz w:val="21"/>
@@ -3630,6 +3947,9 @@
         <w:pStyle w:val="CaptionCustom"/>
       </w:pPr>
       <w:r>
+        <w:rPr>
+          <w:rFonts w:ascii="Times New Roman" w:hAnsi="Times New Roman" w:eastAsia="Times New Roman"/>
+        </w:rPr>
         <w:t>Figure 10  Evidence chain of the process view, state, events, and CSV that I organized</w:t>
       </w:r>
     </w:p>
@@ -3638,13 +3958,16 @@
         <w:pStyle w:val="Heading2"/>
       </w:pPr>
       <w:r>
+        <w:rPr>
+          <w:rFonts w:ascii="Times New Roman" w:hAnsi="Times New Roman" w:eastAsia="Times New Roman"/>
+        </w:rPr>
         <w:t>5.4 Personal Summary</w:t>
       </w:r>
     </w:p>
     <w:p>
       <w:r>
         <w:rPr>
-          <w:rFonts w:ascii="Microsoft YaHei" w:hAnsi="Microsoft YaHei" w:eastAsia="Microsoft YaHei"/>
+          <w:rFonts w:ascii="Times New Roman" w:hAnsi="Times New Roman" w:eastAsia="Times New Roman"/>
           <w:b w:val="0"/>
           <w:color w:val="202124"/>
           <w:sz w:val="21"/>
@@ -3655,7 +3978,7 @@
     <w:p>
       <w:r>
         <w:rPr>
-          <w:rFonts w:ascii="Microsoft YaHei" w:hAnsi="Microsoft YaHei" w:eastAsia="Microsoft YaHei"/>
+          <w:rFonts w:ascii="Times New Roman" w:hAnsi="Times New Roman" w:eastAsia="Times New Roman"/>
           <w:b w:val="0"/>
           <w:color w:val="202124"/>
           <w:sz w:val="21"/>
@@ -3671,7 +3994,7 @@
       </w:pPr>
       <w:r>
         <w:rPr>
-          <w:rFonts w:ascii="Microsoft YaHei" w:hAnsi="Microsoft YaHei" w:eastAsia="Microsoft YaHei"/>
+          <w:rFonts w:ascii="Times New Roman" w:hAnsi="Times New Roman" w:eastAsia="Times New Roman"/>
           <w:b w:val="0"/>
           <w:color w:val="202124"/>
           <w:sz w:val="20"/>
@@ -3687,7 +4010,7 @@
       </w:pPr>
       <w:r>
         <w:rPr>
-          <w:rFonts w:ascii="Microsoft YaHei" w:hAnsi="Microsoft YaHei" w:eastAsia="Microsoft YaHei"/>
+          <w:rFonts w:ascii="Times New Roman" w:hAnsi="Times New Roman" w:eastAsia="Times New Roman"/>
           <w:b w:val="0"/>
           <w:color w:val="202124"/>
           <w:sz w:val="20"/>
@@ -3703,7 +4026,7 @@
       </w:pPr>
       <w:r>
         <w:rPr>
-          <w:rFonts w:ascii="Microsoft YaHei" w:hAnsi="Microsoft YaHei" w:eastAsia="Microsoft YaHei"/>
+          <w:rFonts w:ascii="Times New Roman" w:hAnsi="Times New Roman" w:eastAsia="Times New Roman"/>
           <w:b w:val="0"/>
           <w:color w:val="202124"/>
           <w:sz w:val="20"/>
@@ -3719,7 +4042,7 @@
       </w:pPr>
       <w:r>
         <w:rPr>
-          <w:rFonts w:ascii="Microsoft YaHei" w:hAnsi="Microsoft YaHei" w:eastAsia="Microsoft YaHei"/>
+          <w:rFonts w:ascii="Times New Roman" w:hAnsi="Times New Roman" w:eastAsia="Times New Roman"/>
           <w:b w:val="0"/>
           <w:color w:val="202124"/>
           <w:sz w:val="20"/>
@@ -3735,7 +4058,7 @@
       </w:pPr>
       <w:r>
         <w:rPr>
-          <w:rFonts w:ascii="Microsoft YaHei" w:hAnsi="Microsoft YaHei" w:eastAsia="Microsoft YaHei"/>
+          <w:rFonts w:ascii="Times New Roman" w:hAnsi="Times New Roman" w:eastAsia="Times New Roman"/>
           <w:b w:val="0"/>
           <w:color w:val="202124"/>
           <w:sz w:val="20"/>
@@ -3746,7 +4069,7 @@
     <w:p>
       <w:r>
         <w:rPr>
-          <w:rFonts w:ascii="Microsoft YaHei" w:hAnsi="Microsoft YaHei" w:eastAsia="Microsoft YaHei"/>
+          <w:rFonts w:ascii="Times New Roman" w:hAnsi="Times New Roman" w:eastAsia="Times New Roman"/>
           <w:b w:val="0"/>
           <w:color w:val="202124"/>
           <w:sz w:val="21"/>
@@ -3757,7 +4080,7 @@
     <w:p>
       <w:r>
         <w:rPr>
-          <w:rFonts w:ascii="Microsoft YaHei" w:hAnsi="Microsoft YaHei" w:eastAsia="Microsoft YaHei"/>
+          <w:rFonts w:ascii="Times New Roman" w:hAnsi="Times New Roman" w:eastAsia="Times New Roman"/>
           <w:b w:val="0"/>
           <w:color w:val="202124"/>
           <w:sz w:val="21"/>
@@ -3770,13 +4093,16 @@
         <w:pStyle w:val="Heading1"/>
       </w:pPr>
       <w:r>
+        <w:rPr>
+          <w:rFonts w:ascii="Times New Roman" w:hAnsi="Times New Roman" w:eastAsia="Times New Roman"/>
+        </w:rPr>
         <w:t>6 Conclusion</w:t>
       </w:r>
     </w:p>
     <w:p>
       <w:r>
         <w:rPr>
-          <w:rFonts w:ascii="Microsoft YaHei" w:hAnsi="Microsoft YaHei" w:eastAsia="Microsoft YaHei"/>
+          <w:rFonts w:ascii="Times New Roman" w:hAnsi="Times New Roman" w:eastAsia="Times New Roman"/>
           <w:b w:val="0"/>
           <w:color w:val="202124"/>
           <w:sz w:val="21"/>
@@ -3789,6 +4115,9 @@
         <w:pStyle w:val="Heading2"/>
       </w:pPr>
       <w:r>
+        <w:rPr>
+          <w:rFonts w:ascii="Times New Roman" w:hAnsi="Times New Roman" w:eastAsia="Times New Roman"/>
+        </w:rPr>
         <w:t>6.1 Personal Work Completion</w:t>
       </w:r>
     </w:p>
@@ -3811,7 +4140,7 @@
         </w:trPr>
         <w:tc>
           <w:tcPr>
-            <w:tcW w:type="dxa" w:w="1701"/>
+            <w:tcW w:type="dxa" w:w="1872"/>
             <w:shd w:fill="163A5F"/>
             <w:tcMar>
               <w:top w:w="70" w:type="dxa"/>
@@ -3825,17 +4154,19 @@
               <w:bottom w:val="single" w:sz="6" w:color="163A5F"/>
               <w:right w:val="single" w:sz="4" w:color="C9D4DF"/>
             </w:tcBorders>
+            <w:vAlign w:val="center"/>
           </w:tcPr>
           <w:p>
             <w:pPr>
+              <w:spacing w:line="240" w:lineRule="auto"/>
               <w:jc w:val="center"/>
             </w:pPr>
             <w:r>
               <w:rPr>
-                <w:rFonts w:ascii="Microsoft YaHei" w:hAnsi="Microsoft YaHei" w:eastAsia="Microsoft YaHei"/>
+                <w:rFonts w:ascii="Times New Roman" w:hAnsi="Times New Roman" w:eastAsia="Times New Roman"/>
                 <w:b/>
                 <w:color w:val="FFFFFF"/>
-                <w:sz w:val="18"/>
+                <w:sz w:val="19"/>
               </w:rPr>
               <w:t>Work module</w:t>
             </w:r>
@@ -3843,7 +4174,7 @@
         </w:tc>
         <w:tc>
           <w:tcPr>
-            <w:tcW w:type="dxa" w:w="5102"/>
+            <w:tcW w:type="dxa" w:w="4824"/>
             <w:shd w:fill="163A5F"/>
             <w:tcMar>
               <w:top w:w="70" w:type="dxa"/>
@@ -3857,17 +4188,19 @@
               <w:bottom w:val="single" w:sz="6" w:color="163A5F"/>
               <w:right w:val="single" w:sz="4" w:color="C9D4DF"/>
             </w:tcBorders>
+            <w:vAlign w:val="center"/>
           </w:tcPr>
           <w:p>
             <w:pPr>
+              <w:spacing w:line="240" w:lineRule="auto"/>
               <w:jc w:val="center"/>
             </w:pPr>
             <w:r>
               <w:rPr>
-                <w:rFonts w:ascii="Microsoft YaHei" w:hAnsi="Microsoft YaHei" w:eastAsia="Microsoft YaHei"/>
+                <w:rFonts w:ascii="Times New Roman" w:hAnsi="Times New Roman" w:eastAsia="Times New Roman"/>
                 <w:b/>
                 <w:color w:val="FFFFFF"/>
-                <w:sz w:val="18"/>
+                <w:sz w:val="19"/>
               </w:rPr>
               <w:t>Completed content</w:t>
             </w:r>
@@ -3875,7 +4208,7 @@
         </w:tc>
         <w:tc>
           <w:tcPr>
-            <w:tcW w:type="dxa" w:w="2268"/>
+            <w:tcW w:type="dxa" w:w="2736"/>
             <w:shd w:fill="163A5F"/>
             <w:tcMar>
               <w:top w:w="70" w:type="dxa"/>
@@ -3889,17 +4222,19 @@
               <w:bottom w:val="single" w:sz="6" w:color="163A5F"/>
               <w:right w:val="single" w:sz="4" w:color="C9D4DF"/>
             </w:tcBorders>
+            <w:vAlign w:val="center"/>
           </w:tcPr>
           <w:p>
             <w:pPr>
+              <w:spacing w:line="240" w:lineRule="auto"/>
               <w:jc w:val="center"/>
             </w:pPr>
             <w:r>
               <w:rPr>
-                <w:rFonts w:ascii="Microsoft YaHei" w:hAnsi="Microsoft YaHei" w:eastAsia="Microsoft YaHei"/>
+                <w:rFonts w:ascii="Times New Roman" w:hAnsi="Times New Roman" w:eastAsia="Times New Roman"/>
                 <w:b/>
                 <w:color w:val="FFFFFF"/>
-                <w:sz w:val="18"/>
+                <w:sz w:val="19"/>
               </w:rPr>
               <w:t>Corresponding result</w:t>
             </w:r>
@@ -3912,7 +4247,7 @@
         </w:trPr>
         <w:tc>
           <w:tcPr>
-            <w:tcW w:type="dxa" w:w="3156"/>
+            <w:tcW w:type="dxa" w:w="1872"/>
             <w:tcMar>
               <w:top w:w="65" w:type="dxa"/>
               <w:start w:w="80" w:type="dxa"/>
@@ -3926,17 +4261,19 @@
               <w:right w:val="single" w:sz="4" w:color="B8C2CC"/>
             </w:tcBorders>
             <w:shd w:fill="F7FAFC"/>
+            <w:vAlign w:val="center"/>
           </w:tcPr>
           <w:p>
             <w:pPr>
+              <w:spacing w:line="240" w:lineRule="auto"/>
               <w:jc w:val="left"/>
             </w:pPr>
             <w:r>
               <w:rPr>
-                <w:rFonts w:ascii="Microsoft YaHei" w:hAnsi="Microsoft YaHei" w:eastAsia="Microsoft YaHei"/>
+                <w:rFonts w:ascii="Times New Roman" w:hAnsi="Times New Roman" w:eastAsia="Times New Roman"/>
                 <w:b w:val="0"/>
                 <w:color w:val="202124"/>
-                <w:sz w:val="18"/>
+                <w:sz w:val="19"/>
               </w:rPr>
               <w:t>Scene and startup</w:t>
             </w:r>
@@ -3944,7 +4281,7 @@
         </w:tc>
         <w:tc>
           <w:tcPr>
-            <w:tcW w:type="dxa" w:w="3156"/>
+            <w:tcW w:type="dxa" w:w="4824"/>
             <w:tcMar>
               <w:top w:w="65" w:type="dxa"/>
               <w:start w:w="80" w:type="dxa"/>
@@ -3958,17 +4295,19 @@
               <w:right w:val="single" w:sz="4" w:color="B8C2CC"/>
             </w:tcBorders>
             <w:shd w:fill="F7FAFC"/>
+            <w:vAlign w:val="center"/>
           </w:tcPr>
           <w:p>
             <w:pPr>
+              <w:spacing w:line="240" w:lineRule="auto"/>
               <w:jc w:val="left"/>
             </w:pPr>
             <w:r>
               <w:rPr>
-                <w:rFonts w:ascii="Microsoft YaHei" w:hAnsi="Microsoft YaHei" w:eastAsia="Microsoft YaHei"/>
+                <w:rFonts w:ascii="Times New Roman" w:hAnsi="Times New Roman" w:eastAsia="Times New Roman"/>
                 <w:b w:val="0"/>
                 <w:color w:val="202124"/>
-                <w:sz w:val="18"/>
+                <w:sz w:val="19"/>
               </w:rPr>
               <w:t>Adjusted the six-cell tabletop, red-blue-green cylinders, and three sorting pads; checked startup relationships among the world, controller, camera, and player</w:t>
             </w:r>
@@ -3976,7 +4315,7 @@
         </w:tc>
         <w:tc>
           <w:tcPr>
-            <w:tcW w:type="dxa" w:w="3156"/>
+            <w:tcW w:type="dxa" w:w="2736"/>
             <w:tcMar>
               <w:top w:w="65" w:type="dxa"/>
               <w:start w:w="80" w:type="dxa"/>
@@ -3990,17 +4329,19 @@
               <w:right w:val="single" w:sz="4" w:color="B8C2CC"/>
             </w:tcBorders>
             <w:shd w:fill="F7FAFC"/>
+            <w:vAlign w:val="center"/>
           </w:tcPr>
           <w:p>
             <w:pPr>
+              <w:spacing w:line="240" w:lineRule="auto"/>
               <w:jc w:val="left"/>
             </w:pPr>
             <w:r>
               <w:rPr>
-                <w:rFonts w:ascii="Microsoft YaHei" w:hAnsi="Microsoft YaHei" w:eastAsia="Microsoft YaHei"/>
+                <w:rFonts w:ascii="Times New Roman" w:hAnsi="Times New Roman" w:eastAsia="Times New Roman"/>
                 <w:b w:val="0"/>
                 <w:color w:val="202124"/>
-                <w:sz w:val="18"/>
+                <w:sz w:val="19"/>
               </w:rPr>
               <w:t>Three-class scene loads stably and runs with one instance</w:t>
             </w:r>
@@ -4013,7 +4354,7 @@
         </w:trPr>
         <w:tc>
           <w:tcPr>
-            <w:tcW w:type="dxa" w:w="3156"/>
+            <w:tcW w:type="dxa" w:w="1872"/>
             <w:tcMar>
               <w:top w:w="65" w:type="dxa"/>
               <w:start w:w="80" w:type="dxa"/>
@@ -4026,17 +4367,19 @@
               <w:bottom w:val="single" w:sz="4" w:color="B8C2CC"/>
               <w:right w:val="single" w:sz="4" w:color="B8C2CC"/>
             </w:tcBorders>
+            <w:vAlign w:val="center"/>
           </w:tcPr>
           <w:p>
             <w:pPr>
+              <w:spacing w:line="240" w:lineRule="auto"/>
               <w:jc w:val="left"/>
             </w:pPr>
             <w:r>
               <w:rPr>
-                <w:rFonts w:ascii="Microsoft YaHei" w:hAnsi="Microsoft YaHei" w:eastAsia="Microsoft YaHei"/>
+                <w:rFonts w:ascii="Times New Roman" w:hAnsi="Times New Roman" w:eastAsia="Times New Roman"/>
                 <w:b w:val="0"/>
                 <w:color w:val="202124"/>
-                <w:sz w:val="18"/>
+                <w:sz w:val="19"/>
               </w:rPr>
               <w:t>Waypoints and motion</w:t>
             </w:r>
@@ -4044,7 +4387,7 @@
         </w:tc>
         <w:tc>
           <w:tcPr>
-            <w:tcW w:type="dxa" w:w="3156"/>
+            <w:tcW w:type="dxa" w:w="4824"/>
             <w:tcMar>
               <w:top w:w="65" w:type="dxa"/>
               <w:start w:w="80" w:type="dxa"/>
@@ -4057,17 +4400,19 @@
               <w:bottom w:val="single" w:sz="4" w:color="B8C2CC"/>
               <w:right w:val="single" w:sz="4" w:color="B8C2CC"/>
             </w:tcBorders>
+            <w:vAlign w:val="center"/>
           </w:tcPr>
           <w:p>
             <w:pPr>
+              <w:spacing w:line="240" w:lineRule="auto"/>
               <w:jc w:val="left"/>
             </w:pPr>
             <w:r>
               <w:rPr>
-                <w:rFonts w:ascii="Microsoft YaHei" w:hAnsi="Microsoft YaHei" w:eastAsia="Microsoft YaHei"/>
+                <w:rFonts w:ascii="Times New Roman" w:hAnsi="Times New Roman" w:eastAsia="Times New Roman"/>
                 <w:b w:val="0"/>
                 <w:color w:val="202124"/>
-                <w:sz w:val="18"/>
+                <w:sz w:val="19"/>
               </w:rPr>
               <w:t>Established semantic waypoints such as above, pick, lift, and release, and organized the six-target subsequences with a unified action timing</w:t>
             </w:r>
@@ -4075,7 +4420,7 @@
         </w:tc>
         <w:tc>
           <w:tcPr>
-            <w:tcW w:type="dxa" w:w="3156"/>
+            <w:tcW w:type="dxa" w:w="2736"/>
             <w:tcMar>
               <w:top w:w="65" w:type="dxa"/>
               <w:start w:w="80" w:type="dxa"/>
@@ -4088,17 +4433,19 @@
               <w:bottom w:val="single" w:sz="4" w:color="B8C2CC"/>
               <w:right w:val="single" w:sz="4" w:color="B8C2CC"/>
             </w:tcBorders>
+            <w:vAlign w:val="center"/>
           </w:tcPr>
           <w:p>
             <w:pPr>
+              <w:spacing w:line="240" w:lineRule="auto"/>
               <w:jc w:val="left"/>
             </w:pPr>
             <w:r>
               <w:rPr>
-                <w:rFonts w:ascii="Microsoft YaHei" w:hAnsi="Microsoft YaHei" w:eastAsia="Microsoft YaHei"/>
+                <w:rFonts w:ascii="Times New Roman" w:hAnsi="Times New Roman" w:eastAsia="Times New Roman"/>
                 <w:b w:val="0"/>
                 <w:color w:val="202124"/>
-                <w:sz w:val="18"/>
+                <w:sz w:val="19"/>
               </w:rPr>
               <w:t>manual_animation.json stores 27 waypoints and automatic playback has 34 steps</w:t>
             </w:r>
@@ -4111,7 +4458,7 @@
         </w:trPr>
         <w:tc>
           <w:tcPr>
-            <w:tcW w:type="dxa" w:w="3156"/>
+            <w:tcW w:type="dxa" w:w="1872"/>
             <w:tcMar>
               <w:top w:w="65" w:type="dxa"/>
               <w:start w:w="80" w:type="dxa"/>
@@ -4125,17 +4472,19 @@
               <w:right w:val="single" w:sz="4" w:color="B8C2CC"/>
             </w:tcBorders>
             <w:shd w:fill="F7FAFC"/>
+            <w:vAlign w:val="center"/>
           </w:tcPr>
           <w:p>
             <w:pPr>
+              <w:spacing w:line="240" w:lineRule="auto"/>
               <w:jc w:val="left"/>
             </w:pPr>
             <w:r>
               <w:rPr>
-                <w:rFonts w:ascii="Microsoft YaHei" w:hAnsi="Microsoft YaHei" w:eastAsia="Microsoft YaHei"/>
+                <w:rFonts w:ascii="Times New Roman" w:hAnsi="Times New Roman" w:eastAsia="Times New Roman"/>
                 <w:b w:val="0"/>
                 <w:color w:val="202124"/>
-                <w:sz w:val="18"/>
+                <w:sz w:val="19"/>
               </w:rPr>
               <w:t>Grasp and release</w:t>
             </w:r>
@@ -4143,7 +4492,7 @@
         </w:tc>
         <w:tc>
           <w:tcPr>
-            <w:tcW w:type="dxa" w:w="3156"/>
+            <w:tcW w:type="dxa" w:w="4824"/>
             <w:tcMar>
               <w:top w:w="65" w:type="dxa"/>
               <w:start w:w="80" w:type="dxa"/>
@@ -4157,17 +4506,19 @@
               <w:right w:val="single" w:sz="4" w:color="B8C2CC"/>
             </w:tcBorders>
             <w:shd w:fill="F7FAFC"/>
+            <w:vAlign w:val="center"/>
           </w:tcPr>
           <w:p>
             <w:pPr>
+              <w:spacing w:line="240" w:lineRule="auto"/>
               <w:jc w:val="left"/>
             </w:pPr>
             <w:r>
               <w:rPr>
-                <w:rFonts w:ascii="Microsoft YaHei" w:hAnsi="Microsoft YaHei" w:eastAsia="Microsoft YaHei"/>
+                <w:rFonts w:ascii="Times New Roman" w:hAnsi="Times New Roman" w:eastAsia="Times New Roman"/>
                 <w:b w:val="0"/>
                 <w:color w:val="202124"/>
-                <w:sz w:val="18"/>
+                <w:sz w:val="19"/>
               </w:rPr>
               <w:t>Calibrated the end-effector reference point and added distance checking, target following, vertical release, and separate destinations for same-color targets</w:t>
             </w:r>
@@ -4175,7 +4526,7 @@
         </w:tc>
         <w:tc>
           <w:tcPr>
-            <w:tcW w:type="dxa" w:w="3156"/>
+            <w:tcW w:type="dxa" w:w="2736"/>
             <w:tcMar>
               <w:top w:w="65" w:type="dxa"/>
               <w:start w:w="80" w:type="dxa"/>
@@ -4189,17 +4540,19 @@
               <w:right w:val="single" w:sz="4" w:color="B8C2CC"/>
             </w:tcBorders>
             <w:shd w:fill="F7FAFC"/>
+            <w:vAlign w:val="center"/>
           </w:tcPr>
           <w:p>
             <w:pPr>
+              <w:spacing w:line="240" w:lineRule="auto"/>
               <w:jc w:val="left"/>
             </w:pPr>
             <w:r>
               <w:rPr>
-                <w:rFonts w:ascii="Microsoft YaHei" w:hAnsi="Microsoft YaHei" w:eastAsia="Microsoft YaHei"/>
+                <w:rFonts w:ascii="Times New Roman" w:hAnsi="Times New Roman" w:eastAsia="Times New Roman"/>
                 <w:b w:val="0"/>
                 <w:color w:val="202124"/>
-                <w:sz w:val="18"/>
+                <w:sz w:val="19"/>
               </w:rPr>
               <w:t>Targets leave the table, follow the arm during transport, and land in the corresponding sorting pads</w:t>
             </w:r>
@@ -4212,7 +4565,7 @@
         </w:trPr>
         <w:tc>
           <w:tcPr>
-            <w:tcW w:type="dxa" w:w="3156"/>
+            <w:tcW w:type="dxa" w:w="1872"/>
             <w:tcMar>
               <w:top w:w="65" w:type="dxa"/>
               <w:start w:w="80" w:type="dxa"/>
@@ -4225,17 +4578,19 @@
               <w:bottom w:val="single" w:sz="4" w:color="B8C2CC"/>
               <w:right w:val="single" w:sz="4" w:color="B8C2CC"/>
             </w:tcBorders>
+            <w:vAlign w:val="center"/>
           </w:tcPr>
           <w:p>
             <w:pPr>
+              <w:spacing w:line="240" w:lineRule="auto"/>
               <w:jc w:val="left"/>
             </w:pPr>
             <w:r>
               <w:rPr>
-                <w:rFonts w:ascii="Microsoft YaHei" w:hAnsi="Microsoft YaHei" w:eastAsia="Microsoft YaHei"/>
+                <w:rFonts w:ascii="Times New Roman" w:hAnsi="Times New Roman" w:eastAsia="Times New Roman"/>
                 <w:b w:val="0"/>
                 <w:color w:val="202124"/>
-                <w:sz w:val="18"/>
+                <w:sz w:val="19"/>
               </w:rPr>
               <w:t>Problem repair</w:t>
             </w:r>
@@ -4243,7 +4598,7 @@
         </w:tc>
         <w:tc>
           <w:tcPr>
-            <w:tcW w:type="dxa" w:w="3156"/>
+            <w:tcW w:type="dxa" w:w="4824"/>
             <w:tcMar>
               <w:top w:w="65" w:type="dxa"/>
               <w:start w:w="80" w:type="dxa"/>
@@ -4256,17 +4611,19 @@
               <w:bottom w:val="single" w:sz="4" w:color="B8C2CC"/>
               <w:right w:val="single" w:sz="4" w:color="B8C2CC"/>
             </w:tcBorders>
+            <w:vAlign w:val="center"/>
           </w:tcPr>
           <w:p>
             <w:pPr>
+              <w:spacing w:line="240" w:lineRule="auto"/>
               <w:jc w:val="left"/>
             </w:pPr>
             <w:r>
               <w:rPr>
-                <w:rFonts w:ascii="Microsoft YaHei" w:hAnsi="Microsoft YaHei" w:eastAsia="Microsoft YaHei"/>
+                <w:rFonts w:ascii="Times New Roman" w:hAnsi="Times New Roman" w:eastAsia="Times New Roman"/>
                 <w:b w:val="0"/>
                 <w:color w:val="202124"/>
-                <w:sz w:val="18"/>
+                <w:sz w:val="19"/>
               </w:rPr>
               <w:t>Handled pose offset, grid desynchronization, repeated startup, node log errors, and release jumps</w:t>
             </w:r>
@@ -4274,7 +4631,7 @@
         </w:tc>
         <w:tc>
           <w:tcPr>
-            <w:tcW w:type="dxa" w:w="3156"/>
+            <w:tcW w:type="dxa" w:w="2736"/>
             <w:tcMar>
               <w:top w:w="65" w:type="dxa"/>
               <w:start w:w="80" w:type="dxa"/>
@@ -4287,17 +4644,19 @@
               <w:bottom w:val="single" w:sz="4" w:color="B8C2CC"/>
               <w:right w:val="single" w:sz="4" w:color="B8C2CC"/>
             </w:tcBorders>
+            <w:vAlign w:val="center"/>
           </w:tcPr>
           <w:p>
             <w:pPr>
+              <w:spacing w:line="240" w:lineRule="auto"/>
               <w:jc w:val="left"/>
             </w:pPr>
             <w:r>
               <w:rPr>
-                <w:rFonts w:ascii="Microsoft YaHei" w:hAnsi="Microsoft YaHei" w:eastAsia="Microsoft YaHei"/>
+                <w:rFonts w:ascii="Times New Roman" w:hAnsi="Times New Roman" w:eastAsia="Times New Roman"/>
                 <w:b w:val="0"/>
                 <w:color w:val="202124"/>
-                <w:sz w:val="18"/>
+                <w:sz w:val="19"/>
               </w:rPr>
               <w:t>Single-target and full-sequence reruns passed</w:t>
             </w:r>
@@ -4310,7 +4669,7 @@
         </w:trPr>
         <w:tc>
           <w:tcPr>
-            <w:tcW w:type="dxa" w:w="3156"/>
+            <w:tcW w:type="dxa" w:w="1872"/>
             <w:tcMar>
               <w:top w:w="65" w:type="dxa"/>
               <w:start w:w="80" w:type="dxa"/>
@@ -4324,17 +4683,19 @@
               <w:right w:val="single" w:sz="4" w:color="B8C2CC"/>
             </w:tcBorders>
             <w:shd w:fill="F7FAFC"/>
+            <w:vAlign w:val="center"/>
           </w:tcPr>
           <w:p>
             <w:pPr>
+              <w:spacing w:line="240" w:lineRule="auto"/>
               <w:jc w:val="left"/>
             </w:pPr>
             <w:r>
               <w:rPr>
-                <w:rFonts w:ascii="Microsoft YaHei" w:hAnsi="Microsoft YaHei" w:eastAsia="Microsoft YaHei"/>
+                <w:rFonts w:ascii="Times New Roman" w:hAnsi="Times New Roman" w:eastAsia="Times New Roman"/>
                 <w:b w:val="0"/>
                 <w:color w:val="202124"/>
-                <w:sz w:val="18"/>
+                <w:sz w:val="19"/>
               </w:rPr>
               <w:t>Result review</w:t>
             </w:r>
@@ -4342,7 +4703,7 @@
         </w:tc>
         <w:tc>
           <w:tcPr>
-            <w:tcW w:type="dxa" w:w="3156"/>
+            <w:tcW w:type="dxa" w:w="4824"/>
             <w:tcMar>
               <w:top w:w="65" w:type="dxa"/>
               <w:start w:w="80" w:type="dxa"/>
@@ -4356,17 +4717,19 @@
               <w:right w:val="single" w:sz="4" w:color="B8C2CC"/>
             </w:tcBorders>
             <w:shd w:fill="F7FAFC"/>
+            <w:vAlign w:val="center"/>
           </w:tcPr>
           <w:p>
             <w:pPr>
+              <w:spacing w:line="240" w:lineRule="auto"/>
               <w:jc w:val="left"/>
             </w:pPr>
             <w:r>
               <w:rPr>
-                <w:rFonts w:ascii="Microsoft YaHei" w:hAnsi="Microsoft YaHei" w:eastAsia="Microsoft YaHei"/>
+                <w:rFonts w:ascii="Times New Roman" w:hAnsi="Times New Roman" w:eastAsia="Times New Roman"/>
                 <w:b w:val="0"/>
                 <w:color w:val="202124"/>
-                <w:sz w:val="18"/>
+                <w:sz w:val="19"/>
               </w:rPr>
               <w:t>Cross-checked GUI, state, events, final poses, and object-level CSV</w:t>
             </w:r>
@@ -4374,7 +4737,7 @@
         </w:tc>
         <w:tc>
           <w:tcPr>
-            <w:tcW w:type="dxa" w:w="3156"/>
+            <w:tcW w:type="dxa" w:w="2736"/>
             <w:tcMar>
               <w:top w:w="65" w:type="dxa"/>
               <w:start w:w="80" w:type="dxa"/>
@@ -4388,17 +4751,19 @@
               <w:right w:val="single" w:sz="4" w:color="B8C2CC"/>
             </w:tcBorders>
             <w:shd w:fill="F7FAFC"/>
+            <w:vAlign w:val="center"/>
           </w:tcPr>
           <w:p>
             <w:pPr>
+              <w:spacing w:line="240" w:lineRule="auto"/>
               <w:jc w:val="left"/>
             </w:pPr>
             <w:r>
               <w:rPr>
-                <w:rFonts w:ascii="Microsoft YaHei" w:hAnsi="Microsoft YaHei" w:eastAsia="Microsoft YaHei"/>
+                <w:rFonts w:ascii="Times New Roman" w:hAnsi="Times New Roman" w:eastAsia="Times New Roman"/>
                 <w:b w:val="0"/>
                 <w:color w:val="202124"/>
-                <w:sz w:val="18"/>
+                <w:sz w:val="19"/>
               </w:rPr>
               <w:t>Red-blue baseline object-level result is 6/6</w:t>
             </w:r>
@@ -4416,13 +4781,16 @@
         <w:pStyle w:val="Heading2"/>
       </w:pPr>
       <w:r>
+        <w:rPr>
+          <w:rFonts w:ascii="Times New Roman" w:hAnsi="Times New Roman" w:eastAsia="Times New Roman"/>
+        </w:rPr>
         <w:t>6.2 Skills Gained</w:t>
       </w:r>
     </w:p>
     <w:p>
       <w:r>
         <w:rPr>
-          <w:rFonts w:ascii="Microsoft YaHei" w:hAnsi="Microsoft YaHei" w:eastAsia="Microsoft YaHei"/>
+          <w:rFonts w:ascii="Times New Roman" w:hAnsi="Times New Roman" w:eastAsia="Times New Roman"/>
           <w:b w:val="0"/>
           <w:color w:val="202124"/>
           <w:sz w:val="21"/>
@@ -4433,7 +4801,7 @@
     <w:p>
       <w:r>
         <w:rPr>
-          <w:rFonts w:ascii="Microsoft YaHei" w:hAnsi="Microsoft YaHei" w:eastAsia="Microsoft YaHei"/>
+          <w:rFonts w:ascii="Times New Roman" w:hAnsi="Times New Roman" w:eastAsia="Times New Roman"/>
           <w:b w:val="0"/>
           <w:color w:val="202124"/>
           <w:sz w:val="21"/>
@@ -4446,13 +4814,16 @@
         <w:pStyle w:val="Heading2"/>
       </w:pPr>
       <w:r>
+        <w:rPr>
+          <w:rFonts w:ascii="Times New Roman" w:hAnsi="Times New Roman" w:eastAsia="Times New Roman"/>
+        </w:rPr>
         <w:t>6.3 Future Improvement Plan</w:t>
       </w:r>
     </w:p>
     <w:p>
       <w:r>
         <w:rPr>
-          <w:rFonts w:ascii="Microsoft YaHei" w:hAnsi="Microsoft YaHei" w:eastAsia="Microsoft YaHei"/>
+          <w:rFonts w:ascii="Times New Roman" w:hAnsi="Times New Roman" w:eastAsia="Times New Roman"/>
           <w:b w:val="0"/>
           <w:color w:val="202124"/>
           <w:sz w:val="21"/>
@@ -4463,7 +4834,7 @@
     <w:p>
       <w:r>
         <w:rPr>
-          <w:rFonts w:ascii="Microsoft YaHei" w:hAnsi="Microsoft YaHei" w:eastAsia="Microsoft YaHei"/>
+          <w:rFonts w:ascii="Times New Roman" w:hAnsi="Times New Roman" w:eastAsia="Times New Roman"/>
           <w:b w:val="0"/>
           <w:color w:val="202124"/>
           <w:sz w:val="21"/>
@@ -4480,6 +4851,9 @@
         <w:keepNext/>
       </w:pPr>
       <w:r>
+        <w:rPr>
+          <w:rFonts w:ascii="Times New Roman" w:hAnsi="Times New Roman" w:eastAsia="Times New Roman"/>
+        </w:rPr>
         <w:t>6.4 GitHub Synchronization Record</w:t>
       </w:r>
     </w:p>
@@ -4488,6 +4862,9 @@
         <w:spacing w:after="120"/>
       </w:pPr>
       <w:r>
+        <w:rPr>
+          <w:rFonts w:ascii="Times New Roman" w:hAnsi="Times New Roman" w:eastAsia="Times New Roman"/>
+        </w:rPr>
         <w:t>The Experiment 3 project, evidence, and reports that I helped organize have been synchronized to the GitHub repository: https://github.com/9161942-boop/robotics-experiment-3.</w:t>
       </w:r>
     </w:p>
@@ -4496,6 +4873,9 @@
         <w:spacing w:after="160"/>
       </w:pPr>
       <w:r>
+        <w:rPr>
+          <w:rFonts w:ascii="Times New Roman" w:hAnsi="Times New Roman" w:eastAsia="Times New Roman"/>
+        </w:rPr>
         <w:t>The repository keeps the ROS 2 project, Gazebo scene, manual_animation.json, object-level execution records, process screenshots, and the group and personal reports. The two Gazebo simulation demonstration videos are also stored in the videos/ directory. The commit-history screenshot documents that the materials were synchronized to the public repository. Every problem, adjustment, and verification item in this report can be matched across the report, screenshots, logs, and repository directories.</w:t>
       </w:r>
     </w:p>
@@ -4546,6 +4926,7 @@
       </w:pPr>
       <w:r>
         <w:rPr>
+          <w:rFonts w:ascii="Times New Roman" w:hAnsi="Times New Roman" w:eastAsia="Times New Roman"/>
           <w:i/>
           <w:sz w:val="19"/>
         </w:rPr>
@@ -4987,7 +5368,7 @@
       <w:ind w:firstLine="420"/>
     </w:pPr>
     <w:rPr>
-      <w:rFonts w:ascii="Microsoft YaHei" w:hAnsi="Microsoft YaHei" w:eastAsia="Microsoft YaHei"/>
+      <w:rFonts w:ascii="Times New Roman" w:hAnsi="Times New Roman" w:eastAsia="Times New Roman"/>
       <w:color w:val="202124"/>
       <w:sz w:val="21"/>
     </w:rPr>
@@ -5051,7 +5432,7 @@
       <w:outlineLvl w:val="0"/>
     </w:pPr>
     <w:rPr>
-      <w:rFonts w:asciiTheme="majorHAnsi" w:eastAsiaTheme="majorEastAsia" w:hAnsiTheme="majorHAnsi" w:cstheme="majorBidi" w:ascii="Microsoft YaHei" w:hAnsi="Microsoft YaHei" w:eastAsia="Microsoft YaHei"/>
+      <w:rFonts w:asciiTheme="majorHAnsi" w:eastAsiaTheme="majorEastAsia" w:hAnsiTheme="majorHAnsi" w:cstheme="majorBidi" w:ascii="Times New Roman" w:hAnsi="Times New Roman" w:eastAsia="Times New Roman"/>
       <w:b/>
       <w:bCs/>
       <w:color w:val="163A5F"/>
@@ -5075,7 +5456,7 @@
       <w:outlineLvl w:val="1"/>
     </w:pPr>
     <w:rPr>
-      <w:rFonts w:asciiTheme="majorHAnsi" w:eastAsiaTheme="majorEastAsia" w:hAnsiTheme="majorHAnsi" w:cstheme="majorBidi" w:ascii="Microsoft YaHei" w:hAnsi="Microsoft YaHei" w:eastAsia="Microsoft YaHei"/>
+      <w:rFonts w:asciiTheme="majorHAnsi" w:eastAsiaTheme="majorEastAsia" w:hAnsiTheme="majorHAnsi" w:cstheme="majorBidi" w:ascii="Times New Roman" w:hAnsi="Times New Roman" w:eastAsia="Times New Roman"/>
       <w:b/>
       <w:bCs/>
       <w:color w:val="2D5F8B"/>
@@ -5099,7 +5480,7 @@
       <w:outlineLvl w:val="2"/>
     </w:pPr>
     <w:rPr>
-      <w:rFonts w:asciiTheme="majorHAnsi" w:eastAsiaTheme="majorEastAsia" w:hAnsiTheme="majorHAnsi" w:cstheme="majorBidi" w:ascii="Microsoft YaHei" w:hAnsi="Microsoft YaHei" w:eastAsia="Microsoft YaHei"/>
+      <w:rFonts w:asciiTheme="majorHAnsi" w:eastAsiaTheme="majorEastAsia" w:hAnsiTheme="majorHAnsi" w:cstheme="majorBidi" w:ascii="Times New Roman" w:hAnsi="Times New Roman" w:eastAsia="Times New Roman"/>
       <w:b/>
       <w:bCs/>
       <w:color w:val="0B7A75"/>
@@ -5341,7 +5722,7 @@
       <w:contextualSpacing/>
     </w:pPr>
     <w:rPr>
-      <w:rFonts w:asciiTheme="majorHAnsi" w:eastAsiaTheme="majorEastAsia" w:hAnsiTheme="majorHAnsi" w:cstheme="majorBidi"/>
+      <w:rFonts w:asciiTheme="majorHAnsi" w:eastAsiaTheme="majorEastAsia" w:hAnsiTheme="majorHAnsi" w:cstheme="majorBidi" w:ascii="Times New Roman" w:hAnsi="Times New Roman" w:eastAsia="Times New Roman"/>
       <w:color w:val="17365D" w:themeColor="text2" w:themeShade="BF"/>
       <w:spacing w:val="5"/>
       <w:kern w:val="28"/>

</xml_diff>

<commit_message>
report: align cover identity table
</commit_message>
<xml_diff>
--- a/report/experiment3_personal_report_yangmuqing_en.docx
+++ b/report/experiment3_personal_report_yangmuqing_en.docx
@@ -207,16 +207,17 @@
       </w:tblGrid>
       <w:tr>
         <w:trPr>
+          <w:trHeight w:val="504" w:hRule="atLeast"/>
           <w:tblHeader w:val="true"/>
         </w:trPr>
         <w:tc>
           <w:tcPr>
-            <w:tcW w:type="dxa" w:w="1728"/>
+            <w:tcW w:type="dxa" w:w="2232"/>
             <w:tcMar>
-              <w:top w:w="90" w:type="dxa"/>
-              <w:start w:w="150" w:type="dxa"/>
-              <w:bottom w:w="90" w:type="dxa"/>
-              <w:end w:w="150" w:type="dxa"/>
+              <w:top w:w="100" w:type="dxa"/>
+              <w:start w:w="100" w:type="dxa"/>
+              <w:bottom w:w="100" w:type="dxa"/>
+              <w:end w:w="100" w:type="dxa"/>
             </w:tcMar>
             <w:tcBorders>
               <w:top w:val="single" w:sz="4" w:color="C9D4DF"/>
@@ -229,8 +230,8 @@
           </w:tcPr>
           <w:p>
             <w:pPr>
-              <w:spacing w:line="240" w:lineRule="auto"/>
-              <w:jc w:val="left"/>
+              <w:spacing w:line="240" w:lineRule="auto" w:before="0" w:after="0"/>
+              <w:jc w:val="center"/>
             </w:pPr>
             <w:r>
               <w:rPr>
@@ -245,12 +246,12 @@
         </w:tc>
         <w:tc>
           <w:tcPr>
-            <w:tcW w:type="dxa" w:w="6552"/>
+            <w:tcW w:type="dxa" w:w="6048"/>
             <w:tcMar>
-              <w:top w:w="90" w:type="dxa"/>
-              <w:start w:w="150" w:type="dxa"/>
-              <w:bottom w:w="90" w:type="dxa"/>
-              <w:end w:w="150" w:type="dxa"/>
+              <w:top w:w="100" w:type="dxa"/>
+              <w:start w:w="100" w:type="dxa"/>
+              <w:bottom w:w="100" w:type="dxa"/>
+              <w:end w:w="100" w:type="dxa"/>
             </w:tcMar>
             <w:tcBorders>
               <w:top w:val="single" w:sz="4" w:color="C9D4DF"/>
@@ -262,13 +263,13 @@
           </w:tcPr>
           <w:p>
             <w:pPr>
-              <w:spacing w:line="240" w:lineRule="auto"/>
+              <w:spacing w:line="240" w:lineRule="auto" w:before="0" w:after="0"/>
               <w:jc w:val="left"/>
             </w:pPr>
             <w:r>
               <w:rPr>
                 <w:rFonts w:ascii="Times New Roman" w:hAnsi="Times New Roman" w:eastAsia="Times New Roman"/>
-                <w:b/>
+                <w:b w:val="0"/>
                 <w:color w:val="202124"/>
                 <w:sz w:val="19"/>
               </w:rPr>
@@ -278,14 +279,17 @@
         </w:tc>
       </w:tr>
       <w:tr>
+        <w:trPr>
+          <w:trHeight w:val="504" w:hRule="atLeast"/>
+        </w:trPr>
         <w:tc>
           <w:tcPr>
-            <w:tcW w:type="dxa" w:w="1728"/>
+            <w:tcW w:type="dxa" w:w="2232"/>
             <w:tcMar>
-              <w:top w:w="90" w:type="dxa"/>
-              <w:start w:w="150" w:type="dxa"/>
-              <w:bottom w:w="90" w:type="dxa"/>
-              <w:end w:w="150" w:type="dxa"/>
+              <w:top w:w="100" w:type="dxa"/>
+              <w:start w:w="100" w:type="dxa"/>
+              <w:bottom w:w="100" w:type="dxa"/>
+              <w:end w:w="100" w:type="dxa"/>
             </w:tcMar>
             <w:tcBorders>
               <w:top w:val="single" w:sz="4" w:color="C9D4DF"/>
@@ -298,8 +302,8 @@
           </w:tcPr>
           <w:p>
             <w:pPr>
-              <w:spacing w:line="240" w:lineRule="auto"/>
-              <w:jc w:val="left"/>
+              <w:spacing w:line="240" w:lineRule="auto" w:before="0" w:after="0"/>
+              <w:jc w:val="center"/>
             </w:pPr>
             <w:r>
               <w:rPr>
@@ -314,12 +318,12 @@
         </w:tc>
         <w:tc>
           <w:tcPr>
-            <w:tcW w:type="dxa" w:w="6552"/>
+            <w:tcW w:type="dxa" w:w="6048"/>
             <w:tcMar>
-              <w:top w:w="90" w:type="dxa"/>
-              <w:start w:w="150" w:type="dxa"/>
-              <w:bottom w:w="90" w:type="dxa"/>
-              <w:end w:w="150" w:type="dxa"/>
+              <w:top w:w="100" w:type="dxa"/>
+              <w:start w:w="100" w:type="dxa"/>
+              <w:bottom w:w="100" w:type="dxa"/>
+              <w:end w:w="100" w:type="dxa"/>
             </w:tcMar>
             <w:tcBorders>
               <w:top w:val="single" w:sz="4" w:color="C9D4DF"/>
@@ -331,7 +335,7 @@
           </w:tcPr>
           <w:p>
             <w:pPr>
-              <w:spacing w:line="240" w:lineRule="auto"/>
+              <w:spacing w:line="240" w:lineRule="auto" w:before="0" w:after="0"/>
               <w:jc w:val="left"/>
             </w:pPr>
             <w:r>
@@ -347,14 +351,17 @@
         </w:tc>
       </w:tr>
       <w:tr>
+        <w:trPr>
+          <w:trHeight w:val="504" w:hRule="atLeast"/>
+        </w:trPr>
         <w:tc>
           <w:tcPr>
-            <w:tcW w:type="dxa" w:w="1728"/>
+            <w:tcW w:type="dxa" w:w="2232"/>
             <w:tcMar>
-              <w:top w:w="90" w:type="dxa"/>
-              <w:start w:w="150" w:type="dxa"/>
-              <w:bottom w:w="90" w:type="dxa"/>
-              <w:end w:w="150" w:type="dxa"/>
+              <w:top w:w="100" w:type="dxa"/>
+              <w:start w:w="100" w:type="dxa"/>
+              <w:bottom w:w="100" w:type="dxa"/>
+              <w:end w:w="100" w:type="dxa"/>
             </w:tcMar>
             <w:tcBorders>
               <w:top w:val="single" w:sz="4" w:color="C9D4DF"/>
@@ -367,8 +374,8 @@
           </w:tcPr>
           <w:p>
             <w:pPr>
-              <w:spacing w:line="240" w:lineRule="auto"/>
-              <w:jc w:val="left"/>
+              <w:spacing w:line="240" w:lineRule="auto" w:before="0" w:after="0"/>
+              <w:jc w:val="center"/>
             </w:pPr>
             <w:r>
               <w:rPr>
@@ -383,12 +390,12 @@
         </w:tc>
         <w:tc>
           <w:tcPr>
-            <w:tcW w:type="dxa" w:w="6552"/>
+            <w:tcW w:type="dxa" w:w="6048"/>
             <w:tcMar>
-              <w:top w:w="90" w:type="dxa"/>
-              <w:start w:w="150" w:type="dxa"/>
-              <w:bottom w:w="90" w:type="dxa"/>
-              <w:end w:w="150" w:type="dxa"/>
+              <w:top w:w="100" w:type="dxa"/>
+              <w:start w:w="100" w:type="dxa"/>
+              <w:bottom w:w="100" w:type="dxa"/>
+              <w:end w:w="100" w:type="dxa"/>
             </w:tcMar>
             <w:tcBorders>
               <w:top w:val="single" w:sz="4" w:color="C9D4DF"/>
@@ -400,7 +407,7 @@
           </w:tcPr>
           <w:p>
             <w:pPr>
-              <w:spacing w:line="240" w:lineRule="auto"/>
+              <w:spacing w:line="240" w:lineRule="auto" w:before="0" w:after="0"/>
               <w:jc w:val="left"/>
             </w:pPr>
             <w:r>

</xml_diff>

<commit_message>
report: normalize all table layouts
</commit_message>
<xml_diff>
--- a/report/experiment3_personal_report_yangmuqing_en.docx
+++ b/report/experiment3_personal_report_yangmuqing_en.docx
@@ -12,7 +12,7 @@
     </w:p>
     <w:tbl>
       <w:tblPr>
-        <w:tblW w:type="auto" w:w="0"/>
+        <w:tblW w:type="dxa" w:w="9287"/>
         <w:jc w:val="center"/>
         <w:tblLayout w:type="fixed"/>
         <w:tblLook w:firstColumn="1" w:firstRow="1" w:lastColumn="0" w:lastRow="0" w:noHBand="0" w:noVBand="1" w:val="04A0"/>
@@ -23,16 +23,17 @@
       </w:tblGrid>
       <w:tr>
         <w:trPr>
+          <w:trHeight w:val="346" w:hRule="atLeast"/>
           <w:tblHeader w:val="true"/>
         </w:trPr>
         <w:tc>
           <w:tcPr>
-            <w:tcW w:type="dxa" w:w="4649"/>
+            <w:tcW w:type="dxa" w:w="7703"/>
             <w:tcMar>
-              <w:top w:w="30" w:type="dxa"/>
-              <w:start w:w="0" w:type="dxa"/>
-              <w:bottom w:w="30" w:type="dxa"/>
-              <w:end w:w="0" w:type="dxa"/>
+              <w:top w:w="100" w:type="dxa"/>
+              <w:start w:w="100" w:type="dxa"/>
+              <w:bottom w:w="100" w:type="dxa"/>
+              <w:end w:w="100" w:type="dxa"/>
             </w:tcMar>
             <w:tcBorders>
               <w:top w:val="nil"/>
@@ -44,7 +45,7 @@
           </w:tcPr>
           <w:p>
             <w:pPr>
-              <w:spacing w:line="240" w:lineRule="auto"/>
+              <w:spacing w:line="240" w:lineRule="auto" w:before="0" w:after="0"/>
               <w:jc w:val="left"/>
             </w:pPr>
             <w:r>
@@ -60,12 +61,12 @@
         </w:tc>
         <w:tc>
           <w:tcPr>
-            <w:tcW w:type="dxa" w:w="4649"/>
+            <w:tcW w:type="dxa" w:w="1584"/>
             <w:tcMar>
-              <w:top w:w="30" w:type="dxa"/>
-              <w:start w:w="0" w:type="dxa"/>
-              <w:bottom w:w="30" w:type="dxa"/>
-              <w:end w:w="0" w:type="dxa"/>
+              <w:top w:w="100" w:type="dxa"/>
+              <w:start w:w="100" w:type="dxa"/>
+              <w:bottom w:w="100" w:type="dxa"/>
+              <w:end w:w="100" w:type="dxa"/>
             </w:tcMar>
             <w:tcBorders>
               <w:top w:val="nil"/>
@@ -77,7 +78,7 @@
           </w:tcPr>
           <w:p>
             <w:pPr>
-              <w:spacing w:line="240" w:lineRule="auto"/>
+              <w:spacing w:line="240" w:lineRule="auto" w:before="0" w:after="0"/>
               <w:jc w:val="right"/>
             </w:pPr>
             <w:r>
@@ -196,7 +197,7 @@
     </w:p>
     <w:tbl>
       <w:tblPr>
-        <w:tblW w:type="auto" w:w="0"/>
+        <w:tblW w:type="dxa" w:w="8280"/>
         <w:jc w:val="center"/>
         <w:tblLayout w:type="fixed"/>
         <w:tblLook w:firstColumn="1" w:firstRow="1" w:lastColumn="0" w:lastRow="0" w:noHBand="0" w:noVBand="1" w:val="04A0"/>
@@ -231,13 +232,14 @@
           <w:p>
             <w:pPr>
               <w:spacing w:line="240" w:lineRule="auto" w:before="0" w:after="0"/>
+              <w:ind w:left="0" w:right="0" w:firstLine="0"/>
               <w:jc w:val="center"/>
             </w:pPr>
             <w:r>
               <w:rPr>
                 <w:rFonts w:ascii="Times New Roman" w:hAnsi="Times New Roman" w:eastAsia="Times New Roman"/>
-                <w:b/>
-                <w:color w:val="163A5F"/>
+                <w:b w:val="0"/>
+                <w:color w:val="173E68"/>
                 <w:sz w:val="19"/>
               </w:rPr>
               <w:t>Name</w:t>
@@ -264,13 +266,14 @@
           <w:p>
             <w:pPr>
               <w:spacing w:line="240" w:lineRule="auto" w:before="0" w:after="0"/>
+              <w:ind w:left="0" w:right="0" w:firstLine="0"/>
               <w:jc w:val="left"/>
             </w:pPr>
             <w:r>
               <w:rPr>
                 <w:rFonts w:ascii="Times New Roman" w:hAnsi="Times New Roman" w:eastAsia="Times New Roman"/>
-                <w:b w:val="0"/>
-                <w:color w:val="202124"/>
+                <w:b/>
+                <w:color w:val="202020"/>
                 <w:sz w:val="19"/>
               </w:rPr>
               <w:t>Yang Muqing</w:t>
@@ -303,13 +306,14 @@
           <w:p>
             <w:pPr>
               <w:spacing w:line="240" w:lineRule="auto" w:before="0" w:after="0"/>
+              <w:ind w:left="0" w:right="0" w:firstLine="0"/>
               <w:jc w:val="center"/>
             </w:pPr>
             <w:r>
               <w:rPr>
                 <w:rFonts w:ascii="Times New Roman" w:hAnsi="Times New Roman" w:eastAsia="Times New Roman"/>
-                <w:b/>
-                <w:color w:val="163A5F"/>
+                <w:b w:val="0"/>
+                <w:color w:val="173E68"/>
                 <w:sz w:val="19"/>
               </w:rPr>
               <w:t>Student ID</w:t>
@@ -336,13 +340,14 @@
           <w:p>
             <w:pPr>
               <w:spacing w:line="240" w:lineRule="auto" w:before="0" w:after="0"/>
+              <w:ind w:left="0" w:right="0" w:firstLine="0"/>
               <w:jc w:val="left"/>
             </w:pPr>
             <w:r>
               <w:rPr>
                 <w:rFonts w:ascii="Times New Roman" w:hAnsi="Times New Roman" w:eastAsia="Times New Roman"/>
                 <w:b w:val="0"/>
-                <w:color w:val="202124"/>
+                <w:color w:val="202020"/>
                 <w:sz w:val="19"/>
               </w:rPr>
               <w:t>24020036076</w:t>
@@ -375,13 +380,14 @@
           <w:p>
             <w:pPr>
               <w:spacing w:line="240" w:lineRule="auto" w:before="0" w:after="0"/>
+              <w:ind w:left="0" w:right="0" w:firstLine="0"/>
               <w:jc w:val="center"/>
             </w:pPr>
             <w:r>
               <w:rPr>
                 <w:rFonts w:ascii="Times New Roman" w:hAnsi="Times New Roman" w:eastAsia="Times New Roman"/>
-                <w:b/>
-                <w:color w:val="163A5F"/>
+                <w:b w:val="0"/>
+                <w:color w:val="173E68"/>
                 <w:sz w:val="19"/>
               </w:rPr>
               <w:t>Group and Course</w:t>
@@ -408,13 +414,14 @@
           <w:p>
             <w:pPr>
               <w:spacing w:line="240" w:lineRule="auto" w:before="0" w:after="0"/>
+              <w:ind w:left="0" w:right="0" w:firstLine="0"/>
               <w:jc w:val="left"/>
             </w:pPr>
             <w:r>
               <w:rPr>
                 <w:rFonts w:ascii="Times New Roman" w:hAnsi="Times New Roman" w:eastAsia="Times New Roman"/>
                 <w:b w:val="0"/>
-                <w:color w:val="202124"/>
+                <w:color w:val="202020"/>
                 <w:sz w:val="19"/>
               </w:rPr>
               <w:t>Group 17  ·  Robotics Integration Group Project I</w:t>
@@ -536,7 +543,7 @@
     </w:p>
     <w:tbl>
       <w:tblPr>
-        <w:tblW w:type="auto" w:w="0"/>
+        <w:tblW w:type="dxa" w:w="8280"/>
         <w:jc w:val="center"/>
         <w:tblLayout w:type="fixed"/>
         <w:tblLook w:firstColumn="1" w:firstRow="1" w:lastColumn="0" w:lastRow="0" w:noHBand="0" w:noVBand="1" w:val="04A0"/>
@@ -547,18 +554,19 @@
       </w:tblGrid>
       <w:tr>
         <w:trPr>
+          <w:trHeight w:val="518" w:hRule="atLeast"/>
           <w:tblHeader w:val="true"/>
           <w:cantSplit/>
         </w:trPr>
         <w:tc>
           <w:tcPr>
-            <w:tcW w:type="dxa" w:w="1944"/>
+            <w:tcW w:type="dxa" w:w="2232"/>
             <w:shd w:fill="163A5F"/>
             <w:tcMar>
-              <w:top w:w="70" w:type="dxa"/>
-              <w:start w:w="80" w:type="dxa"/>
-              <w:bottom w:w="70" w:type="dxa"/>
-              <w:end w:w="80" w:type="dxa"/>
+              <w:top w:w="100" w:type="dxa"/>
+              <w:start w:w="100" w:type="dxa"/>
+              <w:bottom w:w="100" w:type="dxa"/>
+              <w:end w:w="100" w:type="dxa"/>
             </w:tcMar>
             <w:tcBorders>
               <w:top w:val="single" w:sz="6" w:color="163A5F"/>
@@ -570,7 +578,8 @@
           </w:tcPr>
           <w:p>
             <w:pPr>
-              <w:spacing w:line="240" w:lineRule="auto"/>
+              <w:spacing w:line="240" w:lineRule="auto" w:before="0" w:after="0"/>
+              <w:ind w:left="0" w:right="0" w:firstLine="0"/>
               <w:jc w:val="center"/>
             </w:pPr>
             <w:r>
@@ -586,13 +595,13 @@
         </w:tc>
         <w:tc>
           <w:tcPr>
-            <w:tcW w:type="dxa" w:w="6336"/>
+            <w:tcW w:type="dxa" w:w="6048"/>
             <w:shd w:fill="163A5F"/>
             <w:tcMar>
-              <w:top w:w="70" w:type="dxa"/>
-              <w:start w:w="80" w:type="dxa"/>
-              <w:bottom w:w="70" w:type="dxa"/>
-              <w:end w:w="80" w:type="dxa"/>
+              <w:top w:w="100" w:type="dxa"/>
+              <w:start w:w="100" w:type="dxa"/>
+              <w:bottom w:w="100" w:type="dxa"/>
+              <w:end w:w="100" w:type="dxa"/>
             </w:tcMar>
             <w:tcBorders>
               <w:top w:val="single" w:sz="6" w:color="163A5F"/>
@@ -604,7 +613,8 @@
           </w:tcPr>
           <w:p>
             <w:pPr>
-              <w:spacing w:line="240" w:lineRule="auto"/>
+              <w:spacing w:line="240" w:lineRule="auto" w:before="0" w:after="0"/>
+              <w:ind w:left="0" w:right="0" w:firstLine="0"/>
               <w:jc w:val="center"/>
             </w:pPr>
             <w:r>
@@ -622,15 +632,16 @@
       <w:tr>
         <w:trPr>
           <w:cantSplit/>
+          <w:trHeight w:val="518" w:hRule="atLeast"/>
         </w:trPr>
         <w:tc>
           <w:tcPr>
-            <w:tcW w:type="dxa" w:w="1944"/>
+            <w:tcW w:type="dxa" w:w="2232"/>
             <w:tcMar>
-              <w:top w:w="65" w:type="dxa"/>
-              <w:start w:w="80" w:type="dxa"/>
-              <w:bottom w:w="65" w:type="dxa"/>
-              <w:end w:w="80" w:type="dxa"/>
+              <w:top w:w="100" w:type="dxa"/>
+              <w:start w:w="100" w:type="dxa"/>
+              <w:bottom w:w="100" w:type="dxa"/>
+              <w:end w:w="100" w:type="dxa"/>
             </w:tcMar>
             <w:tcBorders>
               <w:top w:val="single" w:sz="4" w:color="B8C2CC"/>
@@ -643,8 +654,9 @@
           </w:tcPr>
           <w:p>
             <w:pPr>
-              <w:spacing w:line="240" w:lineRule="auto"/>
-              <w:jc w:val="left"/>
+              <w:spacing w:line="240" w:lineRule="auto" w:before="0" w:after="0"/>
+              <w:ind w:left="0" w:right="0" w:firstLine="0"/>
+              <w:jc w:val="center"/>
             </w:pPr>
             <w:r>
               <w:rPr>
@@ -659,12 +671,12 @@
         </w:tc>
         <w:tc>
           <w:tcPr>
-            <w:tcW w:type="dxa" w:w="6336"/>
+            <w:tcW w:type="dxa" w:w="6048"/>
             <w:tcMar>
-              <w:top w:w="65" w:type="dxa"/>
-              <w:start w:w="80" w:type="dxa"/>
-              <w:bottom w:w="65" w:type="dxa"/>
-              <w:end w:w="80" w:type="dxa"/>
+              <w:top w:w="100" w:type="dxa"/>
+              <w:start w:w="100" w:type="dxa"/>
+              <w:bottom w:w="100" w:type="dxa"/>
+              <w:end w:w="100" w:type="dxa"/>
             </w:tcMar>
             <w:tcBorders>
               <w:top w:val="single" w:sz="4" w:color="B8C2CC"/>
@@ -677,7 +689,8 @@
           </w:tcPr>
           <w:p>
             <w:pPr>
-              <w:spacing w:line="240" w:lineRule="auto"/>
+              <w:spacing w:line="240" w:lineRule="auto" w:before="0" w:after="0"/>
+              <w:ind w:left="0" w:right="0" w:firstLine="0"/>
               <w:jc w:val="left"/>
             </w:pPr>
             <w:r>
@@ -695,15 +708,16 @@
       <w:tr>
         <w:trPr>
           <w:cantSplit/>
+          <w:trHeight w:val="518" w:hRule="atLeast"/>
         </w:trPr>
         <w:tc>
           <w:tcPr>
-            <w:tcW w:type="dxa" w:w="1944"/>
+            <w:tcW w:type="dxa" w:w="2232"/>
             <w:tcMar>
-              <w:top w:w="65" w:type="dxa"/>
-              <w:start w:w="80" w:type="dxa"/>
-              <w:bottom w:w="65" w:type="dxa"/>
-              <w:end w:w="80" w:type="dxa"/>
+              <w:top w:w="100" w:type="dxa"/>
+              <w:start w:w="100" w:type="dxa"/>
+              <w:bottom w:w="100" w:type="dxa"/>
+              <w:end w:w="100" w:type="dxa"/>
             </w:tcMar>
             <w:tcBorders>
               <w:top w:val="single" w:sz="4" w:color="B8C2CC"/>
@@ -715,8 +729,9 @@
           </w:tcPr>
           <w:p>
             <w:pPr>
-              <w:spacing w:line="240" w:lineRule="auto"/>
-              <w:jc w:val="left"/>
+              <w:spacing w:line="240" w:lineRule="auto" w:before="0" w:after="0"/>
+              <w:ind w:left="0" w:right="0" w:firstLine="0"/>
+              <w:jc w:val="center"/>
             </w:pPr>
             <w:r>
               <w:rPr>
@@ -731,12 +746,12 @@
         </w:tc>
         <w:tc>
           <w:tcPr>
-            <w:tcW w:type="dxa" w:w="6336"/>
+            <w:tcW w:type="dxa" w:w="6048"/>
             <w:tcMar>
-              <w:top w:w="65" w:type="dxa"/>
-              <w:start w:w="80" w:type="dxa"/>
-              <w:bottom w:w="65" w:type="dxa"/>
-              <w:end w:w="80" w:type="dxa"/>
+              <w:top w:w="100" w:type="dxa"/>
+              <w:start w:w="100" w:type="dxa"/>
+              <w:bottom w:w="100" w:type="dxa"/>
+              <w:end w:w="100" w:type="dxa"/>
             </w:tcMar>
             <w:tcBorders>
               <w:top w:val="single" w:sz="4" w:color="B8C2CC"/>
@@ -748,7 +763,8 @@
           </w:tcPr>
           <w:p>
             <w:pPr>
-              <w:spacing w:line="240" w:lineRule="auto"/>
+              <w:spacing w:line="240" w:lineRule="auto" w:before="0" w:after="0"/>
+              <w:ind w:left="0" w:right="0" w:firstLine="0"/>
               <w:jc w:val="left"/>
             </w:pPr>
             <w:r>
@@ -766,15 +782,16 @@
       <w:tr>
         <w:trPr>
           <w:cantSplit/>
+          <w:trHeight w:val="518" w:hRule="atLeast"/>
         </w:trPr>
         <w:tc>
           <w:tcPr>
-            <w:tcW w:type="dxa" w:w="1944"/>
+            <w:tcW w:type="dxa" w:w="2232"/>
             <w:tcMar>
-              <w:top w:w="65" w:type="dxa"/>
-              <w:start w:w="80" w:type="dxa"/>
-              <w:bottom w:w="65" w:type="dxa"/>
-              <w:end w:w="80" w:type="dxa"/>
+              <w:top w:w="100" w:type="dxa"/>
+              <w:start w:w="100" w:type="dxa"/>
+              <w:bottom w:w="100" w:type="dxa"/>
+              <w:end w:w="100" w:type="dxa"/>
             </w:tcMar>
             <w:tcBorders>
               <w:top w:val="single" w:sz="4" w:color="B8C2CC"/>
@@ -787,8 +804,9 @@
           </w:tcPr>
           <w:p>
             <w:pPr>
-              <w:spacing w:line="240" w:lineRule="auto"/>
-              <w:jc w:val="left"/>
+              <w:spacing w:line="240" w:lineRule="auto" w:before="0" w:after="0"/>
+              <w:ind w:left="0" w:right="0" w:firstLine="0"/>
+              <w:jc w:val="center"/>
             </w:pPr>
             <w:r>
               <w:rPr>
@@ -803,12 +821,12 @@
         </w:tc>
         <w:tc>
           <w:tcPr>
-            <w:tcW w:type="dxa" w:w="6336"/>
+            <w:tcW w:type="dxa" w:w="6048"/>
             <w:tcMar>
-              <w:top w:w="65" w:type="dxa"/>
-              <w:start w:w="80" w:type="dxa"/>
-              <w:bottom w:w="65" w:type="dxa"/>
-              <w:end w:w="80" w:type="dxa"/>
+              <w:top w:w="100" w:type="dxa"/>
+              <w:start w:w="100" w:type="dxa"/>
+              <w:bottom w:w="100" w:type="dxa"/>
+              <w:end w:w="100" w:type="dxa"/>
             </w:tcMar>
             <w:tcBorders>
               <w:top w:val="single" w:sz="4" w:color="B8C2CC"/>
@@ -821,7 +839,8 @@
           </w:tcPr>
           <w:p>
             <w:pPr>
-              <w:spacing w:line="240" w:lineRule="auto"/>
+              <w:spacing w:line="240" w:lineRule="auto" w:before="0" w:after="0"/>
+              <w:ind w:left="0" w:right="0" w:firstLine="0"/>
               <w:jc w:val="left"/>
             </w:pPr>
             <w:r>
@@ -839,15 +858,16 @@
       <w:tr>
         <w:trPr>
           <w:cantSplit/>
+          <w:trHeight w:val="518" w:hRule="atLeast"/>
         </w:trPr>
         <w:tc>
           <w:tcPr>
-            <w:tcW w:type="dxa" w:w="1944"/>
+            <w:tcW w:type="dxa" w:w="2232"/>
             <w:tcMar>
-              <w:top w:w="65" w:type="dxa"/>
-              <w:start w:w="80" w:type="dxa"/>
-              <w:bottom w:w="65" w:type="dxa"/>
-              <w:end w:w="80" w:type="dxa"/>
+              <w:top w:w="100" w:type="dxa"/>
+              <w:start w:w="100" w:type="dxa"/>
+              <w:bottom w:w="100" w:type="dxa"/>
+              <w:end w:w="100" w:type="dxa"/>
             </w:tcMar>
             <w:tcBorders>
               <w:top w:val="single" w:sz="4" w:color="B8C2CC"/>
@@ -859,8 +879,9 @@
           </w:tcPr>
           <w:p>
             <w:pPr>
-              <w:spacing w:line="240" w:lineRule="auto"/>
-              <w:jc w:val="left"/>
+              <w:spacing w:line="240" w:lineRule="auto" w:before="0" w:after="0"/>
+              <w:ind w:left="0" w:right="0" w:firstLine="0"/>
+              <w:jc w:val="center"/>
             </w:pPr>
             <w:r>
               <w:rPr>
@@ -875,12 +896,12 @@
         </w:tc>
         <w:tc>
           <w:tcPr>
-            <w:tcW w:type="dxa" w:w="6336"/>
+            <w:tcW w:type="dxa" w:w="6048"/>
             <w:tcMar>
-              <w:top w:w="65" w:type="dxa"/>
-              <w:start w:w="80" w:type="dxa"/>
-              <w:bottom w:w="65" w:type="dxa"/>
-              <w:end w:w="80" w:type="dxa"/>
+              <w:top w:w="100" w:type="dxa"/>
+              <w:start w:w="100" w:type="dxa"/>
+              <w:bottom w:w="100" w:type="dxa"/>
+              <w:end w:w="100" w:type="dxa"/>
             </w:tcMar>
             <w:tcBorders>
               <w:top w:val="single" w:sz="4" w:color="B8C2CC"/>
@@ -892,7 +913,8 @@
           </w:tcPr>
           <w:p>
             <w:pPr>
-              <w:spacing w:line="240" w:lineRule="auto"/>
+              <w:spacing w:line="240" w:lineRule="auto" w:before="0" w:after="0"/>
+              <w:ind w:left="0" w:right="0" w:firstLine="0"/>
               <w:jc w:val="left"/>
             </w:pPr>
             <w:r>
@@ -910,15 +932,16 @@
       <w:tr>
         <w:trPr>
           <w:cantSplit/>
+          <w:trHeight w:val="518" w:hRule="atLeast"/>
         </w:trPr>
         <w:tc>
           <w:tcPr>
-            <w:tcW w:type="dxa" w:w="1944"/>
+            <w:tcW w:type="dxa" w:w="2232"/>
             <w:tcMar>
-              <w:top w:w="65" w:type="dxa"/>
-              <w:start w:w="80" w:type="dxa"/>
-              <w:bottom w:w="65" w:type="dxa"/>
-              <w:end w:w="80" w:type="dxa"/>
+              <w:top w:w="100" w:type="dxa"/>
+              <w:start w:w="100" w:type="dxa"/>
+              <w:bottom w:w="100" w:type="dxa"/>
+              <w:end w:w="100" w:type="dxa"/>
             </w:tcMar>
             <w:tcBorders>
               <w:top w:val="single" w:sz="4" w:color="B8C2CC"/>
@@ -931,8 +954,9 @@
           </w:tcPr>
           <w:p>
             <w:pPr>
-              <w:spacing w:line="240" w:lineRule="auto"/>
-              <w:jc w:val="left"/>
+              <w:spacing w:line="240" w:lineRule="auto" w:before="0" w:after="0"/>
+              <w:ind w:left="0" w:right="0" w:firstLine="0"/>
+              <w:jc w:val="center"/>
             </w:pPr>
             <w:r>
               <w:rPr>
@@ -947,12 +971,12 @@
         </w:tc>
         <w:tc>
           <w:tcPr>
-            <w:tcW w:type="dxa" w:w="6336"/>
+            <w:tcW w:type="dxa" w:w="6048"/>
             <w:tcMar>
-              <w:top w:w="65" w:type="dxa"/>
-              <w:start w:w="80" w:type="dxa"/>
-              <w:bottom w:w="65" w:type="dxa"/>
-              <w:end w:w="80" w:type="dxa"/>
+              <w:top w:w="100" w:type="dxa"/>
+              <w:start w:w="100" w:type="dxa"/>
+              <w:bottom w:w="100" w:type="dxa"/>
+              <w:end w:w="100" w:type="dxa"/>
             </w:tcMar>
             <w:tcBorders>
               <w:top w:val="single" w:sz="4" w:color="B8C2CC"/>
@@ -965,7 +989,8 @@
           </w:tcPr>
           <w:p>
             <w:pPr>
-              <w:spacing w:line="240" w:lineRule="auto"/>
+              <w:spacing w:line="240" w:lineRule="auto" w:before="0" w:after="0"/>
+              <w:ind w:left="0" w:right="0" w:firstLine="0"/>
               <w:jc w:val="left"/>
             </w:pPr>
             <w:r>
@@ -2196,7 +2221,7 @@
     </w:p>
     <w:tbl>
       <w:tblPr>
-        <w:tblW w:type="auto" w:w="0"/>
+        <w:tblW w:type="dxa" w:w="8208"/>
         <w:jc w:val="center"/>
         <w:tblLayout w:type="fixed"/>
         <w:tblLook w:firstColumn="1" w:firstRow="1" w:lastColumn="0" w:lastRow="0" w:noHBand="0" w:noVBand="1" w:val="04A0"/>
@@ -2208,18 +2233,19 @@
       </w:tblGrid>
       <w:tr>
         <w:trPr>
+          <w:trHeight w:val="518" w:hRule="atLeast"/>
           <w:tblHeader w:val="true"/>
           <w:cantSplit/>
         </w:trPr>
         <w:tc>
           <w:tcPr>
-            <w:tcW w:type="dxa" w:w="1800"/>
+            <w:tcW w:type="dxa" w:w="2088"/>
             <w:shd w:fill="163A5F"/>
             <w:tcMar>
-              <w:top w:w="70" w:type="dxa"/>
-              <w:start w:w="80" w:type="dxa"/>
-              <w:bottom w:w="70" w:type="dxa"/>
-              <w:end w:w="80" w:type="dxa"/>
+              <w:top w:w="100" w:type="dxa"/>
+              <w:start w:w="100" w:type="dxa"/>
+              <w:bottom w:w="100" w:type="dxa"/>
+              <w:end w:w="100" w:type="dxa"/>
             </w:tcMar>
             <w:tcBorders>
               <w:top w:val="single" w:sz="6" w:color="163A5F"/>
@@ -2231,7 +2257,8 @@
           </w:tcPr>
           <w:p>
             <w:pPr>
-              <w:spacing w:line="240" w:lineRule="auto"/>
+              <w:spacing w:line="240" w:lineRule="auto" w:before="0" w:after="0"/>
+              <w:ind w:left="0" w:right="0" w:firstLine="0"/>
               <w:jc w:val="center"/>
             </w:pPr>
             <w:r>
@@ -2250,10 +2277,10 @@
             <w:tcW w:type="dxa" w:w="3240"/>
             <w:shd w:fill="163A5F"/>
             <w:tcMar>
-              <w:top w:w="70" w:type="dxa"/>
-              <w:start w:w="80" w:type="dxa"/>
-              <w:bottom w:w="70" w:type="dxa"/>
-              <w:end w:w="80" w:type="dxa"/>
+              <w:top w:w="100" w:type="dxa"/>
+              <w:start w:w="100" w:type="dxa"/>
+              <w:bottom w:w="100" w:type="dxa"/>
+              <w:end w:w="100" w:type="dxa"/>
             </w:tcMar>
             <w:tcBorders>
               <w:top w:val="single" w:sz="6" w:color="163A5F"/>
@@ -2265,7 +2292,8 @@
           </w:tcPr>
           <w:p>
             <w:pPr>
-              <w:spacing w:line="240" w:lineRule="auto"/>
+              <w:spacing w:line="240" w:lineRule="auto" w:before="0" w:after="0"/>
+              <w:ind w:left="0" w:right="0" w:firstLine="0"/>
               <w:jc w:val="center"/>
             </w:pPr>
             <w:r>
@@ -2281,13 +2309,13 @@
         </w:tc>
         <w:tc>
           <w:tcPr>
-            <w:tcW w:type="dxa" w:w="3024"/>
+            <w:tcW w:type="dxa" w:w="2880"/>
             <w:shd w:fill="163A5F"/>
             <w:tcMar>
-              <w:top w:w="70" w:type="dxa"/>
-              <w:start w:w="80" w:type="dxa"/>
-              <w:bottom w:w="70" w:type="dxa"/>
-              <w:end w:w="80" w:type="dxa"/>
+              <w:top w:w="100" w:type="dxa"/>
+              <w:start w:w="100" w:type="dxa"/>
+              <w:bottom w:w="100" w:type="dxa"/>
+              <w:end w:w="100" w:type="dxa"/>
             </w:tcMar>
             <w:tcBorders>
               <w:top w:val="single" w:sz="6" w:color="163A5F"/>
@@ -2299,7 +2327,8 @@
           </w:tcPr>
           <w:p>
             <w:pPr>
-              <w:spacing w:line="240" w:lineRule="auto"/>
+              <w:spacing w:line="240" w:lineRule="auto" w:before="0" w:after="0"/>
+              <w:ind w:left="0" w:right="0" w:firstLine="0"/>
               <w:jc w:val="center"/>
             </w:pPr>
             <w:r>
@@ -2317,15 +2346,16 @@
       <w:tr>
         <w:trPr>
           <w:cantSplit/>
+          <w:trHeight w:val="518" w:hRule="atLeast"/>
         </w:trPr>
         <w:tc>
           <w:tcPr>
-            <w:tcW w:type="dxa" w:w="1800"/>
+            <w:tcW w:type="dxa" w:w="2088"/>
             <w:tcMar>
-              <w:top w:w="65" w:type="dxa"/>
-              <w:start w:w="80" w:type="dxa"/>
-              <w:bottom w:w="65" w:type="dxa"/>
-              <w:end w:w="80" w:type="dxa"/>
+              <w:top w:w="100" w:type="dxa"/>
+              <w:start w:w="100" w:type="dxa"/>
+              <w:bottom w:w="100" w:type="dxa"/>
+              <w:end w:w="100" w:type="dxa"/>
             </w:tcMar>
             <w:tcBorders>
               <w:top w:val="single" w:sz="4" w:color="B8C2CC"/>
@@ -2338,8 +2368,9 @@
           </w:tcPr>
           <w:p>
             <w:pPr>
-              <w:spacing w:line="240" w:lineRule="auto"/>
-              <w:jc w:val="left"/>
+              <w:spacing w:line="240" w:lineRule="auto" w:before="0" w:after="0"/>
+              <w:ind w:left="0" w:right="0" w:firstLine="0"/>
+              <w:jc w:val="center"/>
             </w:pPr>
             <w:r>
               <w:rPr>
@@ -2356,10 +2387,10 @@
           <w:tcPr>
             <w:tcW w:type="dxa" w:w="3240"/>
             <w:tcMar>
-              <w:top w:w="65" w:type="dxa"/>
-              <w:start w:w="80" w:type="dxa"/>
-              <w:bottom w:w="65" w:type="dxa"/>
-              <w:end w:w="80" w:type="dxa"/>
+              <w:top w:w="100" w:type="dxa"/>
+              <w:start w:w="100" w:type="dxa"/>
+              <w:bottom w:w="100" w:type="dxa"/>
+              <w:end w:w="100" w:type="dxa"/>
             </w:tcMar>
             <w:tcBorders>
               <w:top w:val="single" w:sz="4" w:color="B8C2CC"/>
@@ -2372,7 +2403,8 @@
           </w:tcPr>
           <w:p>
             <w:pPr>
-              <w:spacing w:line="240" w:lineRule="auto"/>
+              <w:spacing w:line="240" w:lineRule="auto" w:before="0" w:after="0"/>
+              <w:ind w:left="0" w:right="0" w:firstLine="0"/>
               <w:jc w:val="left"/>
             </w:pPr>
             <w:r>
@@ -2388,12 +2420,12 @@
         </w:tc>
         <w:tc>
           <w:tcPr>
-            <w:tcW w:type="dxa" w:w="3024"/>
+            <w:tcW w:type="dxa" w:w="2880"/>
             <w:tcMar>
-              <w:top w:w="65" w:type="dxa"/>
-              <w:start w:w="80" w:type="dxa"/>
-              <w:bottom w:w="65" w:type="dxa"/>
-              <w:end w:w="80" w:type="dxa"/>
+              <w:top w:w="100" w:type="dxa"/>
+              <w:start w:w="100" w:type="dxa"/>
+              <w:bottom w:w="100" w:type="dxa"/>
+              <w:end w:w="100" w:type="dxa"/>
             </w:tcMar>
             <w:tcBorders>
               <w:top w:val="single" w:sz="4" w:color="B8C2CC"/>
@@ -2406,7 +2438,8 @@
           </w:tcPr>
           <w:p>
             <w:pPr>
-              <w:spacing w:line="240" w:lineRule="auto"/>
+              <w:spacing w:line="240" w:lineRule="auto" w:before="0" w:after="0"/>
+              <w:ind w:left="0" w:right="0" w:firstLine="0"/>
               <w:jc w:val="left"/>
             </w:pPr>
             <w:r>
@@ -2424,15 +2457,16 @@
       <w:tr>
         <w:trPr>
           <w:cantSplit/>
+          <w:trHeight w:val="518" w:hRule="atLeast"/>
         </w:trPr>
         <w:tc>
           <w:tcPr>
-            <w:tcW w:type="dxa" w:w="1800"/>
+            <w:tcW w:type="dxa" w:w="2088"/>
             <w:tcMar>
-              <w:top w:w="65" w:type="dxa"/>
-              <w:start w:w="80" w:type="dxa"/>
-              <w:bottom w:w="65" w:type="dxa"/>
-              <w:end w:w="80" w:type="dxa"/>
+              <w:top w:w="100" w:type="dxa"/>
+              <w:start w:w="100" w:type="dxa"/>
+              <w:bottom w:w="100" w:type="dxa"/>
+              <w:end w:w="100" w:type="dxa"/>
             </w:tcMar>
             <w:tcBorders>
               <w:top w:val="single" w:sz="4" w:color="B8C2CC"/>
@@ -2444,8 +2478,9 @@
           </w:tcPr>
           <w:p>
             <w:pPr>
-              <w:spacing w:line="240" w:lineRule="auto"/>
-              <w:jc w:val="left"/>
+              <w:spacing w:line="240" w:lineRule="auto" w:before="0" w:after="0"/>
+              <w:ind w:left="0" w:right="0" w:firstLine="0"/>
+              <w:jc w:val="center"/>
             </w:pPr>
             <w:r>
               <w:rPr>
@@ -2462,10 +2497,10 @@
           <w:tcPr>
             <w:tcW w:type="dxa" w:w="3240"/>
             <w:tcMar>
-              <w:top w:w="65" w:type="dxa"/>
-              <w:start w:w="80" w:type="dxa"/>
-              <w:bottom w:w="65" w:type="dxa"/>
-              <w:end w:w="80" w:type="dxa"/>
+              <w:top w:w="100" w:type="dxa"/>
+              <w:start w:w="100" w:type="dxa"/>
+              <w:bottom w:w="100" w:type="dxa"/>
+              <w:end w:w="100" w:type="dxa"/>
             </w:tcMar>
             <w:tcBorders>
               <w:top w:val="single" w:sz="4" w:color="B8C2CC"/>
@@ -2477,7 +2512,8 @@
           </w:tcPr>
           <w:p>
             <w:pPr>
-              <w:spacing w:line="240" w:lineRule="auto"/>
+              <w:spacing w:line="240" w:lineRule="auto" w:before="0" w:after="0"/>
+              <w:ind w:left="0" w:right="0" w:firstLine="0"/>
               <w:jc w:val="left"/>
             </w:pPr>
             <w:r>
@@ -2493,12 +2529,12 @@
         </w:tc>
         <w:tc>
           <w:tcPr>
-            <w:tcW w:type="dxa" w:w="3024"/>
+            <w:tcW w:type="dxa" w:w="2880"/>
             <w:tcMar>
-              <w:top w:w="65" w:type="dxa"/>
-              <w:start w:w="80" w:type="dxa"/>
-              <w:bottom w:w="65" w:type="dxa"/>
-              <w:end w:w="80" w:type="dxa"/>
+              <w:top w:w="100" w:type="dxa"/>
+              <w:start w:w="100" w:type="dxa"/>
+              <w:bottom w:w="100" w:type="dxa"/>
+              <w:end w:w="100" w:type="dxa"/>
             </w:tcMar>
             <w:tcBorders>
               <w:top w:val="single" w:sz="4" w:color="B8C2CC"/>
@@ -2510,7 +2546,8 @@
           </w:tcPr>
           <w:p>
             <w:pPr>
-              <w:spacing w:line="240" w:lineRule="auto"/>
+              <w:spacing w:line="240" w:lineRule="auto" w:before="0" w:after="0"/>
+              <w:ind w:left="0" w:right="0" w:firstLine="0"/>
               <w:jc w:val="left"/>
             </w:pPr>
             <w:r>
@@ -2528,15 +2565,16 @@
       <w:tr>
         <w:trPr>
           <w:cantSplit/>
+          <w:trHeight w:val="518" w:hRule="atLeast"/>
         </w:trPr>
         <w:tc>
           <w:tcPr>
-            <w:tcW w:type="dxa" w:w="1800"/>
+            <w:tcW w:type="dxa" w:w="2088"/>
             <w:tcMar>
-              <w:top w:w="65" w:type="dxa"/>
-              <w:start w:w="80" w:type="dxa"/>
-              <w:bottom w:w="65" w:type="dxa"/>
-              <w:end w:w="80" w:type="dxa"/>
+              <w:top w:w="100" w:type="dxa"/>
+              <w:start w:w="100" w:type="dxa"/>
+              <w:bottom w:w="100" w:type="dxa"/>
+              <w:end w:w="100" w:type="dxa"/>
             </w:tcMar>
             <w:tcBorders>
               <w:top w:val="single" w:sz="4" w:color="B8C2CC"/>
@@ -2549,8 +2587,9 @@
           </w:tcPr>
           <w:p>
             <w:pPr>
-              <w:spacing w:line="240" w:lineRule="auto"/>
-              <w:jc w:val="left"/>
+              <w:spacing w:line="240" w:lineRule="auto" w:before="0" w:after="0"/>
+              <w:ind w:left="0" w:right="0" w:firstLine="0"/>
+              <w:jc w:val="center"/>
             </w:pPr>
             <w:r>
               <w:rPr>
@@ -2567,10 +2606,10 @@
           <w:tcPr>
             <w:tcW w:type="dxa" w:w="3240"/>
             <w:tcMar>
-              <w:top w:w="65" w:type="dxa"/>
-              <w:start w:w="80" w:type="dxa"/>
-              <w:bottom w:w="65" w:type="dxa"/>
-              <w:end w:w="80" w:type="dxa"/>
+              <w:top w:w="100" w:type="dxa"/>
+              <w:start w:w="100" w:type="dxa"/>
+              <w:bottom w:w="100" w:type="dxa"/>
+              <w:end w:w="100" w:type="dxa"/>
             </w:tcMar>
             <w:tcBorders>
               <w:top w:val="single" w:sz="4" w:color="B8C2CC"/>
@@ -2583,7 +2622,8 @@
           </w:tcPr>
           <w:p>
             <w:pPr>
-              <w:spacing w:line="240" w:lineRule="auto"/>
+              <w:spacing w:line="240" w:lineRule="auto" w:before="0" w:after="0"/>
+              <w:ind w:left="0" w:right="0" w:firstLine="0"/>
               <w:jc w:val="left"/>
             </w:pPr>
             <w:r>
@@ -2599,12 +2639,12 @@
         </w:tc>
         <w:tc>
           <w:tcPr>
-            <w:tcW w:type="dxa" w:w="3024"/>
+            <w:tcW w:type="dxa" w:w="2880"/>
             <w:tcMar>
-              <w:top w:w="65" w:type="dxa"/>
-              <w:start w:w="80" w:type="dxa"/>
-              <w:bottom w:w="65" w:type="dxa"/>
-              <w:end w:w="80" w:type="dxa"/>
+              <w:top w:w="100" w:type="dxa"/>
+              <w:start w:w="100" w:type="dxa"/>
+              <w:bottom w:w="100" w:type="dxa"/>
+              <w:end w:w="100" w:type="dxa"/>
             </w:tcMar>
             <w:tcBorders>
               <w:top w:val="single" w:sz="4" w:color="B8C2CC"/>
@@ -2617,7 +2657,8 @@
           </w:tcPr>
           <w:p>
             <w:pPr>
-              <w:spacing w:line="240" w:lineRule="auto"/>
+              <w:spacing w:line="240" w:lineRule="auto" w:before="0" w:after="0"/>
+              <w:ind w:left="0" w:right="0" w:firstLine="0"/>
               <w:jc w:val="left"/>
             </w:pPr>
             <w:r>
@@ -2635,15 +2676,16 @@
       <w:tr>
         <w:trPr>
           <w:cantSplit/>
+          <w:trHeight w:val="518" w:hRule="atLeast"/>
         </w:trPr>
         <w:tc>
           <w:tcPr>
-            <w:tcW w:type="dxa" w:w="1800"/>
+            <w:tcW w:type="dxa" w:w="2088"/>
             <w:tcMar>
-              <w:top w:w="65" w:type="dxa"/>
-              <w:start w:w="80" w:type="dxa"/>
-              <w:bottom w:w="65" w:type="dxa"/>
-              <w:end w:w="80" w:type="dxa"/>
+              <w:top w:w="100" w:type="dxa"/>
+              <w:start w:w="100" w:type="dxa"/>
+              <w:bottom w:w="100" w:type="dxa"/>
+              <w:end w:w="100" w:type="dxa"/>
             </w:tcMar>
             <w:tcBorders>
               <w:top w:val="single" w:sz="4" w:color="B8C2CC"/>
@@ -2655,8 +2697,9 @@
           </w:tcPr>
           <w:p>
             <w:pPr>
-              <w:spacing w:line="240" w:lineRule="auto"/>
-              <w:jc w:val="left"/>
+              <w:spacing w:line="240" w:lineRule="auto" w:before="0" w:after="0"/>
+              <w:ind w:left="0" w:right="0" w:firstLine="0"/>
+              <w:jc w:val="center"/>
             </w:pPr>
             <w:r>
               <w:rPr>
@@ -2673,10 +2716,10 @@
           <w:tcPr>
             <w:tcW w:type="dxa" w:w="3240"/>
             <w:tcMar>
-              <w:top w:w="65" w:type="dxa"/>
-              <w:start w:w="80" w:type="dxa"/>
-              <w:bottom w:w="65" w:type="dxa"/>
-              <w:end w:w="80" w:type="dxa"/>
+              <w:top w:w="100" w:type="dxa"/>
+              <w:start w:w="100" w:type="dxa"/>
+              <w:bottom w:w="100" w:type="dxa"/>
+              <w:end w:w="100" w:type="dxa"/>
             </w:tcMar>
             <w:tcBorders>
               <w:top w:val="single" w:sz="4" w:color="B8C2CC"/>
@@ -2688,7 +2731,8 @@
           </w:tcPr>
           <w:p>
             <w:pPr>
-              <w:spacing w:line="240" w:lineRule="auto"/>
+              <w:spacing w:line="240" w:lineRule="auto" w:before="0" w:after="0"/>
+              <w:ind w:left="0" w:right="0" w:firstLine="0"/>
               <w:jc w:val="left"/>
             </w:pPr>
             <w:r>
@@ -2704,12 +2748,12 @@
         </w:tc>
         <w:tc>
           <w:tcPr>
-            <w:tcW w:type="dxa" w:w="3024"/>
+            <w:tcW w:type="dxa" w:w="2880"/>
             <w:tcMar>
-              <w:top w:w="65" w:type="dxa"/>
-              <w:start w:w="80" w:type="dxa"/>
-              <w:bottom w:w="65" w:type="dxa"/>
-              <w:end w:w="80" w:type="dxa"/>
+              <w:top w:w="100" w:type="dxa"/>
+              <w:start w:w="100" w:type="dxa"/>
+              <w:bottom w:w="100" w:type="dxa"/>
+              <w:end w:w="100" w:type="dxa"/>
             </w:tcMar>
             <w:tcBorders>
               <w:top w:val="single" w:sz="4" w:color="B8C2CC"/>
@@ -2721,7 +2765,8 @@
           </w:tcPr>
           <w:p>
             <w:pPr>
-              <w:spacing w:line="240" w:lineRule="auto"/>
+              <w:spacing w:line="240" w:lineRule="auto" w:before="0" w:after="0"/>
+              <w:ind w:left="0" w:right="0" w:firstLine="0"/>
               <w:jc w:val="left"/>
             </w:pPr>
             <w:r>
@@ -2739,15 +2784,16 @@
       <w:tr>
         <w:trPr>
           <w:cantSplit/>
+          <w:trHeight w:val="518" w:hRule="atLeast"/>
         </w:trPr>
         <w:tc>
           <w:tcPr>
-            <w:tcW w:type="dxa" w:w="1800"/>
+            <w:tcW w:type="dxa" w:w="2088"/>
             <w:tcMar>
-              <w:top w:w="65" w:type="dxa"/>
-              <w:start w:w="80" w:type="dxa"/>
-              <w:bottom w:w="65" w:type="dxa"/>
-              <w:end w:w="80" w:type="dxa"/>
+              <w:top w:w="100" w:type="dxa"/>
+              <w:start w:w="100" w:type="dxa"/>
+              <w:bottom w:w="100" w:type="dxa"/>
+              <w:end w:w="100" w:type="dxa"/>
             </w:tcMar>
             <w:tcBorders>
               <w:top w:val="single" w:sz="4" w:color="B8C2CC"/>
@@ -2760,8 +2806,9 @@
           </w:tcPr>
           <w:p>
             <w:pPr>
-              <w:spacing w:line="240" w:lineRule="auto"/>
-              <w:jc w:val="left"/>
+              <w:spacing w:line="240" w:lineRule="auto" w:before="0" w:after="0"/>
+              <w:ind w:left="0" w:right="0" w:firstLine="0"/>
+              <w:jc w:val="center"/>
             </w:pPr>
             <w:r>
               <w:rPr>
@@ -2778,10 +2825,10 @@
           <w:tcPr>
             <w:tcW w:type="dxa" w:w="3240"/>
             <w:tcMar>
-              <w:top w:w="65" w:type="dxa"/>
-              <w:start w:w="80" w:type="dxa"/>
-              <w:bottom w:w="65" w:type="dxa"/>
-              <w:end w:w="80" w:type="dxa"/>
+              <w:top w:w="100" w:type="dxa"/>
+              <w:start w:w="100" w:type="dxa"/>
+              <w:bottom w:w="100" w:type="dxa"/>
+              <w:end w:w="100" w:type="dxa"/>
             </w:tcMar>
             <w:tcBorders>
               <w:top w:val="single" w:sz="4" w:color="B8C2CC"/>
@@ -2794,7 +2841,8 @@
           </w:tcPr>
           <w:p>
             <w:pPr>
-              <w:spacing w:line="240" w:lineRule="auto"/>
+              <w:spacing w:line="240" w:lineRule="auto" w:before="0" w:after="0"/>
+              <w:ind w:left="0" w:right="0" w:firstLine="0"/>
               <w:jc w:val="left"/>
             </w:pPr>
             <w:r>
@@ -2810,12 +2858,12 @@
         </w:tc>
         <w:tc>
           <w:tcPr>
-            <w:tcW w:type="dxa" w:w="3024"/>
+            <w:tcW w:type="dxa" w:w="2880"/>
             <w:tcMar>
-              <w:top w:w="65" w:type="dxa"/>
-              <w:start w:w="80" w:type="dxa"/>
-              <w:bottom w:w="65" w:type="dxa"/>
-              <w:end w:w="80" w:type="dxa"/>
+              <w:top w:w="100" w:type="dxa"/>
+              <w:start w:w="100" w:type="dxa"/>
+              <w:bottom w:w="100" w:type="dxa"/>
+              <w:end w:w="100" w:type="dxa"/>
             </w:tcMar>
             <w:tcBorders>
               <w:top w:val="single" w:sz="4" w:color="B8C2CC"/>
@@ -2828,7 +2876,8 @@
           </w:tcPr>
           <w:p>
             <w:pPr>
-              <w:spacing w:line="240" w:lineRule="auto"/>
+              <w:spacing w:line="240" w:lineRule="auto" w:before="0" w:after="0"/>
+              <w:ind w:left="0" w:right="0" w:firstLine="0"/>
               <w:jc w:val="left"/>
             </w:pPr>
             <w:r>
@@ -2846,15 +2895,16 @@
       <w:tr>
         <w:trPr>
           <w:cantSplit/>
+          <w:trHeight w:val="518" w:hRule="atLeast"/>
         </w:trPr>
         <w:tc>
           <w:tcPr>
-            <w:tcW w:type="dxa" w:w="1800"/>
+            <w:tcW w:type="dxa" w:w="2088"/>
             <w:tcMar>
-              <w:top w:w="65" w:type="dxa"/>
-              <w:start w:w="80" w:type="dxa"/>
-              <w:bottom w:w="65" w:type="dxa"/>
-              <w:end w:w="80" w:type="dxa"/>
+              <w:top w:w="100" w:type="dxa"/>
+              <w:start w:w="100" w:type="dxa"/>
+              <w:bottom w:w="100" w:type="dxa"/>
+              <w:end w:w="100" w:type="dxa"/>
             </w:tcMar>
             <w:tcBorders>
               <w:top w:val="single" w:sz="4" w:color="B8C2CC"/>
@@ -2866,8 +2916,9 @@
           </w:tcPr>
           <w:p>
             <w:pPr>
-              <w:spacing w:line="240" w:lineRule="auto"/>
-              <w:jc w:val="left"/>
+              <w:spacing w:line="240" w:lineRule="auto" w:before="0" w:after="0"/>
+              <w:ind w:left="0" w:right="0" w:firstLine="0"/>
+              <w:jc w:val="center"/>
             </w:pPr>
             <w:r>
               <w:rPr>
@@ -2884,10 +2935,10 @@
           <w:tcPr>
             <w:tcW w:type="dxa" w:w="3240"/>
             <w:tcMar>
-              <w:top w:w="65" w:type="dxa"/>
-              <w:start w:w="80" w:type="dxa"/>
-              <w:bottom w:w="65" w:type="dxa"/>
-              <w:end w:w="80" w:type="dxa"/>
+              <w:top w:w="100" w:type="dxa"/>
+              <w:start w:w="100" w:type="dxa"/>
+              <w:bottom w:w="100" w:type="dxa"/>
+              <w:end w:w="100" w:type="dxa"/>
             </w:tcMar>
             <w:tcBorders>
               <w:top w:val="single" w:sz="4" w:color="B8C2CC"/>
@@ -2899,7 +2950,8 @@
           </w:tcPr>
           <w:p>
             <w:pPr>
-              <w:spacing w:line="240" w:lineRule="auto"/>
+              <w:spacing w:line="240" w:lineRule="auto" w:before="0" w:after="0"/>
+              <w:ind w:left="0" w:right="0" w:firstLine="0"/>
               <w:jc w:val="left"/>
             </w:pPr>
             <w:r>
@@ -2915,12 +2967,12 @@
         </w:tc>
         <w:tc>
           <w:tcPr>
-            <w:tcW w:type="dxa" w:w="3024"/>
+            <w:tcW w:type="dxa" w:w="2880"/>
             <w:tcMar>
-              <w:top w:w="65" w:type="dxa"/>
-              <w:start w:w="80" w:type="dxa"/>
-              <w:bottom w:w="65" w:type="dxa"/>
-              <w:end w:w="80" w:type="dxa"/>
+              <w:top w:w="100" w:type="dxa"/>
+              <w:start w:w="100" w:type="dxa"/>
+              <w:bottom w:w="100" w:type="dxa"/>
+              <w:end w:w="100" w:type="dxa"/>
             </w:tcMar>
             <w:tcBorders>
               <w:top w:val="single" w:sz="4" w:color="B8C2CC"/>
@@ -2932,7 +2984,8 @@
           </w:tcPr>
           <w:p>
             <w:pPr>
-              <w:spacing w:line="240" w:lineRule="auto"/>
+              <w:spacing w:line="240" w:lineRule="auto" w:before="0" w:after="0"/>
+              <w:ind w:left="0" w:right="0" w:firstLine="0"/>
               <w:jc w:val="left"/>
             </w:pPr>
             <w:r>
@@ -2988,7 +3041,7 @@
     </w:p>
     <w:tbl>
       <w:tblPr>
-        <w:tblW w:type="auto" w:w="0"/>
+        <w:tblW w:type="dxa" w:w="8928"/>
         <w:jc w:val="center"/>
         <w:tblLayout w:type="fixed"/>
         <w:tblLook w:firstColumn="1" w:firstRow="1" w:lastColumn="0" w:lastRow="0" w:noHBand="0" w:noVBand="1" w:val="04A0"/>
@@ -3003,6 +3056,7 @@
       </w:tblGrid>
       <w:tr>
         <w:trPr>
+          <w:trHeight w:val="490" w:hRule="atLeast"/>
           <w:tblHeader w:val="true"/>
           <w:cantSplit/>
         </w:trPr>
@@ -3011,10 +3065,10 @@
             <w:tcW w:type="dxa" w:w="1584"/>
             <w:shd w:fill="163A5F"/>
             <w:tcMar>
-              <w:top w:w="70" w:type="dxa"/>
-              <w:start w:w="80" w:type="dxa"/>
-              <w:bottom w:w="70" w:type="dxa"/>
-              <w:end w:w="80" w:type="dxa"/>
+              <w:top w:w="100" w:type="dxa"/>
+              <w:start w:w="100" w:type="dxa"/>
+              <w:bottom w:w="100" w:type="dxa"/>
+              <w:end w:w="100" w:type="dxa"/>
             </w:tcMar>
             <w:tcBorders>
               <w:top w:val="single" w:sz="6" w:color="163A5F"/>
@@ -3025,6 +3079,11 @@
             <w:vAlign w:val="center"/>
           </w:tcPr>
           <w:p>
+            <w:pPr>
+              <w:spacing w:before="0" w:after="0" w:line="240" w:lineRule="auto"/>
+              <w:ind w:left="0" w:right="0" w:firstLine="0"/>
+              <w:jc w:val="center"/>
+            </w:pPr>
             <w:r>
               <w:rPr>
                 <w:rFonts w:ascii="Times New Roman" w:hAnsi="Times New Roman" w:eastAsia="Times New Roman"/>
@@ -3041,10 +3100,10 @@
             <w:tcW w:type="dxa" w:w="1296"/>
             <w:shd w:fill="163A5F"/>
             <w:tcMar>
-              <w:top w:w="70" w:type="dxa"/>
-              <w:start w:w="80" w:type="dxa"/>
-              <w:bottom w:w="70" w:type="dxa"/>
-              <w:end w:w="80" w:type="dxa"/>
+              <w:top w:w="100" w:type="dxa"/>
+              <w:start w:w="100" w:type="dxa"/>
+              <w:bottom w:w="100" w:type="dxa"/>
+              <w:end w:w="100" w:type="dxa"/>
             </w:tcMar>
             <w:tcBorders>
               <w:top w:val="single" w:sz="6" w:color="163A5F"/>
@@ -3055,6 +3114,11 @@
             <w:vAlign w:val="center"/>
           </w:tcPr>
           <w:p>
+            <w:pPr>
+              <w:spacing w:before="0" w:after="0" w:line="240" w:lineRule="auto"/>
+              <w:ind w:left="0" w:right="0" w:firstLine="0"/>
+              <w:jc w:val="center"/>
+            </w:pPr>
             <w:r>
               <w:rPr>
                 <w:rFonts w:ascii="Times New Roman" w:hAnsi="Times New Roman" w:eastAsia="Times New Roman"/>
@@ -3071,10 +3135,10 @@
             <w:tcW w:type="dxa" w:w="1584"/>
             <w:shd w:fill="163A5F"/>
             <w:tcMar>
-              <w:top w:w="70" w:type="dxa"/>
-              <w:start w:w="80" w:type="dxa"/>
-              <w:bottom w:w="70" w:type="dxa"/>
-              <w:end w:w="80" w:type="dxa"/>
+              <w:top w:w="100" w:type="dxa"/>
+              <w:start w:w="100" w:type="dxa"/>
+              <w:bottom w:w="100" w:type="dxa"/>
+              <w:end w:w="100" w:type="dxa"/>
             </w:tcMar>
             <w:tcBorders>
               <w:top w:val="single" w:sz="6" w:color="163A5F"/>
@@ -3085,6 +3149,11 @@
             <w:vAlign w:val="center"/>
           </w:tcPr>
           <w:p>
+            <w:pPr>
+              <w:spacing w:before="0" w:after="0" w:line="240" w:lineRule="auto"/>
+              <w:ind w:left="0" w:right="0" w:firstLine="0"/>
+              <w:jc w:val="center"/>
+            </w:pPr>
             <w:r>
               <w:rPr>
                 <w:rFonts w:ascii="Times New Roman" w:hAnsi="Times New Roman" w:eastAsia="Times New Roman"/>
@@ -3101,10 +3170,10 @@
             <w:tcW w:type="dxa" w:w="1296"/>
             <w:shd w:fill="163A5F"/>
             <w:tcMar>
-              <w:top w:w="70" w:type="dxa"/>
-              <w:start w:w="80" w:type="dxa"/>
-              <w:bottom w:w="70" w:type="dxa"/>
-              <w:end w:w="80" w:type="dxa"/>
+              <w:top w:w="100" w:type="dxa"/>
+              <w:start w:w="100" w:type="dxa"/>
+              <w:bottom w:w="100" w:type="dxa"/>
+              <w:end w:w="100" w:type="dxa"/>
             </w:tcMar>
             <w:tcBorders>
               <w:top w:val="single" w:sz="6" w:color="163A5F"/>
@@ -3115,6 +3184,11 @@
             <w:vAlign w:val="center"/>
           </w:tcPr>
           <w:p>
+            <w:pPr>
+              <w:spacing w:before="0" w:after="0" w:line="240" w:lineRule="auto"/>
+              <w:ind w:left="0" w:right="0" w:firstLine="0"/>
+              <w:jc w:val="center"/>
+            </w:pPr>
             <w:r>
               <w:rPr>
                 <w:rFonts w:ascii="Times New Roman" w:hAnsi="Times New Roman" w:eastAsia="Times New Roman"/>
@@ -3131,10 +3205,10 @@
             <w:tcW w:type="dxa" w:w="1368"/>
             <w:shd w:fill="163A5F"/>
             <w:tcMar>
-              <w:top w:w="70" w:type="dxa"/>
-              <w:start w:w="80" w:type="dxa"/>
-              <w:bottom w:w="70" w:type="dxa"/>
-              <w:end w:w="80" w:type="dxa"/>
+              <w:top w:w="100" w:type="dxa"/>
+              <w:start w:w="100" w:type="dxa"/>
+              <w:bottom w:w="100" w:type="dxa"/>
+              <w:end w:w="100" w:type="dxa"/>
             </w:tcMar>
             <w:tcBorders>
               <w:top w:val="single" w:sz="6" w:color="163A5F"/>
@@ -3145,6 +3219,11 @@
             <w:vAlign w:val="center"/>
           </w:tcPr>
           <w:p>
+            <w:pPr>
+              <w:spacing w:before="0" w:after="0" w:line="240" w:lineRule="auto"/>
+              <w:ind w:left="0" w:right="0" w:firstLine="0"/>
+              <w:jc w:val="center"/>
+            </w:pPr>
             <w:r>
               <w:rPr>
                 <w:rFonts w:ascii="Times New Roman" w:hAnsi="Times New Roman" w:eastAsia="Times New Roman"/>
@@ -3161,10 +3240,10 @@
             <w:tcW w:type="dxa" w:w="1800"/>
             <w:shd w:fill="163A5F"/>
             <w:tcMar>
-              <w:top w:w="70" w:type="dxa"/>
-              <w:start w:w="80" w:type="dxa"/>
-              <w:bottom w:w="70" w:type="dxa"/>
-              <w:end w:w="80" w:type="dxa"/>
+              <w:top w:w="100" w:type="dxa"/>
+              <w:start w:w="100" w:type="dxa"/>
+              <w:bottom w:w="100" w:type="dxa"/>
+              <w:end w:w="100" w:type="dxa"/>
             </w:tcMar>
             <w:tcBorders>
               <w:top w:val="single" w:sz="6" w:color="163A5F"/>
@@ -3175,6 +3254,11 @@
             <w:vAlign w:val="center"/>
           </w:tcPr>
           <w:p>
+            <w:pPr>
+              <w:spacing w:before="0" w:after="0" w:line="240" w:lineRule="auto"/>
+              <w:ind w:left="0" w:right="0" w:firstLine="0"/>
+              <w:jc w:val="center"/>
+            </w:pPr>
             <w:r>
               <w:rPr>
                 <w:rFonts w:ascii="Times New Roman" w:hAnsi="Times New Roman" w:eastAsia="Times New Roman"/>
@@ -3190,15 +3274,16 @@
       <w:tr>
         <w:trPr>
           <w:cantSplit/>
+          <w:trHeight w:val="490" w:hRule="atLeast"/>
         </w:trPr>
         <w:tc>
           <w:tcPr>
             <w:tcW w:type="dxa" w:w="1584"/>
             <w:tcMar>
-              <w:top w:w="65" w:type="dxa"/>
-              <w:start w:w="80" w:type="dxa"/>
-              <w:bottom w:w="65" w:type="dxa"/>
-              <w:end w:w="80" w:type="dxa"/>
+              <w:top w:w="100" w:type="dxa"/>
+              <w:start w:w="100" w:type="dxa"/>
+              <w:bottom w:w="100" w:type="dxa"/>
+              <w:end w:w="100" w:type="dxa"/>
             </w:tcMar>
             <w:tcBorders>
               <w:top w:val="single" w:sz="4" w:color="B8C2CC"/>
@@ -3211,8 +3296,9 @@
           </w:tcPr>
           <w:p>
             <w:pPr>
-              <w:spacing w:line="240" w:lineRule="auto"/>
-              <w:jc w:val="left"/>
+              <w:spacing w:line="240" w:lineRule="auto" w:before="0" w:after="0"/>
+              <w:ind w:left="0" w:right="0" w:firstLine="0"/>
+              <w:jc w:val="center"/>
             </w:pPr>
             <w:r>
               <w:rPr>
@@ -3229,10 +3315,10 @@
           <w:tcPr>
             <w:tcW w:type="dxa" w:w="1296"/>
             <w:tcMar>
-              <w:top w:w="65" w:type="dxa"/>
-              <w:start w:w="80" w:type="dxa"/>
-              <w:bottom w:w="65" w:type="dxa"/>
-              <w:end w:w="80" w:type="dxa"/>
+              <w:top w:w="100" w:type="dxa"/>
+              <w:start w:w="100" w:type="dxa"/>
+              <w:bottom w:w="100" w:type="dxa"/>
+              <w:end w:w="100" w:type="dxa"/>
             </w:tcMar>
             <w:tcBorders>
               <w:top w:val="single" w:sz="4" w:color="B8C2CC"/>
@@ -3245,8 +3331,9 @@
           </w:tcPr>
           <w:p>
             <w:pPr>
-              <w:spacing w:line="240" w:lineRule="auto"/>
-              <w:jc w:val="left"/>
+              <w:spacing w:line="240" w:lineRule="auto" w:before="0" w:after="0"/>
+              <w:ind w:left="0" w:right="0" w:firstLine="0"/>
+              <w:jc w:val="center"/>
             </w:pPr>
             <w:r>
               <w:rPr>
@@ -3263,10 +3350,10 @@
           <w:tcPr>
             <w:tcW w:type="dxa" w:w="1584"/>
             <w:tcMar>
-              <w:top w:w="65" w:type="dxa"/>
-              <w:start w:w="80" w:type="dxa"/>
-              <w:bottom w:w="65" w:type="dxa"/>
-              <w:end w:w="80" w:type="dxa"/>
+              <w:top w:w="100" w:type="dxa"/>
+              <w:start w:w="100" w:type="dxa"/>
+              <w:bottom w:w="100" w:type="dxa"/>
+              <w:end w:w="100" w:type="dxa"/>
             </w:tcMar>
             <w:tcBorders>
               <w:top w:val="single" w:sz="4" w:color="B8C2CC"/>
@@ -3279,8 +3366,9 @@
           </w:tcPr>
           <w:p>
             <w:pPr>
-              <w:spacing w:line="240" w:lineRule="auto"/>
-              <w:jc w:val="left"/>
+              <w:spacing w:line="240" w:lineRule="auto" w:before="0" w:after="0"/>
+              <w:ind w:left="0" w:right="0" w:firstLine="0"/>
+              <w:jc w:val="center"/>
             </w:pPr>
             <w:r>
               <w:rPr>
@@ -3297,10 +3385,10 @@
           <w:tcPr>
             <w:tcW w:type="dxa" w:w="1296"/>
             <w:tcMar>
-              <w:top w:w="65" w:type="dxa"/>
-              <w:start w:w="80" w:type="dxa"/>
-              <w:bottom w:w="65" w:type="dxa"/>
-              <w:end w:w="80" w:type="dxa"/>
+              <w:top w:w="100" w:type="dxa"/>
+              <w:start w:w="100" w:type="dxa"/>
+              <w:bottom w:w="100" w:type="dxa"/>
+              <w:end w:w="100" w:type="dxa"/>
             </w:tcMar>
             <w:tcBorders>
               <w:top w:val="single" w:sz="4" w:color="B8C2CC"/>
@@ -3313,8 +3401,9 @@
           </w:tcPr>
           <w:p>
             <w:pPr>
-              <w:spacing w:line="240" w:lineRule="auto"/>
-              <w:jc w:val="left"/>
+              <w:spacing w:line="240" w:lineRule="auto" w:before="0" w:after="0"/>
+              <w:ind w:left="0" w:right="0" w:firstLine="0"/>
+              <w:jc w:val="center"/>
             </w:pPr>
             <w:r>
               <w:rPr>
@@ -3331,10 +3420,10 @@
           <w:tcPr>
             <w:tcW w:type="dxa" w:w="1368"/>
             <w:tcMar>
-              <w:top w:w="65" w:type="dxa"/>
-              <w:start w:w="80" w:type="dxa"/>
-              <w:bottom w:w="65" w:type="dxa"/>
-              <w:end w:w="80" w:type="dxa"/>
+              <w:top w:w="100" w:type="dxa"/>
+              <w:start w:w="100" w:type="dxa"/>
+              <w:bottom w:w="100" w:type="dxa"/>
+              <w:end w:w="100" w:type="dxa"/>
             </w:tcMar>
             <w:tcBorders>
               <w:top w:val="single" w:sz="4" w:color="B8C2CC"/>
@@ -3347,8 +3436,9 @@
           </w:tcPr>
           <w:p>
             <w:pPr>
-              <w:spacing w:line="240" w:lineRule="auto"/>
-              <w:jc w:val="left"/>
+              <w:spacing w:line="240" w:lineRule="auto" w:before="0" w:after="0"/>
+              <w:ind w:left="0" w:right="0" w:firstLine="0"/>
+              <w:jc w:val="center"/>
             </w:pPr>
             <w:r>
               <w:rPr>
@@ -3365,10 +3455,10 @@
           <w:tcPr>
             <w:tcW w:type="dxa" w:w="1800"/>
             <w:tcMar>
-              <w:top w:w="65" w:type="dxa"/>
-              <w:start w:w="80" w:type="dxa"/>
-              <w:bottom w:w="65" w:type="dxa"/>
-              <w:end w:w="80" w:type="dxa"/>
+              <w:top w:w="100" w:type="dxa"/>
+              <w:start w:w="100" w:type="dxa"/>
+              <w:bottom w:w="100" w:type="dxa"/>
+              <w:end w:w="100" w:type="dxa"/>
             </w:tcMar>
             <w:tcBorders>
               <w:top w:val="single" w:sz="4" w:color="B8C2CC"/>
@@ -3381,8 +3471,9 @@
           </w:tcPr>
           <w:p>
             <w:pPr>
-              <w:spacing w:line="240" w:lineRule="auto"/>
-              <w:jc w:val="left"/>
+              <w:spacing w:line="240" w:lineRule="auto" w:before="0" w:after="0"/>
+              <w:ind w:left="0" w:right="0" w:firstLine="0"/>
+              <w:jc w:val="center"/>
             </w:pPr>
             <w:r>
               <w:rPr>
@@ -3399,15 +3490,16 @@
       <w:tr>
         <w:trPr>
           <w:cantSplit/>
+          <w:trHeight w:val="490" w:hRule="atLeast"/>
         </w:trPr>
         <w:tc>
           <w:tcPr>
             <w:tcW w:type="dxa" w:w="1584"/>
             <w:tcMar>
-              <w:top w:w="65" w:type="dxa"/>
-              <w:start w:w="80" w:type="dxa"/>
-              <w:bottom w:w="65" w:type="dxa"/>
-              <w:end w:w="80" w:type="dxa"/>
+              <w:top w:w="100" w:type="dxa"/>
+              <w:start w:w="100" w:type="dxa"/>
+              <w:bottom w:w="100" w:type="dxa"/>
+              <w:end w:w="100" w:type="dxa"/>
             </w:tcMar>
             <w:tcBorders>
               <w:top w:val="single" w:sz="4" w:color="B8C2CC"/>
@@ -3419,8 +3511,9 @@
           </w:tcPr>
           <w:p>
             <w:pPr>
-              <w:spacing w:line="240" w:lineRule="auto"/>
-              <w:jc w:val="left"/>
+              <w:spacing w:line="240" w:lineRule="auto" w:before="0" w:after="0"/>
+              <w:ind w:left="0" w:right="0" w:firstLine="0"/>
+              <w:jc w:val="center"/>
             </w:pPr>
             <w:r>
               <w:rPr>
@@ -3437,10 +3530,10 @@
           <w:tcPr>
             <w:tcW w:type="dxa" w:w="1296"/>
             <w:tcMar>
-              <w:top w:w="65" w:type="dxa"/>
-              <w:start w:w="80" w:type="dxa"/>
-              <w:bottom w:w="65" w:type="dxa"/>
-              <w:end w:w="80" w:type="dxa"/>
+              <w:top w:w="100" w:type="dxa"/>
+              <w:start w:w="100" w:type="dxa"/>
+              <w:bottom w:w="100" w:type="dxa"/>
+              <w:end w:w="100" w:type="dxa"/>
             </w:tcMar>
             <w:tcBorders>
               <w:top w:val="single" w:sz="4" w:color="B8C2CC"/>
@@ -3452,8 +3545,9 @@
           </w:tcPr>
           <w:p>
             <w:pPr>
-              <w:spacing w:line="240" w:lineRule="auto"/>
-              <w:jc w:val="left"/>
+              <w:spacing w:line="240" w:lineRule="auto" w:before="0" w:after="0"/>
+              <w:ind w:left="0" w:right="0" w:firstLine="0"/>
+              <w:jc w:val="center"/>
             </w:pPr>
             <w:r>
               <w:rPr>
@@ -3470,10 +3564,10 @@
           <w:tcPr>
             <w:tcW w:type="dxa" w:w="1584"/>
             <w:tcMar>
-              <w:top w:w="65" w:type="dxa"/>
-              <w:start w:w="80" w:type="dxa"/>
-              <w:bottom w:w="65" w:type="dxa"/>
-              <w:end w:w="80" w:type="dxa"/>
+              <w:top w:w="100" w:type="dxa"/>
+              <w:start w:w="100" w:type="dxa"/>
+              <w:bottom w:w="100" w:type="dxa"/>
+              <w:end w:w="100" w:type="dxa"/>
             </w:tcMar>
             <w:tcBorders>
               <w:top w:val="single" w:sz="4" w:color="B8C2CC"/>
@@ -3485,8 +3579,9 @@
           </w:tcPr>
           <w:p>
             <w:pPr>
-              <w:spacing w:line="240" w:lineRule="auto"/>
-              <w:jc w:val="left"/>
+              <w:spacing w:line="240" w:lineRule="auto" w:before="0" w:after="0"/>
+              <w:ind w:left="0" w:right="0" w:firstLine="0"/>
+              <w:jc w:val="center"/>
             </w:pPr>
             <w:r>
               <w:rPr>
@@ -3503,10 +3598,10 @@
           <w:tcPr>
             <w:tcW w:type="dxa" w:w="1296"/>
             <w:tcMar>
-              <w:top w:w="65" w:type="dxa"/>
-              <w:start w:w="80" w:type="dxa"/>
-              <w:bottom w:w="65" w:type="dxa"/>
-              <w:end w:w="80" w:type="dxa"/>
+              <w:top w:w="100" w:type="dxa"/>
+              <w:start w:w="100" w:type="dxa"/>
+              <w:bottom w:w="100" w:type="dxa"/>
+              <w:end w:w="100" w:type="dxa"/>
             </w:tcMar>
             <w:tcBorders>
               <w:top w:val="single" w:sz="4" w:color="B8C2CC"/>
@@ -3518,8 +3613,9 @@
           </w:tcPr>
           <w:p>
             <w:pPr>
-              <w:spacing w:line="240" w:lineRule="auto"/>
-              <w:jc w:val="left"/>
+              <w:spacing w:line="240" w:lineRule="auto" w:before="0" w:after="0"/>
+              <w:ind w:left="0" w:right="0" w:firstLine="0"/>
+              <w:jc w:val="center"/>
             </w:pPr>
             <w:r>
               <w:rPr>
@@ -3536,10 +3632,10 @@
           <w:tcPr>
             <w:tcW w:type="dxa" w:w="1368"/>
             <w:tcMar>
-              <w:top w:w="65" w:type="dxa"/>
-              <w:start w:w="80" w:type="dxa"/>
-              <w:bottom w:w="65" w:type="dxa"/>
-              <w:end w:w="80" w:type="dxa"/>
+              <w:top w:w="100" w:type="dxa"/>
+              <w:start w:w="100" w:type="dxa"/>
+              <w:bottom w:w="100" w:type="dxa"/>
+              <w:end w:w="100" w:type="dxa"/>
             </w:tcMar>
             <w:tcBorders>
               <w:top w:val="single" w:sz="4" w:color="B8C2CC"/>
@@ -3551,8 +3647,9 @@
           </w:tcPr>
           <w:p>
             <w:pPr>
-              <w:spacing w:line="240" w:lineRule="auto"/>
-              <w:jc w:val="left"/>
+              <w:spacing w:line="240" w:lineRule="auto" w:before="0" w:after="0"/>
+              <w:ind w:left="0" w:right="0" w:firstLine="0"/>
+              <w:jc w:val="center"/>
             </w:pPr>
             <w:r>
               <w:rPr>
@@ -3569,10 +3666,10 @@
           <w:tcPr>
             <w:tcW w:type="dxa" w:w="1800"/>
             <w:tcMar>
-              <w:top w:w="65" w:type="dxa"/>
-              <w:start w:w="80" w:type="dxa"/>
-              <w:bottom w:w="65" w:type="dxa"/>
-              <w:end w:w="80" w:type="dxa"/>
+              <w:top w:w="100" w:type="dxa"/>
+              <w:start w:w="100" w:type="dxa"/>
+              <w:bottom w:w="100" w:type="dxa"/>
+              <w:end w:w="100" w:type="dxa"/>
             </w:tcMar>
             <w:tcBorders>
               <w:top w:val="single" w:sz="4" w:color="B8C2CC"/>
@@ -3584,8 +3681,9 @@
           </w:tcPr>
           <w:p>
             <w:pPr>
-              <w:spacing w:line="240" w:lineRule="auto"/>
-              <w:jc w:val="left"/>
+              <w:spacing w:line="240" w:lineRule="auto" w:before="0" w:after="0"/>
+              <w:ind w:left="0" w:right="0" w:firstLine="0"/>
+              <w:jc w:val="center"/>
             </w:pPr>
             <w:r>
               <w:rPr>
@@ -3602,15 +3700,16 @@
       <w:tr>
         <w:trPr>
           <w:cantSplit/>
+          <w:trHeight w:val="490" w:hRule="atLeast"/>
         </w:trPr>
         <w:tc>
           <w:tcPr>
             <w:tcW w:type="dxa" w:w="1584"/>
             <w:tcMar>
-              <w:top w:w="65" w:type="dxa"/>
-              <w:start w:w="80" w:type="dxa"/>
-              <w:bottom w:w="65" w:type="dxa"/>
-              <w:end w:w="80" w:type="dxa"/>
+              <w:top w:w="100" w:type="dxa"/>
+              <w:start w:w="100" w:type="dxa"/>
+              <w:bottom w:w="100" w:type="dxa"/>
+              <w:end w:w="100" w:type="dxa"/>
             </w:tcMar>
             <w:tcBorders>
               <w:top w:val="single" w:sz="4" w:color="B8C2CC"/>
@@ -3623,8 +3722,9 @@
           </w:tcPr>
           <w:p>
             <w:pPr>
-              <w:spacing w:line="240" w:lineRule="auto"/>
-              <w:jc w:val="left"/>
+              <w:spacing w:line="240" w:lineRule="auto" w:before="0" w:after="0"/>
+              <w:ind w:left="0" w:right="0" w:firstLine="0"/>
+              <w:jc w:val="center"/>
             </w:pPr>
             <w:r>
               <w:rPr>
@@ -3641,10 +3741,10 @@
           <w:tcPr>
             <w:tcW w:type="dxa" w:w="1296"/>
             <w:tcMar>
-              <w:top w:w="65" w:type="dxa"/>
-              <w:start w:w="80" w:type="dxa"/>
-              <w:bottom w:w="65" w:type="dxa"/>
-              <w:end w:w="80" w:type="dxa"/>
+              <w:top w:w="100" w:type="dxa"/>
+              <w:start w:w="100" w:type="dxa"/>
+              <w:bottom w:w="100" w:type="dxa"/>
+              <w:end w:w="100" w:type="dxa"/>
             </w:tcMar>
             <w:tcBorders>
               <w:top w:val="single" w:sz="4" w:color="B8C2CC"/>
@@ -3657,8 +3757,9 @@
           </w:tcPr>
           <w:p>
             <w:pPr>
-              <w:spacing w:line="240" w:lineRule="auto"/>
-              <w:jc w:val="left"/>
+              <w:spacing w:line="240" w:lineRule="auto" w:before="0" w:after="0"/>
+              <w:ind w:left="0" w:right="0" w:firstLine="0"/>
+              <w:jc w:val="center"/>
             </w:pPr>
             <w:r>
               <w:rPr>
@@ -3675,10 +3776,10 @@
           <w:tcPr>
             <w:tcW w:type="dxa" w:w="1584"/>
             <w:tcMar>
-              <w:top w:w="65" w:type="dxa"/>
-              <w:start w:w="80" w:type="dxa"/>
-              <w:bottom w:w="65" w:type="dxa"/>
-              <w:end w:w="80" w:type="dxa"/>
+              <w:top w:w="100" w:type="dxa"/>
+              <w:start w:w="100" w:type="dxa"/>
+              <w:bottom w:w="100" w:type="dxa"/>
+              <w:end w:w="100" w:type="dxa"/>
             </w:tcMar>
             <w:tcBorders>
               <w:top w:val="single" w:sz="4" w:color="B8C2CC"/>
@@ -3691,8 +3792,9 @@
           </w:tcPr>
           <w:p>
             <w:pPr>
-              <w:spacing w:line="240" w:lineRule="auto"/>
-              <w:jc w:val="left"/>
+              <w:spacing w:line="240" w:lineRule="auto" w:before="0" w:after="0"/>
+              <w:ind w:left="0" w:right="0" w:firstLine="0"/>
+              <w:jc w:val="center"/>
             </w:pPr>
             <w:r>
               <w:rPr>
@@ -3709,10 +3811,10 @@
           <w:tcPr>
             <w:tcW w:type="dxa" w:w="1296"/>
             <w:tcMar>
-              <w:top w:w="65" w:type="dxa"/>
-              <w:start w:w="80" w:type="dxa"/>
-              <w:bottom w:w="65" w:type="dxa"/>
-              <w:end w:w="80" w:type="dxa"/>
+              <w:top w:w="100" w:type="dxa"/>
+              <w:start w:w="100" w:type="dxa"/>
+              <w:bottom w:w="100" w:type="dxa"/>
+              <w:end w:w="100" w:type="dxa"/>
             </w:tcMar>
             <w:tcBorders>
               <w:top w:val="single" w:sz="4" w:color="B8C2CC"/>
@@ -3725,8 +3827,9 @@
           </w:tcPr>
           <w:p>
             <w:pPr>
-              <w:spacing w:line="240" w:lineRule="auto"/>
-              <w:jc w:val="left"/>
+              <w:spacing w:line="240" w:lineRule="auto" w:before="0" w:after="0"/>
+              <w:ind w:left="0" w:right="0" w:firstLine="0"/>
+              <w:jc w:val="center"/>
             </w:pPr>
             <w:r>
               <w:rPr>
@@ -3743,10 +3846,10 @@
           <w:tcPr>
             <w:tcW w:type="dxa" w:w="1368"/>
             <w:tcMar>
-              <w:top w:w="65" w:type="dxa"/>
-              <w:start w:w="80" w:type="dxa"/>
-              <w:bottom w:w="65" w:type="dxa"/>
-              <w:end w:w="80" w:type="dxa"/>
+              <w:top w:w="100" w:type="dxa"/>
+              <w:start w:w="100" w:type="dxa"/>
+              <w:bottom w:w="100" w:type="dxa"/>
+              <w:end w:w="100" w:type="dxa"/>
             </w:tcMar>
             <w:tcBorders>
               <w:top w:val="single" w:sz="4" w:color="B8C2CC"/>
@@ -3759,8 +3862,9 @@
           </w:tcPr>
           <w:p>
             <w:pPr>
-              <w:spacing w:line="240" w:lineRule="auto"/>
-              <w:jc w:val="left"/>
+              <w:spacing w:line="240" w:lineRule="auto" w:before="0" w:after="0"/>
+              <w:ind w:left="0" w:right="0" w:firstLine="0"/>
+              <w:jc w:val="center"/>
             </w:pPr>
             <w:r>
               <w:rPr>
@@ -3777,10 +3881,10 @@
           <w:tcPr>
             <w:tcW w:type="dxa" w:w="1800"/>
             <w:tcMar>
-              <w:top w:w="65" w:type="dxa"/>
-              <w:start w:w="80" w:type="dxa"/>
-              <w:bottom w:w="65" w:type="dxa"/>
-              <w:end w:w="80" w:type="dxa"/>
+              <w:top w:w="100" w:type="dxa"/>
+              <w:start w:w="100" w:type="dxa"/>
+              <w:bottom w:w="100" w:type="dxa"/>
+              <w:end w:w="100" w:type="dxa"/>
             </w:tcMar>
             <w:tcBorders>
               <w:top w:val="single" w:sz="4" w:color="B8C2CC"/>
@@ -3793,8 +3897,9 @@
           </w:tcPr>
           <w:p>
             <w:pPr>
-              <w:spacing w:line="240" w:lineRule="auto"/>
-              <w:jc w:val="left"/>
+              <w:spacing w:line="240" w:lineRule="auto" w:before="0" w:after="0"/>
+              <w:ind w:left="0" w:right="0" w:firstLine="0"/>
+              <w:jc w:val="center"/>
             </w:pPr>
             <w:r>
               <w:rPr>
@@ -4130,7 +4235,7 @@
     </w:p>
     <w:tbl>
       <w:tblPr>
-        <w:tblW w:type="auto" w:w="0"/>
+        <w:tblW w:type="dxa" w:w="9432"/>
         <w:jc w:val="center"/>
         <w:tblLayout w:type="fixed"/>
         <w:tblLook w:firstColumn="1" w:firstRow="1" w:lastColumn="0" w:lastRow="0" w:noHBand="0" w:noVBand="1" w:val="04A0"/>
@@ -4142,18 +4247,19 @@
       </w:tblGrid>
       <w:tr>
         <w:trPr>
+          <w:trHeight w:val="576" w:hRule="atLeast"/>
           <w:tblHeader w:val="true"/>
           <w:cantSplit/>
         </w:trPr>
         <w:tc>
           <w:tcPr>
-            <w:tcW w:type="dxa" w:w="1872"/>
+            <w:tcW w:type="dxa" w:w="2304"/>
             <w:shd w:fill="163A5F"/>
             <w:tcMar>
-              <w:top w:w="70" w:type="dxa"/>
-              <w:start w:w="80" w:type="dxa"/>
-              <w:bottom w:w="70" w:type="dxa"/>
-              <w:end w:w="80" w:type="dxa"/>
+              <w:top w:w="100" w:type="dxa"/>
+              <w:start w:w="100" w:type="dxa"/>
+              <w:bottom w:w="100" w:type="dxa"/>
+              <w:end w:w="100" w:type="dxa"/>
             </w:tcMar>
             <w:tcBorders>
               <w:top w:val="single" w:sz="6" w:color="163A5F"/>
@@ -4165,7 +4271,8 @@
           </w:tcPr>
           <w:p>
             <w:pPr>
-              <w:spacing w:line="240" w:lineRule="auto"/>
+              <w:spacing w:line="240" w:lineRule="auto" w:before="0" w:after="0"/>
+              <w:ind w:left="0" w:right="0" w:firstLine="0"/>
               <w:jc w:val="center"/>
             </w:pPr>
             <w:r>
@@ -4181,13 +4288,13 @@
         </w:tc>
         <w:tc>
           <w:tcPr>
-            <w:tcW w:type="dxa" w:w="4824"/>
+            <w:tcW w:type="dxa" w:w="4536"/>
             <w:shd w:fill="163A5F"/>
             <w:tcMar>
-              <w:top w:w="70" w:type="dxa"/>
-              <w:start w:w="80" w:type="dxa"/>
-              <w:bottom w:w="70" w:type="dxa"/>
-              <w:end w:w="80" w:type="dxa"/>
+              <w:top w:w="100" w:type="dxa"/>
+              <w:start w:w="100" w:type="dxa"/>
+              <w:bottom w:w="100" w:type="dxa"/>
+              <w:end w:w="100" w:type="dxa"/>
             </w:tcMar>
             <w:tcBorders>
               <w:top w:val="single" w:sz="6" w:color="163A5F"/>
@@ -4199,7 +4306,8 @@
           </w:tcPr>
           <w:p>
             <w:pPr>
-              <w:spacing w:line="240" w:lineRule="auto"/>
+              <w:spacing w:line="240" w:lineRule="auto" w:before="0" w:after="0"/>
+              <w:ind w:left="0" w:right="0" w:firstLine="0"/>
               <w:jc w:val="center"/>
             </w:pPr>
             <w:r>
@@ -4215,13 +4323,13 @@
         </w:tc>
         <w:tc>
           <w:tcPr>
-            <w:tcW w:type="dxa" w:w="2736"/>
+            <w:tcW w:type="dxa" w:w="2592"/>
             <w:shd w:fill="163A5F"/>
             <w:tcMar>
-              <w:top w:w="70" w:type="dxa"/>
-              <w:start w:w="80" w:type="dxa"/>
-              <w:bottom w:w="70" w:type="dxa"/>
-              <w:end w:w="80" w:type="dxa"/>
+              <w:top w:w="100" w:type="dxa"/>
+              <w:start w:w="100" w:type="dxa"/>
+              <w:bottom w:w="100" w:type="dxa"/>
+              <w:end w:w="100" w:type="dxa"/>
             </w:tcMar>
             <w:tcBorders>
               <w:top w:val="single" w:sz="6" w:color="163A5F"/>
@@ -4233,7 +4341,8 @@
           </w:tcPr>
           <w:p>
             <w:pPr>
-              <w:spacing w:line="240" w:lineRule="auto"/>
+              <w:spacing w:line="240" w:lineRule="auto" w:before="0" w:after="0"/>
+              <w:ind w:left="0" w:right="0" w:firstLine="0"/>
               <w:jc w:val="center"/>
             </w:pPr>
             <w:r>
@@ -4251,15 +4360,16 @@
       <w:tr>
         <w:trPr>
           <w:cantSplit/>
+          <w:trHeight w:val="576" w:hRule="atLeast"/>
         </w:trPr>
         <w:tc>
           <w:tcPr>
-            <w:tcW w:type="dxa" w:w="1872"/>
+            <w:tcW w:type="dxa" w:w="2304"/>
             <w:tcMar>
-              <w:top w:w="65" w:type="dxa"/>
-              <w:start w:w="80" w:type="dxa"/>
-              <w:bottom w:w="65" w:type="dxa"/>
-              <w:end w:w="80" w:type="dxa"/>
+              <w:top w:w="100" w:type="dxa"/>
+              <w:start w:w="100" w:type="dxa"/>
+              <w:bottom w:w="100" w:type="dxa"/>
+              <w:end w:w="100" w:type="dxa"/>
             </w:tcMar>
             <w:tcBorders>
               <w:top w:val="single" w:sz="4" w:color="B8C2CC"/>
@@ -4272,8 +4382,9 @@
           </w:tcPr>
           <w:p>
             <w:pPr>
-              <w:spacing w:line="240" w:lineRule="auto"/>
-              <w:jc w:val="left"/>
+              <w:spacing w:line="240" w:lineRule="auto" w:before="0" w:after="0"/>
+              <w:ind w:left="0" w:right="0" w:firstLine="0"/>
+              <w:jc w:val="center"/>
             </w:pPr>
             <w:r>
               <w:rPr>
@@ -4288,12 +4399,12 @@
         </w:tc>
         <w:tc>
           <w:tcPr>
-            <w:tcW w:type="dxa" w:w="4824"/>
+            <w:tcW w:type="dxa" w:w="4536"/>
             <w:tcMar>
-              <w:top w:w="65" w:type="dxa"/>
-              <w:start w:w="80" w:type="dxa"/>
-              <w:bottom w:w="65" w:type="dxa"/>
-              <w:end w:w="80" w:type="dxa"/>
+              <w:top w:w="100" w:type="dxa"/>
+              <w:start w:w="100" w:type="dxa"/>
+              <w:bottom w:w="100" w:type="dxa"/>
+              <w:end w:w="100" w:type="dxa"/>
             </w:tcMar>
             <w:tcBorders>
               <w:top w:val="single" w:sz="4" w:color="B8C2CC"/>
@@ -4306,7 +4417,8 @@
           </w:tcPr>
           <w:p>
             <w:pPr>
-              <w:spacing w:line="240" w:lineRule="auto"/>
+              <w:spacing w:line="240" w:lineRule="auto" w:before="0" w:after="0"/>
+              <w:ind w:left="0" w:right="0" w:firstLine="0"/>
               <w:jc w:val="left"/>
             </w:pPr>
             <w:r>
@@ -4322,12 +4434,12 @@
         </w:tc>
         <w:tc>
           <w:tcPr>
-            <w:tcW w:type="dxa" w:w="2736"/>
+            <w:tcW w:type="dxa" w:w="2592"/>
             <w:tcMar>
-              <w:top w:w="65" w:type="dxa"/>
-              <w:start w:w="80" w:type="dxa"/>
-              <w:bottom w:w="65" w:type="dxa"/>
-              <w:end w:w="80" w:type="dxa"/>
+              <w:top w:w="100" w:type="dxa"/>
+              <w:start w:w="100" w:type="dxa"/>
+              <w:bottom w:w="100" w:type="dxa"/>
+              <w:end w:w="100" w:type="dxa"/>
             </w:tcMar>
             <w:tcBorders>
               <w:top w:val="single" w:sz="4" w:color="B8C2CC"/>
@@ -4340,7 +4452,8 @@
           </w:tcPr>
           <w:p>
             <w:pPr>
-              <w:spacing w:line="240" w:lineRule="auto"/>
+              <w:spacing w:line="240" w:lineRule="auto" w:before="0" w:after="0"/>
+              <w:ind w:left="0" w:right="0" w:firstLine="0"/>
               <w:jc w:val="left"/>
             </w:pPr>
             <w:r>
@@ -4358,15 +4471,16 @@
       <w:tr>
         <w:trPr>
           <w:cantSplit/>
+          <w:trHeight w:val="576" w:hRule="atLeast"/>
         </w:trPr>
         <w:tc>
           <w:tcPr>
-            <w:tcW w:type="dxa" w:w="1872"/>
+            <w:tcW w:type="dxa" w:w="2304"/>
             <w:tcMar>
-              <w:top w:w="65" w:type="dxa"/>
-              <w:start w:w="80" w:type="dxa"/>
-              <w:bottom w:w="65" w:type="dxa"/>
-              <w:end w:w="80" w:type="dxa"/>
+              <w:top w:w="100" w:type="dxa"/>
+              <w:start w:w="100" w:type="dxa"/>
+              <w:bottom w:w="100" w:type="dxa"/>
+              <w:end w:w="100" w:type="dxa"/>
             </w:tcMar>
             <w:tcBorders>
               <w:top w:val="single" w:sz="4" w:color="B8C2CC"/>
@@ -4378,8 +4492,9 @@
           </w:tcPr>
           <w:p>
             <w:pPr>
-              <w:spacing w:line="240" w:lineRule="auto"/>
-              <w:jc w:val="left"/>
+              <w:spacing w:line="240" w:lineRule="auto" w:before="0" w:after="0"/>
+              <w:ind w:left="0" w:right="0" w:firstLine="0"/>
+              <w:jc w:val="center"/>
             </w:pPr>
             <w:r>
               <w:rPr>
@@ -4394,12 +4509,12 @@
         </w:tc>
         <w:tc>
           <w:tcPr>
-            <w:tcW w:type="dxa" w:w="4824"/>
+            <w:tcW w:type="dxa" w:w="4536"/>
             <w:tcMar>
-              <w:top w:w="65" w:type="dxa"/>
-              <w:start w:w="80" w:type="dxa"/>
-              <w:bottom w:w="65" w:type="dxa"/>
-              <w:end w:w="80" w:type="dxa"/>
+              <w:top w:w="100" w:type="dxa"/>
+              <w:start w:w="100" w:type="dxa"/>
+              <w:bottom w:w="100" w:type="dxa"/>
+              <w:end w:w="100" w:type="dxa"/>
             </w:tcMar>
             <w:tcBorders>
               <w:top w:val="single" w:sz="4" w:color="B8C2CC"/>
@@ -4411,7 +4526,8 @@
           </w:tcPr>
           <w:p>
             <w:pPr>
-              <w:spacing w:line="240" w:lineRule="auto"/>
+              <w:spacing w:line="240" w:lineRule="auto" w:before="0" w:after="0"/>
+              <w:ind w:left="0" w:right="0" w:firstLine="0"/>
               <w:jc w:val="left"/>
             </w:pPr>
             <w:r>
@@ -4427,12 +4543,12 @@
         </w:tc>
         <w:tc>
           <w:tcPr>
-            <w:tcW w:type="dxa" w:w="2736"/>
+            <w:tcW w:type="dxa" w:w="2592"/>
             <w:tcMar>
-              <w:top w:w="65" w:type="dxa"/>
-              <w:start w:w="80" w:type="dxa"/>
-              <w:bottom w:w="65" w:type="dxa"/>
-              <w:end w:w="80" w:type="dxa"/>
+              <w:top w:w="100" w:type="dxa"/>
+              <w:start w:w="100" w:type="dxa"/>
+              <w:bottom w:w="100" w:type="dxa"/>
+              <w:end w:w="100" w:type="dxa"/>
             </w:tcMar>
             <w:tcBorders>
               <w:top w:val="single" w:sz="4" w:color="B8C2CC"/>
@@ -4444,7 +4560,8 @@
           </w:tcPr>
           <w:p>
             <w:pPr>
-              <w:spacing w:line="240" w:lineRule="auto"/>
+              <w:spacing w:line="240" w:lineRule="auto" w:before="0" w:after="0"/>
+              <w:ind w:left="0" w:right="0" w:firstLine="0"/>
               <w:jc w:val="left"/>
             </w:pPr>
             <w:r>
@@ -4462,15 +4579,16 @@
       <w:tr>
         <w:trPr>
           <w:cantSplit/>
+          <w:trHeight w:val="576" w:hRule="atLeast"/>
         </w:trPr>
         <w:tc>
           <w:tcPr>
-            <w:tcW w:type="dxa" w:w="1872"/>
+            <w:tcW w:type="dxa" w:w="2304"/>
             <w:tcMar>
-              <w:top w:w="65" w:type="dxa"/>
-              <w:start w:w="80" w:type="dxa"/>
-              <w:bottom w:w="65" w:type="dxa"/>
-              <w:end w:w="80" w:type="dxa"/>
+              <w:top w:w="100" w:type="dxa"/>
+              <w:start w:w="100" w:type="dxa"/>
+              <w:bottom w:w="100" w:type="dxa"/>
+              <w:end w:w="100" w:type="dxa"/>
             </w:tcMar>
             <w:tcBorders>
               <w:top w:val="single" w:sz="4" w:color="B8C2CC"/>
@@ -4483,8 +4601,9 @@
           </w:tcPr>
           <w:p>
             <w:pPr>
-              <w:spacing w:line="240" w:lineRule="auto"/>
-              <w:jc w:val="left"/>
+              <w:spacing w:line="240" w:lineRule="auto" w:before="0" w:after="0"/>
+              <w:ind w:left="0" w:right="0" w:firstLine="0"/>
+              <w:jc w:val="center"/>
             </w:pPr>
             <w:r>
               <w:rPr>
@@ -4499,12 +4618,12 @@
         </w:tc>
         <w:tc>
           <w:tcPr>
-            <w:tcW w:type="dxa" w:w="4824"/>
+            <w:tcW w:type="dxa" w:w="4536"/>
             <w:tcMar>
-              <w:top w:w="65" w:type="dxa"/>
-              <w:start w:w="80" w:type="dxa"/>
-              <w:bottom w:w="65" w:type="dxa"/>
-              <w:end w:w="80" w:type="dxa"/>
+              <w:top w:w="100" w:type="dxa"/>
+              <w:start w:w="100" w:type="dxa"/>
+              <w:bottom w:w="100" w:type="dxa"/>
+              <w:end w:w="100" w:type="dxa"/>
             </w:tcMar>
             <w:tcBorders>
               <w:top w:val="single" w:sz="4" w:color="B8C2CC"/>
@@ -4517,7 +4636,8 @@
           </w:tcPr>
           <w:p>
             <w:pPr>
-              <w:spacing w:line="240" w:lineRule="auto"/>
+              <w:spacing w:line="240" w:lineRule="auto" w:before="0" w:after="0"/>
+              <w:ind w:left="0" w:right="0" w:firstLine="0"/>
               <w:jc w:val="left"/>
             </w:pPr>
             <w:r>
@@ -4533,12 +4653,12 @@
         </w:tc>
         <w:tc>
           <w:tcPr>
-            <w:tcW w:type="dxa" w:w="2736"/>
+            <w:tcW w:type="dxa" w:w="2592"/>
             <w:tcMar>
-              <w:top w:w="65" w:type="dxa"/>
-              <w:start w:w="80" w:type="dxa"/>
-              <w:bottom w:w="65" w:type="dxa"/>
-              <w:end w:w="80" w:type="dxa"/>
+              <w:top w:w="100" w:type="dxa"/>
+              <w:start w:w="100" w:type="dxa"/>
+              <w:bottom w:w="100" w:type="dxa"/>
+              <w:end w:w="100" w:type="dxa"/>
             </w:tcMar>
             <w:tcBorders>
               <w:top w:val="single" w:sz="4" w:color="B8C2CC"/>
@@ -4551,7 +4671,8 @@
           </w:tcPr>
           <w:p>
             <w:pPr>
-              <w:spacing w:line="240" w:lineRule="auto"/>
+              <w:spacing w:line="240" w:lineRule="auto" w:before="0" w:after="0"/>
+              <w:ind w:left="0" w:right="0" w:firstLine="0"/>
               <w:jc w:val="left"/>
             </w:pPr>
             <w:r>
@@ -4569,15 +4690,16 @@
       <w:tr>
         <w:trPr>
           <w:cantSplit/>
+          <w:trHeight w:val="576" w:hRule="atLeast"/>
         </w:trPr>
         <w:tc>
           <w:tcPr>
-            <w:tcW w:type="dxa" w:w="1872"/>
+            <w:tcW w:type="dxa" w:w="2304"/>
             <w:tcMar>
-              <w:top w:w="65" w:type="dxa"/>
-              <w:start w:w="80" w:type="dxa"/>
-              <w:bottom w:w="65" w:type="dxa"/>
-              <w:end w:w="80" w:type="dxa"/>
+              <w:top w:w="100" w:type="dxa"/>
+              <w:start w:w="100" w:type="dxa"/>
+              <w:bottom w:w="100" w:type="dxa"/>
+              <w:end w:w="100" w:type="dxa"/>
             </w:tcMar>
             <w:tcBorders>
               <w:top w:val="single" w:sz="4" w:color="B8C2CC"/>
@@ -4589,8 +4711,9 @@
           </w:tcPr>
           <w:p>
             <w:pPr>
-              <w:spacing w:line="240" w:lineRule="auto"/>
-              <w:jc w:val="left"/>
+              <w:spacing w:line="240" w:lineRule="auto" w:before="0" w:after="0"/>
+              <w:ind w:left="0" w:right="0" w:firstLine="0"/>
+              <w:jc w:val="center"/>
             </w:pPr>
             <w:r>
               <w:rPr>
@@ -4605,12 +4728,12 @@
         </w:tc>
         <w:tc>
           <w:tcPr>
-            <w:tcW w:type="dxa" w:w="4824"/>
+            <w:tcW w:type="dxa" w:w="4536"/>
             <w:tcMar>
-              <w:top w:w="65" w:type="dxa"/>
-              <w:start w:w="80" w:type="dxa"/>
-              <w:bottom w:w="65" w:type="dxa"/>
-              <w:end w:w="80" w:type="dxa"/>
+              <w:top w:w="100" w:type="dxa"/>
+              <w:start w:w="100" w:type="dxa"/>
+              <w:bottom w:w="100" w:type="dxa"/>
+              <w:end w:w="100" w:type="dxa"/>
             </w:tcMar>
             <w:tcBorders>
               <w:top w:val="single" w:sz="4" w:color="B8C2CC"/>
@@ -4622,7 +4745,8 @@
           </w:tcPr>
           <w:p>
             <w:pPr>
-              <w:spacing w:line="240" w:lineRule="auto"/>
+              <w:spacing w:line="240" w:lineRule="auto" w:before="0" w:after="0"/>
+              <w:ind w:left="0" w:right="0" w:firstLine="0"/>
               <w:jc w:val="left"/>
             </w:pPr>
             <w:r>
@@ -4638,12 +4762,12 @@
         </w:tc>
         <w:tc>
           <w:tcPr>
-            <w:tcW w:type="dxa" w:w="2736"/>
+            <w:tcW w:type="dxa" w:w="2592"/>
             <w:tcMar>
-              <w:top w:w="65" w:type="dxa"/>
-              <w:start w:w="80" w:type="dxa"/>
-              <w:bottom w:w="65" w:type="dxa"/>
-              <w:end w:w="80" w:type="dxa"/>
+              <w:top w:w="100" w:type="dxa"/>
+              <w:start w:w="100" w:type="dxa"/>
+              <w:bottom w:w="100" w:type="dxa"/>
+              <w:end w:w="100" w:type="dxa"/>
             </w:tcMar>
             <w:tcBorders>
               <w:top w:val="single" w:sz="4" w:color="B8C2CC"/>
@@ -4655,7 +4779,8 @@
           </w:tcPr>
           <w:p>
             <w:pPr>
-              <w:spacing w:line="240" w:lineRule="auto"/>
+              <w:spacing w:line="240" w:lineRule="auto" w:before="0" w:after="0"/>
+              <w:ind w:left="0" w:right="0" w:firstLine="0"/>
               <w:jc w:val="left"/>
             </w:pPr>
             <w:r>
@@ -4673,15 +4798,16 @@
       <w:tr>
         <w:trPr>
           <w:cantSplit/>
+          <w:trHeight w:val="576" w:hRule="atLeast"/>
         </w:trPr>
         <w:tc>
           <w:tcPr>
-            <w:tcW w:type="dxa" w:w="1872"/>
+            <w:tcW w:type="dxa" w:w="2304"/>
             <w:tcMar>
-              <w:top w:w="65" w:type="dxa"/>
-              <w:start w:w="80" w:type="dxa"/>
-              <w:bottom w:w="65" w:type="dxa"/>
-              <w:end w:w="80" w:type="dxa"/>
+              <w:top w:w="100" w:type="dxa"/>
+              <w:start w:w="100" w:type="dxa"/>
+              <w:bottom w:w="100" w:type="dxa"/>
+              <w:end w:w="100" w:type="dxa"/>
             </w:tcMar>
             <w:tcBorders>
               <w:top w:val="single" w:sz="4" w:color="B8C2CC"/>
@@ -4694,8 +4820,9 @@
           </w:tcPr>
           <w:p>
             <w:pPr>
-              <w:spacing w:line="240" w:lineRule="auto"/>
-              <w:jc w:val="left"/>
+              <w:spacing w:line="240" w:lineRule="auto" w:before="0" w:after="0"/>
+              <w:ind w:left="0" w:right="0" w:firstLine="0"/>
+              <w:jc w:val="center"/>
             </w:pPr>
             <w:r>
               <w:rPr>
@@ -4710,12 +4837,12 @@
         </w:tc>
         <w:tc>
           <w:tcPr>
-            <w:tcW w:type="dxa" w:w="4824"/>
+            <w:tcW w:type="dxa" w:w="4536"/>
             <w:tcMar>
-              <w:top w:w="65" w:type="dxa"/>
-              <w:start w:w="80" w:type="dxa"/>
-              <w:bottom w:w="65" w:type="dxa"/>
-              <w:end w:w="80" w:type="dxa"/>
+              <w:top w:w="100" w:type="dxa"/>
+              <w:start w:w="100" w:type="dxa"/>
+              <w:bottom w:w="100" w:type="dxa"/>
+              <w:end w:w="100" w:type="dxa"/>
             </w:tcMar>
             <w:tcBorders>
               <w:top w:val="single" w:sz="4" w:color="B8C2CC"/>
@@ -4728,7 +4855,8 @@
           </w:tcPr>
           <w:p>
             <w:pPr>
-              <w:spacing w:line="240" w:lineRule="auto"/>
+              <w:spacing w:line="240" w:lineRule="auto" w:before="0" w:after="0"/>
+              <w:ind w:left="0" w:right="0" w:firstLine="0"/>
               <w:jc w:val="left"/>
             </w:pPr>
             <w:r>
@@ -4744,12 +4872,12 @@
         </w:tc>
         <w:tc>
           <w:tcPr>
-            <w:tcW w:type="dxa" w:w="2736"/>
+            <w:tcW w:type="dxa" w:w="2592"/>
             <w:tcMar>
-              <w:top w:w="65" w:type="dxa"/>
-              <w:start w:w="80" w:type="dxa"/>
-              <w:bottom w:w="65" w:type="dxa"/>
-              <w:end w:w="80" w:type="dxa"/>
+              <w:top w:w="100" w:type="dxa"/>
+              <w:start w:w="100" w:type="dxa"/>
+              <w:bottom w:w="100" w:type="dxa"/>
+              <w:end w:w="100" w:type="dxa"/>
             </w:tcMar>
             <w:tcBorders>
               <w:top w:val="single" w:sz="4" w:color="B8C2CC"/>
@@ -4762,7 +4890,8 @@
           </w:tcPr>
           <w:p>
             <w:pPr>
-              <w:spacing w:line="240" w:lineRule="auto"/>
+              <w:spacing w:line="240" w:lineRule="auto" w:before="0" w:after="0"/>
+              <w:ind w:left="0" w:right="0" w:firstLine="0"/>
               <w:jc w:val="left"/>
             </w:pPr>
             <w:r>

</xml_diff>

<commit_message>
report: sync final English personal report
</commit_message>
<xml_diff>
--- a/report/experiment3_personal_report_yangmuqing_en.docx
+++ b/report/experiment3_personal_report_yangmuqing_en.docx
@@ -460,16 +460,16 @@
     </w:p>
     <w:p>
       <w:pPr>
-        <w:spacing w:before="120" w:after="100" w:line="276" w:lineRule="auto"/>
-        <w:jc w:val="center"/>
+        <w:pStyle w:val="Heading2"/>
       </w:pPr>
       <w:r>
         <w:rPr>
           <w:rFonts w:ascii="Times New Roman" w:hAnsi="Times New Roman" w:eastAsia="Times New Roman"/>
-          <w:b w:val="0"/>
-          <w:color w:val="232323"/>
-          <w:sz w:val="20"/>
+          <w:b/>
+          <w:color w:val="1F4E79"/>
+          <w:sz w:val="23"/>
         </w:rPr>
+        <w:t>1.1 Task Objectives and Assessment Focus</w:t>
       </w:r>
     </w:p>
     <w:p>
@@ -4485,7 +4485,7 @@
           <w:color w:val="232323"/>
           <w:sz w:val="20"/>
         </w:rPr>
-        <w:t>This experiment showed me that robot-arm simulation requires joint motion, scene models, control interfaces, task logic, and acceptance evidence to remain consistent at the same time. An action has a reproducible basis for success only when the target is selected correctly, the gripper-target relative pose satisfies the condition, the target height changes, the event order is complete, and the final pose lies inside the sorting region. This changed the way I judge simulation results: I now treat the image, state, and data as different observations of the same event rather than looking only at whether the arm completed a trajectory.</w:t>
+        <w:t>This experiment gave me a more complete way to judge robot motion. Completing a trajectory is not the same as completing a sorting task. I must check that the correct target was selected, the end effector was aligned, the gripper formed a valid grasp, the object actually left the table, release events occurred in the correct order, and the final pose entered the assigned sorting region. By reviewing the image, state topic, event log, and object-level record together, I can divide a continuous-looking motion into stages that can be evaluated independently.</w:t>
       </w:r>
     </w:p>
     <w:p>
@@ -4499,7 +4499,7 @@
           <w:color w:val="232323"/>
           <w:sz w:val="20"/>
         </w:rPr>
-        <w:t>During debugging, I gradually developed a fixed troubleshooting order. First, I narrow the problem to one stage: scanning, grid localization, approach, grasping, transport, release, or acceptance. Second, I reproduce the behavior with one target and the manual panel, recording the end-effector position, target position, gripper state, and current waypoint. Third, I change only one variable at a time, such as the pixel grid, grasp height, gripper opening, release height, or action duration. Fourth, I use event logs, final coordinates, and the complete sequence to review the change. Grid misalignment, release jumps, unattached targets, and duplicate launches were all located using this procedure.</w:t>
+        <w:t>The case in which the gripper closed but the cylinder remained on the table best illustrates this change. When I first watched the playback, the gripper motion looked normal, so it was easy to attribute the failure to unstable Gazebo contact. I paused the sequence at above, pick, and lift, then compared the end-effector-to-cylinder position, target height, and attached event. This showed that the player sent the gripper command but did not maintain the target pose relative to the end effector during transport. After adding a distance check, attachment condition, and continuous following, I reran the single-target subsequence. The cylinder visibly left the table, and the CSV recorded grasp_attached, lift, release, and object_complete in order. This case taught me to base cause analysis on stage-specific evidence.</w:t>
       </w:r>
     </w:p>
     <w:p>
@@ -4593,7 +4593,7 @@
           <w:color w:val="232323"/>
           <w:sz w:val="20"/>
         </w:rPr>
-        <w:t>This experiment also made me more familiar with interface responsibilities among modules. The task node generates object order and sorting targets, the execution node performs actions and returns feedback, and the scene and logs provide the basis for review. My work lies between task-planning results and simulation acceptance: I must turn abstract task items into executable poses, waypoints, and state checks. This made me pay more attention to the completeness of names, parameter records, log fields, and image captions, because they directly affect collaboration among group members and later reproduction.</w:t>
+        <w:t>The collaboration process also showed me how strongly integration depends on interface consistency. The object_id, grid_id, and target_bin from the task node must correspond to waypoint names, execution states, log fields, and report figures. Otherwise, even when each node runs separately, it is difficult to determine whether the complete chain processed the same object. When organizing the waypoints and evidence, I aligned the naming and review order so that scene adjustment, motion debugging, and final acceptance could be discussed around one target identity.</w:t>
       </w:r>
     </w:p>
     <w:p>
@@ -4607,7 +4607,7 @@
           <w:color w:val="232323"/>
           <w:sz w:val="20"/>
         </w:rPr>
-        <w:t>The logical attachment in the simulation improved motion repeatability and also made the difference between simulation and a real robot clear to me. A real system would require new calibration of the camera mapping, gripper friction, approach height, closing speed, release wait, and emergency-stop distance. When moving to the real robot, I will keep the sequence of low-speed single-target test, recognition check, grasp check, release check, adding a second class, and expanding to six targets. I will save object-level records at every step before deciding whether to enter the next stage.</w:t>
+        <w:t>Logical attachment improved repeatability in simulation and made the parameters that require renewed hardware verification more explicit. Gripper friction, object shape, camera-mapping error, approach height, and release delay can all change the physical result. A future hardware test should therefore begin with one low-speed target, examine recognition, approach, grasp, lift, and release separately, then add a second class and expand to six targets. Images, states, and object-level records should be saved at every step so that the same review method is retained across simulation and hardware.</w:t>
       </w:r>
     </w:p>
     <w:p>
@@ -4629,7 +4629,7 @@
         <w:spacing w:line="276" w:lineRule="auto" w:after="100"/>
       </w:pPr>
       <w:r>
-        <w:t>I completed the main personal work on the execution side of the Experiment 3 simulation and linked my contribution to four layers: scene, waypoints, state, and evidence. Through scene adjustment, manual teaching, motion repair, automatic playback, and object-level review, I participated in building a complete chain from task-planning results to robot-arm motion and then to the experimental conclusion. The object-level result for the six red and blue targets reached 6/6, and the three-class extension completed the integration of the scene, sorting pads, and automatic sequence. On the execution side, I used the group-provided detection results to check grid mapping, grasping, and release behavior.</w:t>
+        <w:t>In this experiment, I completed the six-cell tabletop and sorting-pad adjustment, robot waypoint teaching, automatic playback organization, grasp-attachment and release corrections, and result review. These tasks transformed the grid and class target produced by the task node into executable above, pick, lift, release, and retreat motions. State feedback, events, final poses, and the object-level CSV were then used to verify each target. The six-object red-blue simulation baseline reached 6/6, and the three-class extension completed the scene, green-target waypoints, and 34-step playback sequence.</w:t>
       </w:r>
     </w:p>
     <w:p>
@@ -5350,7 +5350,7 @@
           <w:color w:val="232323"/>
           <w:sz w:val="20"/>
         </w:rPr>
-        <w:t>I learned how to coordinate Gazebo scene parameters with ROS 2 controllers and how to inspect the same action from four perspectives: world coordinates, pixel grids, end-effector pose, and object state. Through the manual control panel and JSON waypoint file, I became familiar with organizing motions from a single-point test to a complete sequence. Through state topics, event logs, and object-level CSV files, I can now split one run into stages that are easy to locate and compare.</w:t>
+        <w:t>Through this experiment, I learned to analyze one motion from four connected levels: world coordinates, pixel grid, end-effector pose, and object state. I can use the manual panel, JSON waypoints, state topics, and CSV records to identify which stage received an incorrect input, produced a missing event, or failed to satisfy its exit condition. This method localized pose offsets, missing attachment, release jumps, and repeated-launch conflicts more reliably than inspecting only the final scene.</w:t>
       </w:r>
     </w:p>
     <w:p>
@@ -5364,7 +5364,7 @@
           <w:color w:val="232323"/>
           <w:sz w:val="20"/>
         </w:rPr>
-        <w:t>In collaboration, I gained a deeper understanding of the importance of unified interfaces and naming. The object_id, grid_id, and target_bin produced by the task node must correspond to the waypoints, logs, and final poses in the execution node. The images and tables in the report must also lead back to a specific object. This record-keeping method improves problem localization and allows personal debugging results to directly support group acceptance.</w:t>
+        <w:t>In group integration, I learned to connect different contributions through shared fields. Detection and task planning provide object_id, grid_id, class, and target bin; the execution side uses the same fields to select motions and record outcomes; report figures and tables then refer back to the corresponding object. This reduced ambiguity in verbal descriptions and allowed my motion-debugging records to be incorporated directly into the group acceptance material.</w:t>
       </w:r>
     </w:p>
     <w:p>
@@ -5853,6 +5853,20 @@
         </w:tc>
       </w:tr>
     </w:tbl>
+    <w:p>
+      <w:pPr>
+        <w:pStyle w:val="Heading2"/>
+      </w:pPr>
+      <w:r>
+        <w:t>6.5 Repository review sequence</w:t>
+      </w:r>
+    </w:p>
+    <w:p>
+      <w:pPr/>
+      <w:r>
+        <w:t>To review my contribution, first open code/src/mecharm_fixed_pick_sim/worlds/sorting_desktop.world for the six-cell scene and sorting pads. Next inspect code/manual_animation.json for the above, pick, lift, and release waypoints and the six-target playback order. Finally compare evidence/ERROR_LOG.md, the execution CSV, and the Gazebo videos with the reported phenomena, corrections, and final results. This order follows the scene-motion-problem-result structure of the report.</w:t>
+      </w:r>
+    </w:p>
     <w:sectPr>
       <w:headerReference w:type="default" r:id="rId9"/>
       <w:footerReference w:type="default" r:id="rId10"/>

</xml_diff>